<commit_message>
Update final spatial manuscript reproducibility release
</commit_message>
<xml_diff>
--- a/manuscript.docx
+++ b/manuscript.docx
@@ -19,12 +19,7 @@
         </w:rPr>
       </w:pPr>
       <w:r>
-        <w:rPr>
-          <w:b/>
-          <w:bCs/>
-          <w:lang w:val="en-US"/>
-        </w:rPr>
-        <w:t>Patient-aware single-cell analysis places a DoRothEA-derived BACH1 score within hypoxia-associated epithelial-state architecture in non-small cell lung cancer</w:t>
+        <w:t>Malignant epithelial-state architecture accounts for much of the covariance between a DoRothEA-derived BACH1 score and hypoxia in NSCLC</w:t>
       </w:r>
     </w:p>
     <w:p>
@@ -367,7 +362,7 @@
         </w:rPr>
       </w:pPr>
       <w:r>
-        <w:t>Non-small cell lung cancer (NSCLC) contains heterogeneous malignant epithelial states, and BTB domain and CNC homolog 1 (BACH1) has been linked to oxidative-stress, heme-metabolic and metastatic phenotypes. We mapped BACH1 transcript detection, externally defined BACH1 scores and hypoxia-associated transcriptional context in primary tumour epithelium using scRNA-seq, scATAC-seq and TCGA-LUAD/LUSC data with patients or tumours as inferential units. The primary malignant epithelial set contained 13,694 cells from 16 patients, including 2,643 BACH1-detected cells (19.3%). DoRothEA BACH1 mean-z scores were modestly higher in BACH1-detected cells within patients (median delta=0.0874, Holm-adjusted P=3.1×10⁻⁴), and per-patient QC-adjusted models were positive in 12 of 14 evaluable patients. Across patients, the shared-gene-removed DoRothEA score correlated with Hallmark hypoxia (ρ=0.868, Holm-adjusted P=2.7×10⁻⁵) and exceeded expression- and detection-matched random gene-set nulls (empirical P=0.002). After TF-specific removal of Hallmark hypoxia-overlapping targets, BACH1 ranked fourth among 267 evaluable DoRothEA TFs (ρ=0.868; FDR=8.9×10⁻⁴). Adjustment for dataset, patient-level quality-control features and epithelial-state composition attenuated this association to near zero (all patients: residual ρ=0.135, P=0.617; patients with at least 20 cells: ρ=0.011, P=0.97). Within-state evidence after multiplicity correction localized to a stress-associated epithelial state, with heterogeneous state-level BACH1 and hypoxia patterns. TCGA primary tumours replicated a weaker tumour-level score association (n=1,017; ρ=0.307, Holm-adjusted P=2.8×10⁻²³). Together, these findings identify a DoRothEA-derived BACH1 score as a marker of hypoxia-associated malignant epithelial-state architecture and define its dependence on patient-level transcriptional context.</w:t>
+        <w:t>Non-small cell lung cancer (NSCLC) contains heterogeneous malignant epithelial states, but the cellular context of BACH1-associated transcription in primary tumours remains unclear. We integrated patient-resolved single-cell RNA sequencing with TCGA bulk tumours and an independent spatial transcriptomic cohort to determine whether BACH1-associated hypoxia covariance reflects a uniform transcriptional relationship or broader epithelial-state architecture. Among 13,694 malignant epithelial cells from 16 patients, a shared-gene-removed DoRothEA-derived BACH1 score correlated strongly with Hallmark hypoxia at patient level (ρ=0.868) and exceeded expression- and detection-matched random gene-set expectations (empirical P=0.002). Adjustment for dataset, quality-control features and epithelial-state composition reduced the association to ρ=0.135 and to ρ=0.011 among patients with at least 20 malignant epithelial cells. After multiplicity correction, only the stress-associated epithelial state retained evidence of a within-state association. Pan-transcription-factor benchmarking placed BACH1 among the leading hypoxia-associated regulon scores, while TCGA-LUAD/LUSC reproduced a weaker tumour-level association (ρ=0.307). Across four spatial sections from an independent NSCLC cohort, BACH1-hypoxia covariance was again positive (ρ=0.626-0.840) but markedly attenuated after state adjustment in the three LUAD sections. These cross-modal findings indicate that BACH1-associated hypoxia covariance in NSCLC is embedded within patient-specific malignant epithelial-state architecture rather than representing a uniform BACH1 regulatory axis.</w:t>
       </w:r>
     </w:p>
     <w:p>
@@ -2001,772 +1996,28 @@
         <w:spacing w:line="480" w:lineRule="auto"/>
       </w:pPr>
       <w:r>
-        <w:t xml:space="preserve">BACH1 is a heme-responsive basic leucine zipper transcription factor that participates in oxidative-stress adaptation and competes with related </w:t>
-      </w:r>
-      <w:proofErr w:type="spellStart"/>
-      <w:r>
-        <w:t>Cap'n'collar</w:t>
-      </w:r>
-      <w:proofErr w:type="spellEnd"/>
-      <w:r>
-        <w:t xml:space="preserve"> (CNC) family regulators at </w:t>
-      </w:r>
-      <w:proofErr w:type="spellStart"/>
-      <w:r>
-        <w:t>Maf</w:t>
-      </w:r>
-      <w:proofErr w:type="spellEnd"/>
-      <w:r>
-        <w:t xml:space="preserve">-recognition elements </w:t>
-      </w:r>
-      <w:r>
-        <w:fldChar w:fldCharType="begin">
-          <w:fldData xml:space="preserve">PEVuZE5vdGU+PENpdGU+PEF1dGhvcj5TdW48L0F1dGhvcj48WWVhcj4yMDAyPC9ZZWFyPjxSZWNO
-dW0+MTQxPC9SZWNOdW0+PERpc3BsYXlUZXh0PjxzdHlsZSBmYWNlPSJzdXBlcnNjcmlwdCI+Nywg
-ODwvc3R5bGU+PC9EaXNwbGF5VGV4dD48cmVjb3JkPjxyZWMtbnVtYmVyPjE0MTwvcmVjLW51bWJl
-cj48Zm9yZWlnbi1rZXlzPjxrZXkgYXBwPSJFTiIgZGItaWQ9ImV0cHp3cnphYXpmZnhmZWR4eGp4
-d3RwOHpzeDJ0cHZzdjVkMCIgdGltZXN0YW1wPSIxNzg2Mzc1MTcwIj4xNDE8L2tleT48L2ZvcmVp
-Z24ta2V5cz48cmVmLXR5cGUgbmFtZT0iSm91cm5hbCBBcnRpY2xlIj4xNzwvcmVmLXR5cGU+PGNv
-bnRyaWJ1dG9ycz48YXV0aG9ycz48YXV0aG9yPlN1biwgSi48L2F1dGhvcj48YXV0aG9yPkhvc2hp
-bm8sIEguPC9hdXRob3I+PGF1dGhvcj5UYWtha3UsIEsuPC9hdXRob3I+PGF1dGhvcj5OYWthamlt
-YSwgTy48L2F1dGhvcj48YXV0aG9yPk11dG8sIEEuPC9hdXRob3I+PGF1dGhvcj5TdXp1a2ksIEgu
-PC9hdXRob3I+PGF1dGhvcj5UYXNoaXJvLCBTLjwvYXV0aG9yPjxhdXRob3I+VGFrYWhhc2hpLCBT
-LjwvYXV0aG9yPjxhdXRob3I+U2hpYmFoYXJhLCBTLjwvYXV0aG9yPjxhdXRob3I+QWxhbSwgSi48
-L2F1dGhvcj48YXV0aG9yPlRha2V0bywgTS4gTS48L2F1dGhvcj48YXV0aG9yPllhbWFtb3RvLCBN
-LjwvYXV0aG9yPjxhdXRob3I+SWdhcmFzaGksIEsuPC9hdXRob3I+PC9hdXRob3JzPjwvY29udHJp
-YnV0b3JzPjxhdXRoLWFkZHJlc3M+RGVwYXJ0bWVudCBvZiBCaW9tZWRpY2FsIENoZW1pc3RyeSwg
-SGlyb3NoaW1hIFVuaXZlcnNpdHkgR3JhZHVhdGUgU2Nob29sIG9mIEJpb21lZGljYWwgU2NpZW5j
-ZXMsIEthc3VtaSAxLTItMywgSGlyb3NoaW1hIDczNC04NTUxLCBKYXBhbi48L2F1dGgtYWRkcmVz
-cz48dGl0bGVzPjx0aXRsZT5IZW1vcHJvdGVpbiBCYWNoMSByZWd1bGF0ZXMgZW5oYW5jZXIgYXZh
-aWxhYmlsaXR5IG9mIGhlbWUgb3h5Z2VuYXNlLTEgZ2VuZTwvdGl0bGU+PHNlY29uZGFyeS10aXRs
-ZT5FbWJvIGo8L3NlY29uZGFyeS10aXRsZT48L3RpdGxlcz48cGVyaW9kaWNhbD48ZnVsbC10aXRs
-ZT5FbWJvIGo8L2Z1bGwtdGl0bGU+PC9wZXJpb2RpY2FsPjxwYWdlcz41MjE2LTI0PC9wYWdlcz48
-dm9sdW1lPjIxPC92b2x1bWU+PG51bWJlcj4xOTwvbnVtYmVyPjxrZXl3b3Jkcz48a2V5d29yZD4z
-VDMgQ2VsbHM8L2tleXdvcmQ+PGtleXdvcmQ+QW5pbWFsczwva2V5d29yZD48a2V5d29yZD5CYXNl
-IFNlcXVlbmNlPC9rZXl3b3JkPjxrZXl3b3JkPkJhc2ljLUxldWNpbmUgWmlwcGVyIFRyYW5zY3Jp
-cHRpb24gRmFjdG9yczwva2V5d29yZD48a2V5d29yZD5DZWxsIExpbmU8L2tleXdvcmQ+PGtleXdv
-cmQ+RE5BIFByaW1lcnM8L2tleXdvcmQ+PGtleXdvcmQ+RE5BIFByb2Jlczwva2V5d29yZD48a2V5
-d29yZD4qRW5oYW5jZXIgRWxlbWVudHMsIEdlbmV0aWM8L2tleXdvcmQ+PGtleXdvcmQ+RmFuY29u
-aSBBbmVtaWEgQ29tcGxlbWVudGF0aW9uIEdyb3VwIFByb3RlaW5zPC9rZXl3b3JkPjxrZXl3b3Jk
-PipHZW5lIEV4cHJlc3Npb24gUmVndWxhdGlvbiwgRW56eW1vbG9naWM8L2tleXdvcmQ+PGtleXdv
-cmQ+SGVtZSBPeHlnZW5hc2UgKERlY3ljbGl6aW5nKS8qZ2VuZXRpY3M8L2tleXdvcmQ+PGtleXdv
-cmQ+SGVtZSBPeHlnZW5hc2UtMTwva2V5d29yZD48a2V5d29yZD5IdW1hbnM8L2tleXdvcmQ+PGtl
-eXdvcmQ+TWVtYnJhbmUgUHJvdGVpbnM8L2tleXdvcmQ+PGtleXdvcmQ+TWljZTwva2V5d29yZD48
-a2V5d29yZD5NaWNlLCBLbm9ja291dDwva2V5d29yZD48a2V5d29yZD5Qb2x5bWVyYXNlIENoYWlu
-IFJlYWN0aW9uPC9rZXl3b3JkPjxrZXl3b3JkPlRyYW5zY3JpcHRpb24gRmFjdG9ycy9kZWZpY2ll
-bmN5L2dlbmV0aWNzLyptZXRhYm9saXNtPC9rZXl3b3JkPjxrZXl3b3JkPlRyYW5zZmVjdGlvbjwv
-a2V5d29yZD48L2tleXdvcmRzPjxkYXRlcz48eWVhcj4yMDAyPC95ZWFyPjxwdWItZGF0ZXM+PGRh
-dGU+T2N0IDE8L2RhdGU+PC9wdWItZGF0ZXM+PC9kYXRlcz48aXNibj4wMjYxLTQxODkgKFByaW50
-KSYjeEQ7MDI2MS00MTg5PC9pc2JuPjxhY2Nlc3Npb24tbnVtPjEyMzU2NzM3PC9hY2Nlc3Npb24t
-bnVtPjx1cmxzPjwvdXJscz48Y3VzdG9tMj5QTUMxMjkwMzg8L2N1c3RvbTI+PGVsZWN0cm9uaWMt
-cmVzb3VyY2UtbnVtPjEwLjEwOTMvZW1ib2ovY2RmNTE2PC9lbGVjdHJvbmljLXJlc291cmNlLW51
-bT48cmVtb3RlLWRhdGFiYXNlLXByb3ZpZGVyPk5MTTwvcmVtb3RlLWRhdGFiYXNlLXByb3ZpZGVy
-PjxsYW5ndWFnZT5lbmc8L2xhbmd1YWdlPjwvcmVjb3JkPjwvQ2l0ZT48Q2l0ZT48QXV0aG9yPldh
-cm5hdHo8L0F1dGhvcj48WWVhcj4yMDExPC9ZZWFyPjxSZWNOdW0+MjM8L1JlY051bT48cmVjb3Jk
-PjxyZWMtbnVtYmVyPjIzPC9yZWMtbnVtYmVyPjxmb3JlaWduLWtleXM+PGtleSBhcHA9IkVOIiBk
-Yi1pZD0iZXRwendyemFhemZmeGZlZHh4anh3dHA4enN4MnRwdnN2NWQwIiB0aW1lc3RhbXA9IjE3
-ODAyNTE4MjYiPjIzPC9rZXk+PC9mb3JlaWduLWtleXM+PHJlZi10eXBlIG5hbWU9IkpvdXJuYWwg
-QXJ0aWNsZSI+MTc8L3JlZi10eXBlPjxjb250cmlidXRvcnM+PGF1dGhvcnM+PGF1dGhvcj5XYXJu
-YXR6LCBILiBKLjwvYXV0aG9yPjxhdXRob3I+U2NobWlkdCwgRC48L2F1dGhvcj48YXV0aG9yPk1h
-bmtlLCBULjwvYXV0aG9yPjxhdXRob3I+UGljY2luaSwgSS48L2F1dGhvcj48YXV0aG9yPlN1bHRh
-biwgTS48L2F1dGhvcj48YXV0aG9yPkJvcm9kaW5hLCBULjwvYXV0aG9yPjxhdXRob3I+QmFsemVy
-ZWl0LCBELjwvYXV0aG9yPjxhdXRob3I+V3J1Y2ssIFcuPC9hdXRob3I+PGF1dGhvcj5Tb2xkYXRv
-diwgQS48L2F1dGhvcj48YXV0aG9yPlZpbmdyb24sIE0uPC9hdXRob3I+PGF1dGhvcj5MZWhyYWNo
-LCBILjwvYXV0aG9yPjxhdXRob3I+WWFzcG8sIE0uIEwuPC9hdXRob3I+PC9hdXRob3JzPjwvY29u
-dHJpYnV0b3JzPjxhdXRoLWFkZHJlc3M+RGVwYXJ0bWVudCBvZiBWZXJ0ZWJyYXRlIEdlbm9taWNz
-LCBNYXggUGxhbmNrIEluc3RpdHV0ZSBmb3IgTW9sZWN1bGFyIEdlbmV0aWNzLCAxNDE5NSBCZXJs
-aW4sIEdlcm1hbnkuPC9hdXRoLWFkZHJlc3M+PHRpdGxlcz48dGl0bGU+VGhlIEJUQiBhbmQgQ05D
-IGhvbW9sb2d5IDEgKEJBQ0gxKSB0YXJnZXQgZ2VuZXMgYXJlIGludm9sdmVkIGluIHRoZSBveGlk
-YXRpdmUgc3RyZXNzIHJlc3BvbnNlIGFuZCBpbiBjb250cm9sIG9mIHRoZSBjZWxsIGN5Y2xlPC90
-aXRsZT48c2Vjb25kYXJ5LXRpdGxlPkogQmlvbCBDaGVtPC9zZWNvbmRhcnktdGl0bGU+PC90aXRs
-ZXM+PHBlcmlvZGljYWw+PGZ1bGwtdGl0bGU+SiBCaW9sIENoZW08L2Z1bGwtdGl0bGU+PC9wZXJp
-b2RpY2FsPjxwYWdlcz4yMzUyMS0zMjwvcGFnZXM+PHZvbHVtZT4yODY8L3ZvbHVtZT48bnVtYmVy
-PjI2PC9udW1iZXI+PGVkaXRpb24+MjAxMTA1MDk8L2VkaXRpb24+PGtleXdvcmRzPjxrZXl3b3Jk
-PkJhc2ljLUxldWNpbmUgWmlwcGVyIFRyYW5zY3JpcHRpb24gRmFjdG9ycy9nZW5ldGljcy8qbWV0
-YWJvbGlzbTwva2V5d29yZD48a2V5d29yZD5DZWxsIEN5Y2xlLypwaHlzaW9sb2d5PC9rZXl3b3Jk
-PjxrZXl3b3JkPkZhbmNvbmkgQW5lbWlhIENvbXBsZW1lbnRhdGlvbiBHcm91cCBQcm90ZWlucy9n
-ZW5ldGljcy8qbWV0YWJvbGlzbTwva2V5d29yZD48a2V5d29yZD5HZW5lIEV4cHJlc3Npb24gUHJv
-ZmlsaW5nPC9rZXl3b3JkPjxrZXl3b3JkPkdlbmUgRXhwcmVzc2lvbiBSZWd1bGF0aW9uLypwaHlz
-aW9sb2d5PC9rZXl3b3JkPjxrZXl3b3JkPkhFSzI5MyBDZWxsczwva2V5d29yZD48a2V5d29yZD5I
-dW1hbnM8L2tleXdvcmQ+PGtleXdvcmQ+T2xpZ29udWNsZW90aWRlIEFycmF5IFNlcXVlbmNlIEFu
-YWx5c2lzPC9rZXl3b3JkPjxrZXl3b3JkPk94aWRhdGl2ZSBTdHJlc3MvKnBoeXNpb2xvZ3k8L2tl
-eXdvcmQ+PGtleXdvcmQ+UmVzcG9uc2UgRWxlbWVudHMvcGh5c2lvbG9neTwva2V5d29yZD48L2tl
-eXdvcmRzPjxkYXRlcz48eWVhcj4yMDExPC95ZWFyPjxwdWItZGF0ZXM+PGRhdGU+SnVsIDE8L2Rh
-dGU+PC9wdWItZGF0ZXM+PC9kYXRlcz48aXNibj4wMDIxLTkyNTggKFByaW50KSYjeEQ7MDAyMS05
-MjU4PC9pc2JuPjxhY2Nlc3Npb24tbnVtPjIxNTU1NTE4PC9hY2Nlc3Npb24tbnVtPjx1cmxzPjwv
-dXJscz48Y3VzdG9tMj5QTUMzMTIzMTE1PC9jdXN0b20yPjxlbGVjdHJvbmljLXJlc291cmNlLW51
-bT4xMC4xMDc0L2piYy5NMTExLjIyMDE3ODwvZWxlY3Ryb25pYy1yZXNvdXJjZS1udW0+PHJlbW90
-ZS1kYXRhYmFzZS1wcm92aWRlcj5OTE08L3JlbW90ZS1kYXRhYmFzZS1wcm92aWRlcj48bGFuZ3Vh
-Z2U+ZW5nPC9sYW5ndWFnZT48L3JlY29yZD48L0NpdGU+PC9FbmROb3RlPgB=
-</w:fldData>
-        </w:fldChar>
-      </w:r>
-      <w:r>
-        <w:instrText xml:space="preserve"> ADDIN EN.CITE </w:instrText>
-      </w:r>
-      <w:r>
-        <w:fldChar w:fldCharType="begin">
-          <w:fldData xml:space="preserve">PEVuZE5vdGU+PENpdGU+PEF1dGhvcj5TdW48L0F1dGhvcj48WWVhcj4yMDAyPC9ZZWFyPjxSZWNO
-dW0+MTQxPC9SZWNOdW0+PERpc3BsYXlUZXh0PjxzdHlsZSBmYWNlPSJzdXBlcnNjcmlwdCI+Nywg
-ODwvc3R5bGU+PC9EaXNwbGF5VGV4dD48cmVjb3JkPjxyZWMtbnVtYmVyPjE0MTwvcmVjLW51bWJl
-cj48Zm9yZWlnbi1rZXlzPjxrZXkgYXBwPSJFTiIgZGItaWQ9ImV0cHp3cnphYXpmZnhmZWR4eGp4
-d3RwOHpzeDJ0cHZzdjVkMCIgdGltZXN0YW1wPSIxNzg2Mzc1MTcwIj4xNDE8L2tleT48L2ZvcmVp
-Z24ta2V5cz48cmVmLXR5cGUgbmFtZT0iSm91cm5hbCBBcnRpY2xlIj4xNzwvcmVmLXR5cGU+PGNv
-bnRyaWJ1dG9ycz48YXV0aG9ycz48YXV0aG9yPlN1biwgSi48L2F1dGhvcj48YXV0aG9yPkhvc2hp
-bm8sIEguPC9hdXRob3I+PGF1dGhvcj5UYWtha3UsIEsuPC9hdXRob3I+PGF1dGhvcj5OYWthamlt
-YSwgTy48L2F1dGhvcj48YXV0aG9yPk11dG8sIEEuPC9hdXRob3I+PGF1dGhvcj5TdXp1a2ksIEgu
-PC9hdXRob3I+PGF1dGhvcj5UYXNoaXJvLCBTLjwvYXV0aG9yPjxhdXRob3I+VGFrYWhhc2hpLCBT
-LjwvYXV0aG9yPjxhdXRob3I+U2hpYmFoYXJhLCBTLjwvYXV0aG9yPjxhdXRob3I+QWxhbSwgSi48
-L2F1dGhvcj48YXV0aG9yPlRha2V0bywgTS4gTS48L2F1dGhvcj48YXV0aG9yPllhbWFtb3RvLCBN
-LjwvYXV0aG9yPjxhdXRob3I+SWdhcmFzaGksIEsuPC9hdXRob3I+PC9hdXRob3JzPjwvY29udHJp
-YnV0b3JzPjxhdXRoLWFkZHJlc3M+RGVwYXJ0bWVudCBvZiBCaW9tZWRpY2FsIENoZW1pc3RyeSwg
-SGlyb3NoaW1hIFVuaXZlcnNpdHkgR3JhZHVhdGUgU2Nob29sIG9mIEJpb21lZGljYWwgU2NpZW5j
-ZXMsIEthc3VtaSAxLTItMywgSGlyb3NoaW1hIDczNC04NTUxLCBKYXBhbi48L2F1dGgtYWRkcmVz
-cz48dGl0bGVzPjx0aXRsZT5IZW1vcHJvdGVpbiBCYWNoMSByZWd1bGF0ZXMgZW5oYW5jZXIgYXZh
-aWxhYmlsaXR5IG9mIGhlbWUgb3h5Z2VuYXNlLTEgZ2VuZTwvdGl0bGU+PHNlY29uZGFyeS10aXRs
-ZT5FbWJvIGo8L3NlY29uZGFyeS10aXRsZT48L3RpdGxlcz48cGVyaW9kaWNhbD48ZnVsbC10aXRs
-ZT5FbWJvIGo8L2Z1bGwtdGl0bGU+PC9wZXJpb2RpY2FsPjxwYWdlcz41MjE2LTI0PC9wYWdlcz48
-dm9sdW1lPjIxPC92b2x1bWU+PG51bWJlcj4xOTwvbnVtYmVyPjxrZXl3b3Jkcz48a2V5d29yZD4z
-VDMgQ2VsbHM8L2tleXdvcmQ+PGtleXdvcmQ+QW5pbWFsczwva2V5d29yZD48a2V5d29yZD5CYXNl
-IFNlcXVlbmNlPC9rZXl3b3JkPjxrZXl3b3JkPkJhc2ljLUxldWNpbmUgWmlwcGVyIFRyYW5zY3Jp
-cHRpb24gRmFjdG9yczwva2V5d29yZD48a2V5d29yZD5DZWxsIExpbmU8L2tleXdvcmQ+PGtleXdv
-cmQ+RE5BIFByaW1lcnM8L2tleXdvcmQ+PGtleXdvcmQ+RE5BIFByb2Jlczwva2V5d29yZD48a2V5
-d29yZD4qRW5oYW5jZXIgRWxlbWVudHMsIEdlbmV0aWM8L2tleXdvcmQ+PGtleXdvcmQ+RmFuY29u
-aSBBbmVtaWEgQ29tcGxlbWVudGF0aW9uIEdyb3VwIFByb3RlaW5zPC9rZXl3b3JkPjxrZXl3b3Jk
-PipHZW5lIEV4cHJlc3Npb24gUmVndWxhdGlvbiwgRW56eW1vbG9naWM8L2tleXdvcmQ+PGtleXdv
-cmQ+SGVtZSBPeHlnZW5hc2UgKERlY3ljbGl6aW5nKS8qZ2VuZXRpY3M8L2tleXdvcmQ+PGtleXdv
-cmQ+SGVtZSBPeHlnZW5hc2UtMTwva2V5d29yZD48a2V5d29yZD5IdW1hbnM8L2tleXdvcmQ+PGtl
-eXdvcmQ+TWVtYnJhbmUgUHJvdGVpbnM8L2tleXdvcmQ+PGtleXdvcmQ+TWljZTwva2V5d29yZD48
-a2V5d29yZD5NaWNlLCBLbm9ja291dDwva2V5d29yZD48a2V5d29yZD5Qb2x5bWVyYXNlIENoYWlu
-IFJlYWN0aW9uPC9rZXl3b3JkPjxrZXl3b3JkPlRyYW5zY3JpcHRpb24gRmFjdG9ycy9kZWZpY2ll
-bmN5L2dlbmV0aWNzLyptZXRhYm9saXNtPC9rZXl3b3JkPjxrZXl3b3JkPlRyYW5zZmVjdGlvbjwv
-a2V5d29yZD48L2tleXdvcmRzPjxkYXRlcz48eWVhcj4yMDAyPC95ZWFyPjxwdWItZGF0ZXM+PGRh
-dGU+T2N0IDE8L2RhdGU+PC9wdWItZGF0ZXM+PC9kYXRlcz48aXNibj4wMjYxLTQxODkgKFByaW50
-KSYjeEQ7MDI2MS00MTg5PC9pc2JuPjxhY2Nlc3Npb24tbnVtPjEyMzU2NzM3PC9hY2Nlc3Npb24t
-bnVtPjx1cmxzPjwvdXJscz48Y3VzdG9tMj5QTUMxMjkwMzg8L2N1c3RvbTI+PGVsZWN0cm9uaWMt
-cmVzb3VyY2UtbnVtPjEwLjEwOTMvZW1ib2ovY2RmNTE2PC9lbGVjdHJvbmljLXJlc291cmNlLW51
-bT48cmVtb3RlLWRhdGFiYXNlLXByb3ZpZGVyPk5MTTwvcmVtb3RlLWRhdGFiYXNlLXByb3ZpZGVy
-PjxsYW5ndWFnZT5lbmc8L2xhbmd1YWdlPjwvcmVjb3JkPjwvQ2l0ZT48Q2l0ZT48QXV0aG9yPldh
-cm5hdHo8L0F1dGhvcj48WWVhcj4yMDExPC9ZZWFyPjxSZWNOdW0+MjM8L1JlY051bT48cmVjb3Jk
-PjxyZWMtbnVtYmVyPjIzPC9yZWMtbnVtYmVyPjxmb3JlaWduLWtleXM+PGtleSBhcHA9IkVOIiBk
-Yi1pZD0iZXRwendyemFhemZmeGZlZHh4anh3dHA4enN4MnRwdnN2NWQwIiB0aW1lc3RhbXA9IjE3
-ODAyNTE4MjYiPjIzPC9rZXk+PC9mb3JlaWduLWtleXM+PHJlZi10eXBlIG5hbWU9IkpvdXJuYWwg
-QXJ0aWNsZSI+MTc8L3JlZi10eXBlPjxjb250cmlidXRvcnM+PGF1dGhvcnM+PGF1dGhvcj5XYXJu
-YXR6LCBILiBKLjwvYXV0aG9yPjxhdXRob3I+U2NobWlkdCwgRC48L2F1dGhvcj48YXV0aG9yPk1h
-bmtlLCBULjwvYXV0aG9yPjxhdXRob3I+UGljY2luaSwgSS48L2F1dGhvcj48YXV0aG9yPlN1bHRh
-biwgTS48L2F1dGhvcj48YXV0aG9yPkJvcm9kaW5hLCBULjwvYXV0aG9yPjxhdXRob3I+QmFsemVy
-ZWl0LCBELjwvYXV0aG9yPjxhdXRob3I+V3J1Y2ssIFcuPC9hdXRob3I+PGF1dGhvcj5Tb2xkYXRv
-diwgQS48L2F1dGhvcj48YXV0aG9yPlZpbmdyb24sIE0uPC9hdXRob3I+PGF1dGhvcj5MZWhyYWNo
-LCBILjwvYXV0aG9yPjxhdXRob3I+WWFzcG8sIE0uIEwuPC9hdXRob3I+PC9hdXRob3JzPjwvY29u
-dHJpYnV0b3JzPjxhdXRoLWFkZHJlc3M+RGVwYXJ0bWVudCBvZiBWZXJ0ZWJyYXRlIEdlbm9taWNz
-LCBNYXggUGxhbmNrIEluc3RpdHV0ZSBmb3IgTW9sZWN1bGFyIEdlbmV0aWNzLCAxNDE5NSBCZXJs
-aW4sIEdlcm1hbnkuPC9hdXRoLWFkZHJlc3M+PHRpdGxlcz48dGl0bGU+VGhlIEJUQiBhbmQgQ05D
-IGhvbW9sb2d5IDEgKEJBQ0gxKSB0YXJnZXQgZ2VuZXMgYXJlIGludm9sdmVkIGluIHRoZSBveGlk
-YXRpdmUgc3RyZXNzIHJlc3BvbnNlIGFuZCBpbiBjb250cm9sIG9mIHRoZSBjZWxsIGN5Y2xlPC90
-aXRsZT48c2Vjb25kYXJ5LXRpdGxlPkogQmlvbCBDaGVtPC9zZWNvbmRhcnktdGl0bGU+PC90aXRs
-ZXM+PHBlcmlvZGljYWw+PGZ1bGwtdGl0bGU+SiBCaW9sIENoZW08L2Z1bGwtdGl0bGU+PC9wZXJp
-b2RpY2FsPjxwYWdlcz4yMzUyMS0zMjwvcGFnZXM+PHZvbHVtZT4yODY8L3ZvbHVtZT48bnVtYmVy
-PjI2PC9udW1iZXI+PGVkaXRpb24+MjAxMTA1MDk8L2VkaXRpb24+PGtleXdvcmRzPjxrZXl3b3Jk
-PkJhc2ljLUxldWNpbmUgWmlwcGVyIFRyYW5zY3JpcHRpb24gRmFjdG9ycy9nZW5ldGljcy8qbWV0
-YWJvbGlzbTwva2V5d29yZD48a2V5d29yZD5DZWxsIEN5Y2xlLypwaHlzaW9sb2d5PC9rZXl3b3Jk
-PjxrZXl3b3JkPkZhbmNvbmkgQW5lbWlhIENvbXBsZW1lbnRhdGlvbiBHcm91cCBQcm90ZWlucy9n
-ZW5ldGljcy8qbWV0YWJvbGlzbTwva2V5d29yZD48a2V5d29yZD5HZW5lIEV4cHJlc3Npb24gUHJv
-ZmlsaW5nPC9rZXl3b3JkPjxrZXl3b3JkPkdlbmUgRXhwcmVzc2lvbiBSZWd1bGF0aW9uLypwaHlz
-aW9sb2d5PC9rZXl3b3JkPjxrZXl3b3JkPkhFSzI5MyBDZWxsczwva2V5d29yZD48a2V5d29yZD5I
-dW1hbnM8L2tleXdvcmQ+PGtleXdvcmQ+T2xpZ29udWNsZW90aWRlIEFycmF5IFNlcXVlbmNlIEFu
-YWx5c2lzPC9rZXl3b3JkPjxrZXl3b3JkPk94aWRhdGl2ZSBTdHJlc3MvKnBoeXNpb2xvZ3k8L2tl
-eXdvcmQ+PGtleXdvcmQ+UmVzcG9uc2UgRWxlbWVudHMvcGh5c2lvbG9neTwva2V5d29yZD48L2tl
-eXdvcmRzPjxkYXRlcz48eWVhcj4yMDExPC95ZWFyPjxwdWItZGF0ZXM+PGRhdGU+SnVsIDE8L2Rh
-dGU+PC9wdWItZGF0ZXM+PC9kYXRlcz48aXNibj4wMDIxLTkyNTggKFByaW50KSYjeEQ7MDAyMS05
-MjU4PC9pc2JuPjxhY2Nlc3Npb24tbnVtPjIxNTU1NTE4PC9hY2Nlc3Npb24tbnVtPjx1cmxzPjwv
-dXJscz48Y3VzdG9tMj5QTUMzMTIzMTE1PC9jdXN0b20yPjxlbGVjdHJvbmljLXJlc291cmNlLW51
-bT4xMC4xMDc0L2piYy5NMTExLjIyMDE3ODwvZWxlY3Ryb25pYy1yZXNvdXJjZS1udW0+PHJlbW90
-ZS1kYXRhYmFzZS1wcm92aWRlcj5OTE08L3JlbW90ZS1kYXRhYmFzZS1wcm92aWRlcj48bGFuZ3Vh
-Z2U+ZW5nPC9sYW5ndWFnZT48L3JlY29yZD48L0NpdGU+PC9FbmROb3RlPgB=
-</w:fldData>
-        </w:fldChar>
-      </w:r>
-      <w:r>
-        <w:instrText xml:space="preserve"> ADDIN EN.CITE.DATA </w:instrText>
-      </w:r>
-      <w:r>
-        <w:fldChar w:fldCharType="end"/>
-      </w:r>
-      <w:r>
-        <w:fldChar w:fldCharType="separate"/>
-      </w:r>
-      <w:r>
-        <w:rPr>
-          <w:noProof/>
+        <w:rPr/>
+        <w:t>BACH1 is a heme-responsive basic leucine zipper transcription factor involved in oxidative-stress adaptation, heme metabolism and Maf-recognition-element regulation. Experimental lung cancer models connect BACH1 to metastatic progression, glycolytic adaptation and angiogenic transcription</w:t>
+      </w:r>
+      <w:r>
+        <w:rPr>
           <w:vertAlign w:val="superscript"/>
         </w:rPr>
-        <w:t>7, 8</w:t>
-      </w:r>
-      <w:r>
-        <w:fldChar w:fldCharType="end"/>
-      </w:r>
-      <w:r>
-        <w:t xml:space="preserve">. Experimental lung cancer models link BACH1 to metastatic progression downstream of nuclear factor erythroid 2-related factor 2 (NRF2), altered heme metabolism, antioxidant exposure, glycolytic adaptation and selected transcriptional effectors </w:t>
-      </w:r>
-      <w:r>
-        <w:fldChar w:fldCharType="begin">
-          <w:fldData xml:space="preserve">PEVuZE5vdGU+PENpdGU+PEF1dGhvcj5MaWduaXR0bzwvQXV0aG9yPjxZZWFyPjIwMTk8L1llYXI+
-PFJlY051bT4zNTwvUmVjTnVtPjxEaXNwbGF5VGV4dD48c3R5bGUgZmFjZT0ic3VwZXJzY3JpcHQi
-PjksIDEwPC9zdHlsZT48L0Rpc3BsYXlUZXh0PjxyZWNvcmQ+PHJlYy1udW1iZXI+MzU8L3JlYy1u
-dW1iZXI+PGZvcmVpZ24ta2V5cz48a2V5IGFwcD0iRU4iIGRiLWlkPSJldHB6d3J6YWF6ZmZ4ZmVk
-eHhqeHd0cDh6c3gydHB2c3Y1ZDAiIHRpbWVzdGFtcD0iMTc4MDI1MjI3OCI+MzU8L2tleT48L2Zv
-cmVpZ24ta2V5cz48cmVmLXR5cGUgbmFtZT0iSm91cm5hbCBBcnRpY2xlIj4xNzwvcmVmLXR5cGU+
-PGNvbnRyaWJ1dG9ycz48YXV0aG9ycz48YXV0aG9yPkxpZ25pdHRvLCBMLjwvYXV0aG9yPjxhdXRo
-b3I+TGVCb2V1ZiwgUy4gRS48L2F1dGhvcj48YXV0aG9yPkhvbWVyLCBILjwvYXV0aG9yPjxhdXRo
-b3I+SmlhbmcsIFMuPC9hdXRob3I+PGF1dGhvcj5Bc2tlbmF6aSwgTS48L2F1dGhvcj48YXV0aG9y
-PkthcmFrb3VzaSwgVC4gUi48L2F1dGhvcj48YXV0aG9yPlBhc3MsIEguIEkuPC9hdXRob3I+PGF1
-dGhvcj5CaHV0a2FyLCBBLiBKLjwvYXV0aG9yPjxhdXRob3I+VHNpcmlnb3MsIEEuPC9hdXRob3I+
-PGF1dGhvcj5VZWJlcmhlaWRlLCBCLjwvYXV0aG9yPjxhdXRob3I+U2F5aW4sIFYuIEkuPC9hdXRo
-b3I+PGF1dGhvcj5QYXBhZ2lhbm5ha29wb3Vsb3MsIFQuPC9hdXRob3I+PGF1dGhvcj5QYWdhbm8s
-IE0uPC9hdXRob3I+PC9hdXRob3JzPjwvY29udHJpYnV0b3JzPjxhdXRoLWFkZHJlc3M+RGVwYXJ0
-bWVudCBvZiBCaW9jaGVtaXN0cnkgYW5kIE1vbGVjdWxhciBQaGFybWFjb2xvZ3ksIE5ldyBZb3Jr
-IFVuaXZlcnNpdHkgU2Nob29sIG9mIE1lZGljaW5lLCBOZXcgWW9yaywgTlkgMTAwMTYsIFVTQTsg
-UGVybG11dHRlciBOWVUgQ2FuY2VyIENlbnRlciwgTmV3IFlvcmsgVW5pdmVyc2l0eSBTY2hvb2wg
-b2YgTWVkaWNpbmUsIE5ldyBZb3JrLCBOWSAxMDAxNiwgVVNBLiYjeEQ7UGVybG11dHRlciBOWVUg
-Q2FuY2VyIENlbnRlciwgTmV3IFlvcmsgVW5pdmVyc2l0eSBTY2hvb2wgb2YgTWVkaWNpbmUsIE5l
-dyBZb3JrLCBOWSAxMDAxNiwgVVNBOyBEZXBhcnRtZW50IG9mIFBhdGhvbG9neSwgTmV3IFlvcmsg
-VW5pdmVyc2l0eSBTY2hvb2wgb2YgTWVkaWNpbmUsIE5ldyBZb3JrLCBOWSAxMDAxNiwgVVNBLiYj
-eEQ7RGVwYXJ0bWVudCBvZiBCaW9jaGVtaXN0cnkgYW5kIE1vbGVjdWxhciBQaGFybWFjb2xvZ3ks
-IE5ldyBZb3JrIFVuaXZlcnNpdHkgU2Nob29sIG9mIE1lZGljaW5lLCBOZXcgWW9yaywgTlkgMTAw
-MTYsIFVTQTsgQmlvbWVkaWNhbCBIb3N0aW5nIExMQywgMzMgTGV3aXMgQXZlbnVlLCBBcmxpbmd0
-b24sIE1BIDAyNDc0LCBVU0EuJiN4RDtQZXJsbXV0dGVyIE5ZVSBDYW5jZXIgQ2VudGVyLCBOZXcg
-WW9yayBVbml2ZXJzaXR5IFNjaG9vbCBvZiBNZWRpY2luZSwgTmV3IFlvcmssIE5ZIDEwMDE2LCBV
-U0E7IERlcGFydG1lbnQgb2YgQ2FyZGlvdGhvcmFjaWMgU3VyZ2VyeSwgTmV3IFlvcmsgVW5pdmVy
-c2l0eSBTY2hvb2wgb2YgTWVkaWNpbmUsIE5ldyBZb3JrLCBOWSAxMDAxNiwgVVNBLiYjeEQ7S29j
-aCBJbnN0aXR1dGUgZm9yIEludGVncmF0aXZlIENhbmNlciBSZXNlYXJjaCwgTUlULCA3NyBNYXNz
-YWNodXNldHRzIEF2ZS4gQnVpbGRpbmcgNzYsIENhbWJyaWRnZSwgTUEgMDIxMzksIFVTQS4mI3hE
-O1BlcmxtdXR0ZXIgTllVIENhbmNlciBDZW50ZXIsIE5ldyBZb3JrIFVuaXZlcnNpdHkgU2Nob29s
-IG9mIE1lZGljaW5lLCBOZXcgWW9yaywgTlkgMTAwMTYsIFVTQTsgRGVwYXJ0bWVudCBvZiBQYXRo
-b2xvZ3ksIE5ldyBZb3JrIFVuaXZlcnNpdHkgU2Nob29sIG9mIE1lZGljaW5lLCBOZXcgWW9yaywg
-TlkgMTAwMTYsIFVTQS4gRWxlY3Ryb25pYyBhZGRyZXNzOiBwYXBhZ3QwMUBueXVtYy5vcmcuJiN4
-RDtEZXBhcnRtZW50IG9mIEJpb2NoZW1pc3RyeSBhbmQgTW9sZWN1bGFyIFBoYXJtYWNvbG9neSwg
-TmV3IFlvcmsgVW5pdmVyc2l0eSBTY2hvb2wgb2YgTWVkaWNpbmUsIE5ldyBZb3JrLCBOWSAxMDAx
-NiwgVVNBOyBQZXJsbXV0dGVyIE5ZVSBDYW5jZXIgQ2VudGVyLCBOZXcgWW9yayBVbml2ZXJzaXR5
-IFNjaG9vbCBvZiBNZWRpY2luZSwgTmV3IFlvcmssIE5ZIDEwMDE2LCBVU0E7IEhvd2FyZCBIdWdo
-ZXMgTWVkaWNhbCBJbnN0aXR1dGUsIE5ldyBZb3JrIFVuaXZlcnNpdHkgU2Nob29sIG9mIE1lZGlj
-aW5lLCBOZXcgWW9yaywgTlkgMTAwMTYsIFVTQS4gRWxlY3Ryb25pYyBhZGRyZXNzOiBtaWNoZWxl
-LnBhZ2Fub0BueXVtYy5vcmcuPC9hdXRoLWFkZHJlc3M+PHRpdGxlcz48dGl0bGU+TnJmMiBBY3Rp
-dmF0aW9uIFByb21vdGVzIEx1bmcgQ2FuY2VyIE1ldGFzdGFzaXMgYnkgSW5oaWJpdGluZyB0aGUg
-RGVncmFkYXRpb24gb2YgQmFjaDE8L3RpdGxlPjxzZWNvbmRhcnktdGl0bGU+Q2VsbDwvc2Vjb25k
-YXJ5LXRpdGxlPjwvdGl0bGVzPjxwZXJpb2RpY2FsPjxmdWxsLXRpdGxlPkNlbGw8L2Z1bGwtdGl0
-bGU+PC9wZXJpb2RpY2FsPjxwYWdlcz4zMTYtMzI5LmUxODwvcGFnZXM+PHZvbHVtZT4xNzg8L3Zv
-bHVtZT48bnVtYmVyPjI8L251bWJlcj48ZWRpdGlvbj4yMDE5MDYyNzwvZWRpdGlvbj48a2V5d29y
-ZHM+PGtleXdvcmQ+QW5pbWFsczwva2V5d29yZD48a2V5d29yZD5CYXNpYy1MZXVjaW5lIFppcHBl
-ciBUcmFuc2NyaXB0aW9uIEZhY3RvcnMvYW50YWdvbmlzdHMgJmFtcDs8L2tleXdvcmQ+PGtleXdv
-cmQ+aW5oaWJpdG9ycy9nZW5ldGljcy8qbWV0YWJvbGlzbTwva2V5d29yZD48a2V5d29yZD5DZWxs
-IExpbmUsIFR1bW9yPC9rZXl3b3JkPjxrZXl3b3JkPkNlbGwgTW92ZW1lbnQ8L2tleXdvcmQ+PGtl
-eXdvcmQ+Ri1Cb3ggUHJvdGVpbnMvYW50YWdvbmlzdHMgJmFtcDsgaW5oaWJpdG9ycy9nZW5ldGlj
-cy9tZXRhYm9saXNtPC9rZXl3b3JkPjxrZXl3b3JkPkZlbWFsZTwva2V5d29yZD48a2V5d29yZD5I
-ZW1lIE94eWdlbmFzZS0xL2FudGFnb25pc3RzICZhbXA7IGluaGliaXRvcnMvZ2VuZXRpY3MvbWV0
-YWJvbGlzbTwva2V5d29yZD48a2V5d29yZD5IdW1hbnM8L2tleXdvcmQ+PGtleXdvcmQ+S2FwbGFu
-LU1laWVyIEVzdGltYXRlPC9rZXl3b3JkPjxrZXl3b3JkPktlbGNoLUxpa2UgRUNILUFzc29jaWF0
-ZWQgUHJvdGVpbiAxL2FudGFnb25pc3RzICZhbXA7IGluaGliaXRvcnMvZ2VuZXRpY3MvbWV0YWJv
-bGlzbTwva2V5d29yZD48a2V5d29yZD5MdW5nIE5lb3BsYXNtcy9tZXRhYm9saXNtL21vcnRhbGl0
-eS8qcGF0aG9sb2d5PC9rZXl3b3JkPjxrZXl3b3JkPk1hbGU8L2tleXdvcmQ+PGtleXdvcmQ+TWlj
-ZTwva2V5d29yZD48a2V5d29yZD5NaWNlLCBJbmJyZWQgQzU3Qkw8L2tleXdvcmQ+PGtleXdvcmQ+
-TWljZSwgS25vY2tvdXQ8L2tleXdvcmQ+PGtleXdvcmQ+TkYtRTItUmVsYXRlZCBGYWN0b3IgMi9n
-ZW5ldGljcy8qbWV0YWJvbGlzbTwva2V5d29yZD48a2V5d29yZD5OZW9wbGFzbSBNZXRhc3Rhc2lz
-PC9rZXl3b3JkPjxrZXl3b3JkPlJOQSBJbnRlcmZlcmVuY2U8L2tleXdvcmQ+PGtleXdvcmQ+Uk5B
-LCBTbWFsbCBJbnRlcmZlcmluZy9tZXRhYm9saXNtPC9rZXl3b3JkPjxrZXl3b3JkPlJlY2VwdG9y
-cywgQ3l0b3BsYXNtaWMgYW5kIE51Y2xlYXIvYW50YWdvbmlzdHMgJmFtcDsgaW5oaWJpdG9ycy9n
-ZW5ldGljcy9tZXRhYm9saXNtPC9rZXl3b3JkPjxrZXl3b3JkPlRyYW5zY3JpcHRpb25hbCBBY3Rp
-dmF0aW9uPC9rZXl3b3JkPjxrZXl3b3JkPkJhY2gxPC9rZXl3b3JkPjxrZXl3b3JkPkNSTCBjb21w
-bGV4ZXM8L2tleXdvcmQ+PGtleXdvcmQ+Ri1ib3ggcHJvdGVpbnM8L2tleXdvcmQ+PGtleXdvcmQ+
-RmJ4bzIyPC9rZXl3b3JkPjxrZXl3b3JkPkhlbWU8L2tleXdvcmQ+PGtleXdvcmQ+SG8xIGluaGli
-aXRvcjwva2V5d29yZD48a2V5d29yZD5LZWFwMTwva2V5d29yZD48a2V5d29yZD5OcmYyPC9rZXl3
-b3JkPjxrZXl3b3JkPmN1bGxpbi1SSU5HIHViaXF1aXRpbiBsaWdhc2U8L2tleXdvcmQ+PGtleXdv
-cmQ+bHVuZyBjYW5jZXI8L2tleXdvcmQ+PGtleXdvcmQ+bWV0YXN0YXNpczwva2V5d29yZD48a2V5
-d29yZD51YmlxdWl0aW48L2tleXdvcmQ+PC9rZXl3b3Jkcz48ZGF0ZXM+PHllYXI+MjAxOTwveWVh
-cj48cHViLWRhdGVzPjxkYXRlPkp1bCAxMTwvZGF0ZT48L3B1Yi1kYXRlcz48L2RhdGVzPjxpc2Ju
-PjAwOTItODY3NCAoUHJpbnQpJiN4RDswMDkyLTg2NzQ8L2lzYm4+PGFjY2Vzc2lvbi1udW0+MzEy
-NTcwMjM8L2FjY2Vzc2lvbi1udW0+PHVybHM+PC91cmxzPjxjdXN0b20xPkRlY2xhcmF0aW9uIG9m
-IEludGVyZXN0cyBNLlAuIGlzIGEgbWVtYmVyIG9mIHRoZSBhZHZpc29yeSBib2FyZHMgb2YgQ3Vs
-bGdlbiBJbmMuIGFuZCBLeW1lcmEgVGhlcmFwZXV0aWNzLiBIZSBpcyBhbHNvIGEgY29uc3VsdGFu
-dCBmb3IgQmV5b25kU3ByaW5nIFBoYXJtYWNldXRpY2Fscy48L2N1c3RvbTE+PGN1c3RvbTI+UE1D
-NjYyNTkyMTwvY3VzdG9tMj48Y3VzdG9tNj5OSUhNUzE1MzExOTk8L2N1c3RvbTY+PGVsZWN0cm9u
-aWMtcmVzb3VyY2UtbnVtPjEwLjEwMTYvai5jZWxsLjIwMTkuMDYuMDAzPC9lbGVjdHJvbmljLXJl
-c291cmNlLW51bT48cmVtb3RlLWRhdGFiYXNlLXByb3ZpZGVyPk5MTTwvcmVtb3RlLWRhdGFiYXNl
-LXByb3ZpZGVyPjxsYW5ndWFnZT5lbmc8L2xhbmd1YWdlPjwvcmVjb3JkPjwvQ2l0ZT48Q2l0ZT48
-QXV0aG9yPldpZWw8L0F1dGhvcj48WWVhcj4yMDE5PC9ZZWFyPjxSZWNOdW0+MzY8L1JlY051bT48
-cmVjb3JkPjxyZWMtbnVtYmVyPjM2PC9yZWMtbnVtYmVyPjxmb3JlaWduLWtleXM+PGtleSBhcHA9
-IkVOIiBkYi1pZD0iZXRwendyemFhemZmeGZlZHh4anh3dHA4enN4MnRwdnN2NWQwIiB0aW1lc3Rh
-bXA9IjE3ODAyNTIzMTciPjM2PC9rZXk+PC9mb3JlaWduLWtleXM+PHJlZi10eXBlIG5hbWU9Ikpv
-dXJuYWwgQXJ0aWNsZSI+MTc8L3JlZi10eXBlPjxjb250cmlidXRvcnM+PGF1dGhvcnM+PGF1dGhv
-cj5XaWVsLCBDLjwvYXV0aG9yPjxhdXRob3I+TGUgR2FsLCBLLjwvYXV0aG9yPjxhdXRob3I+SWJy
-YWhpbSwgTS4gWC48L2F1dGhvcj48YXV0aG9yPkphaGFuZ2lyLCBDLiBBLjwvYXV0aG9yPjxhdXRo
-b3I+S2FzaGlmLCBNLjwvYXV0aG9yPjxhdXRob3I+WWFvLCBILjwvYXV0aG9yPjxhdXRob3I+Wmll
-Z2xlciwgRC4gVi48L2F1dGhvcj48YXV0aG9yPlh1LCBYLjwvYXV0aG9yPjxhdXRob3I+R2hvc2gs
-IFQuPC9hdXRob3I+PGF1dGhvcj5Nb25kYWwsIFQuPC9hdXRob3I+PGF1dGhvcj5LYW5kdXJpLCBD
-LjwvYXV0aG9yPjxhdXRob3I+TGluZGFobCwgUC48L2F1dGhvcj48YXV0aG9yPlNheWluLCBWLiBJ
-LjwvYXV0aG9yPjxhdXRob3I+QmVyZ28sIE0uIE8uPC9hdXRob3I+PC9hdXRob3JzPjwvY29udHJp
-YnV0b3JzPjxhdXRoLWFkZHJlc3M+RGVwYXJ0bWVudCBvZiBCaW9zY2llbmNlcyBhbmQgTnV0cml0
-aW9uLCBLYXJvbGluc2thIEluc3RpdHV0ZXQsIDE0MSA4MyBIdWRkaW5nZSwgU3dlZGVuOyBTYWhs
-Z3JlbnNrYSBDYW5jZXIgQ2VudGVyLCBEZXBhcnRtZW50IG9mIE1vbGVjdWxhciBhbmQgQ2xpbmlj
-YWwgTWVkaWNpbmUsIEluc3RpdHV0ZSBvZiBNZWRpY2luZSwgVW5pdmVyc2l0eSBvZiBHb3RoZW5i
-dXJnLCA0MDUgMzAgR290aGVuYnVyZywgU3dlZGVuLiYjeEQ7U2FobGdyZW5za2EgQ2FuY2VyIENl
-bnRlciwgRGVwYXJ0bWVudCBvZiBTdXJnZXJ5LCBJbnN0aXR1dGUgb2YgQ2xpbmljYWwgU2NpZW5j
-ZXMsIFVuaXZlcnNpdHkgb2YgR290aGVuYnVyZywgNDA1IDMwIEdvdGhlbmJ1cmcsIFN3ZWRlbjsg
-V2FsbGVuYmVyZyBDZW50cmUgZm9yIE1vbGVjdWxhciBhbmQgVHJhbnNsYXRpb25hbCBNZWRpY2lu
-ZSwgVW5pdmVyc2l0eSBvZiBHb3RoZW5idXJnLCA0MDUgMzAgR290aGVuYnVyZywgU3dlZGVuLiYj
-eEQ7U2FobGdyZW5za2EgQ2FuY2VyIENlbnRlciwgRGVwYXJ0bWVudCBvZiBNb2xlY3VsYXIgYW5k
-IENsaW5pY2FsIE1lZGljaW5lLCBJbnN0aXR1dGUgb2YgTWVkaWNpbmUsIFVuaXZlcnNpdHkgb2Yg
-R290aGVuYnVyZywgNDA1IDMwIEdvdGhlbmJ1cmcsIFN3ZWRlbi4mI3hEO0RlcGFydG1lbnQgb2Yg
-Qmlvc2NpZW5jZXMgYW5kIE51dHJpdGlvbiwgS2Fyb2xpbnNrYSBJbnN0aXR1dGV0LCAxNDEgODMg
-SHVkZGluZ2UsIFN3ZWRlbi4mI3hEO0RlcGFydG1lbnQgb2YgTWVkaWNhbCBCaW9jaGVtaXN0cnkg
-YW5kIENlbGwgQmlvbG9neSwgSW5zdGl0dXRlIG9mIEJpb21lZGljaW5lLCBVbml2ZXJzaXR5IG9m
-IEdvdGhlbmJ1cmcsIDQwNSAzMCBHb3RoZW5idXJnLCBTd2VkZW4uJiN4RDtUaGUgV2FsbGVuYmVy
-ZyBMYWJvcmF0b3J5LCBEZXBhcnRtZW50IG9mIE1vbGVjdWxhciBhbmQgQ2xpbmljYWwgTWVkaWNp
-bmUsIEluc3RpdHV0ZSBvZiBNZWRpY2luZSwgVW5pdmVyc2l0eSBvZiBHb3RoZW5idXJnLCA0MDUg
-MzAgR290aGVuYnVyZywgU3dlZGVuLiYjeEQ7U2FobGdyZW5za2EgQ2FuY2VyIENlbnRlciwgRGVw
-YXJ0bWVudCBvZiBTdXJnZXJ5LCBJbnN0aXR1dGUgb2YgQ2xpbmljYWwgU2NpZW5jZXMsIFVuaXZl
-cnNpdHkgb2YgR290aGVuYnVyZywgNDA1IDMwIEdvdGhlbmJ1cmcsIFN3ZWRlbjsgV2FsbGVuYmVy
-ZyBDZW50cmUgZm9yIE1vbGVjdWxhciBhbmQgVHJhbnNsYXRpb25hbCBNZWRpY2luZSwgVW5pdmVy
-c2l0eSBvZiBHb3RoZW5idXJnLCA0MDUgMzAgR290aGVuYnVyZywgU3dlZGVuLiBFbGVjdHJvbmlj
-IGFkZHJlc3M6IHZvbGthbi5zYXlpbkBndS5zZS4mI3hEO0RlcGFydG1lbnQgb2YgQmlvc2NpZW5j
-ZXMgYW5kIE51dHJpdGlvbiwgS2Fyb2xpbnNrYSBJbnN0aXR1dGV0LCAxNDEgODMgSHVkZGluZ2Us
-IFN3ZWRlbjsgU2FobGdyZW5za2EgQ2FuY2VyIENlbnRlciwgRGVwYXJ0bWVudCBvZiBNb2xlY3Vs
-YXIgYW5kIENsaW5pY2FsIE1lZGljaW5lLCBJbnN0aXR1dGUgb2YgTWVkaWNpbmUsIFVuaXZlcnNp
-dHkgb2YgR290aGVuYnVyZywgNDA1IDMwIEdvdGhlbmJ1cmcsIFN3ZWRlbi4gRWxlY3Ryb25pYyBh
-ZGRyZXNzOiBtYXJ0aW4uYmVyZ29Aa2kuc2UuPC9hdXRoLWFkZHJlc3M+PHRpdGxlcz48dGl0bGU+
-QkFDSDEgU3RhYmlsaXphdGlvbiBieSBBbnRpb3hpZGFudHMgU3RpbXVsYXRlcyBMdW5nIENhbmNl
-ciBNZXRhc3Rhc2lzPC90aXRsZT48c2Vjb25kYXJ5LXRpdGxlPkNlbGw8L3NlY29uZGFyeS10aXRs
-ZT48L3RpdGxlcz48cGVyaW9kaWNhbD48ZnVsbC10aXRsZT5DZWxsPC9mdWxsLXRpdGxlPjwvcGVy
-aW9kaWNhbD48cGFnZXM+MzMwLTM0NS5lMjI8L3BhZ2VzPjx2b2x1bWU+MTc4PC92b2x1bWU+PG51
-bWJlcj4yPC9udW1iZXI+PGVkaXRpb24+MjAxOTA2Mjc8L2VkaXRpb24+PGtleXdvcmRzPjxrZXl3
-b3JkPkFuaW1hbHM8L2tleXdvcmQ+PGtleXdvcmQ+QW50aW94aWRhbnRzL2FkbWluaXN0cmF0aW9u
-ICZhbXA7IGRvc2FnZS8qcGhhcm1hY29sb2d5PC9rZXl3b3JkPjxrZXl3b3JkPkJhc2ljLUxldWNp
-bmUgWmlwcGVyIFRyYW5zY3JpcHRpb24gRmFjdG9ycy9nZW5ldGljcy8qbWV0YWJvbGlzbTwva2V5
-d29yZD48a2V5d29yZD5DZWxsIE1vdmVtZW50L2RydWcgZWZmZWN0czwva2V5d29yZD48a2V5d29y
-ZD5HbHljZXJhbGRlaHlkZS0zLVBob3NwaGF0ZSBEZWh5ZHJvZ2VuYXNlIChQaG9zcGhvcnlsYXRp
-bmcpL21ldGFib2xpc208L2tleXdvcmQ+PGtleXdvcmQ+R2x5Y29seXNpcy8qZHJ1ZyBlZmZlY3Rz
-PC9rZXl3b3JkPjxrZXl3b3JkPkhlbWUvbWV0YWJvbGlzbTwva2V5d29yZD48a2V5d29yZD5IZXhv
-a2luYXNlL2FudGFnb25pc3RzICZhbXA7IGluaGliaXRvcnMvZ2VuZXRpY3MvbWV0YWJvbGlzbTwv
-a2V5d29yZD48a2V5d29yZD5IdW1hbnM8L2tleXdvcmQ+PGtleXdvcmQ+S2FwbGFuLU1laWVyIEVz
-dGltYXRlPC9rZXl3b3JkPjxrZXl3b3JkPkx1bmcgTmVvcGxhc21zL2RydWcgdGhlcmFweS9tb3J0
-YWxpdHkvKnBhdGhvbG9neTwva2V5d29yZD48a2V5d29yZD5NaWNlPC9rZXl3b3JkPjxrZXl3b3Jk
-Pk1pY2UsIEluYnJlZCBOT0Q8L2tleXdvcmQ+PGtleXdvcmQ+TWljZSwgS25vY2tvdXQ8L2tleXdv
-cmQ+PGtleXdvcmQ+TWljZSwgU0NJRDwva2V5d29yZD48a2V5d29yZD5ORi1FMi1SZWxhdGVkIEZh
-Y3RvciAyL21ldGFib2xpc208L2tleXdvcmQ+PGtleXdvcmQ+TmVvcGxhc20gTWV0YXN0YXNpczwv
-a2V5d29yZD48a2V5d29yZD5STkEgSW50ZXJmZXJlbmNlPC9rZXl3b3JkPjxrZXl3b3JkPlJOQSwg
-U21hbGwgSW50ZXJmZXJpbmcvbWV0YWJvbGlzbTwva2V5d29yZD48a2V5d29yZD5SZWFjdGl2ZSBP
-eHlnZW4gU3BlY2llcy9tZXRhYm9saXNtPC9rZXl3b3JkPjxrZXl3b3JkPkJhY2gxPC9rZXl3b3Jk
-PjxrZXl3b3JkPktyYXM8L2tleXdvcmQ+PGtleXdvcmQ+YW50aW94aWRhbnRzPC9rZXl3b3JkPjxr
-ZXl3b3JkPmhlbWU8L2tleXdvcmQ+PGtleXdvcmQ+bHVuZyBjYW5jZXIgbWV0YXN0YXNpczwva2V5
-d29yZD48a2V5d29yZD5tb3VzZSBtb2RlbHM8L2tleXdvcmQ+PGtleXdvcmQ+b3hpZGF0aXZlIHN0
-cmVzczwva2V5d29yZD48L2tleXdvcmRzPjxkYXRlcz48eWVhcj4yMDE5PC95ZWFyPjxwdWItZGF0
-ZXM+PGRhdGU+SnVsIDExPC9kYXRlPjwvcHViLWRhdGVzPjwvZGF0ZXM+PGlzYm4+MDA5Mi04Njc0
-PC9pc2JuPjxhY2Nlc3Npb24tbnVtPjMxMjU3MDI3PC9hY2Nlc3Npb24tbnVtPjx1cmxzPjwvdXJs
-cz48ZWxlY3Ryb25pYy1yZXNvdXJjZS1udW0+MTAuMTAxNi9qLmNlbGwuMjAxOS4wNi4wMDU8L2Vs
-ZWN0cm9uaWMtcmVzb3VyY2UtbnVtPjxyZW1vdGUtZGF0YWJhc2UtcHJvdmlkZXI+TkxNPC9yZW1v
-dGUtZGF0YWJhc2UtcHJvdmlkZXI+PGxhbmd1YWdlPmVuZzwvbGFuZ3VhZ2U+PC9yZWNvcmQ+PC9D
-aXRlPjwvRW5kTm90ZT5=
-</w:fldData>
-        </w:fldChar>
-      </w:r>
-      <w:r>
-        <w:instrText xml:space="preserve"> ADDIN EN.CITE </w:instrText>
-      </w:r>
-      <w:r>
-        <w:fldChar w:fldCharType="begin">
-          <w:fldData xml:space="preserve">PEVuZE5vdGU+PENpdGU+PEF1dGhvcj5MaWduaXR0bzwvQXV0aG9yPjxZZWFyPjIwMTk8L1llYXI+
-PFJlY051bT4zNTwvUmVjTnVtPjxEaXNwbGF5VGV4dD48c3R5bGUgZmFjZT0ic3VwZXJzY3JpcHQi
-PjksIDEwPC9zdHlsZT48L0Rpc3BsYXlUZXh0PjxyZWNvcmQ+PHJlYy1udW1iZXI+MzU8L3JlYy1u
-dW1iZXI+PGZvcmVpZ24ta2V5cz48a2V5IGFwcD0iRU4iIGRiLWlkPSJldHB6d3J6YWF6ZmZ4ZmVk
-eHhqeHd0cDh6c3gydHB2c3Y1ZDAiIHRpbWVzdGFtcD0iMTc4MDI1MjI3OCI+MzU8L2tleT48L2Zv
-cmVpZ24ta2V5cz48cmVmLXR5cGUgbmFtZT0iSm91cm5hbCBBcnRpY2xlIj4xNzwvcmVmLXR5cGU+
-PGNvbnRyaWJ1dG9ycz48YXV0aG9ycz48YXV0aG9yPkxpZ25pdHRvLCBMLjwvYXV0aG9yPjxhdXRo
-b3I+TGVCb2V1ZiwgUy4gRS48L2F1dGhvcj48YXV0aG9yPkhvbWVyLCBILjwvYXV0aG9yPjxhdXRo
-b3I+SmlhbmcsIFMuPC9hdXRob3I+PGF1dGhvcj5Bc2tlbmF6aSwgTS48L2F1dGhvcj48YXV0aG9y
-PkthcmFrb3VzaSwgVC4gUi48L2F1dGhvcj48YXV0aG9yPlBhc3MsIEguIEkuPC9hdXRob3I+PGF1
-dGhvcj5CaHV0a2FyLCBBLiBKLjwvYXV0aG9yPjxhdXRob3I+VHNpcmlnb3MsIEEuPC9hdXRob3I+
-PGF1dGhvcj5VZWJlcmhlaWRlLCBCLjwvYXV0aG9yPjxhdXRob3I+U2F5aW4sIFYuIEkuPC9hdXRo
-b3I+PGF1dGhvcj5QYXBhZ2lhbm5ha29wb3Vsb3MsIFQuPC9hdXRob3I+PGF1dGhvcj5QYWdhbm8s
-IE0uPC9hdXRob3I+PC9hdXRob3JzPjwvY29udHJpYnV0b3JzPjxhdXRoLWFkZHJlc3M+RGVwYXJ0
-bWVudCBvZiBCaW9jaGVtaXN0cnkgYW5kIE1vbGVjdWxhciBQaGFybWFjb2xvZ3ksIE5ldyBZb3Jr
-IFVuaXZlcnNpdHkgU2Nob29sIG9mIE1lZGljaW5lLCBOZXcgWW9yaywgTlkgMTAwMTYsIFVTQTsg
-UGVybG11dHRlciBOWVUgQ2FuY2VyIENlbnRlciwgTmV3IFlvcmsgVW5pdmVyc2l0eSBTY2hvb2wg
-b2YgTWVkaWNpbmUsIE5ldyBZb3JrLCBOWSAxMDAxNiwgVVNBLiYjeEQ7UGVybG11dHRlciBOWVUg
-Q2FuY2VyIENlbnRlciwgTmV3IFlvcmsgVW5pdmVyc2l0eSBTY2hvb2wgb2YgTWVkaWNpbmUsIE5l
-dyBZb3JrLCBOWSAxMDAxNiwgVVNBOyBEZXBhcnRtZW50IG9mIFBhdGhvbG9neSwgTmV3IFlvcmsg
-VW5pdmVyc2l0eSBTY2hvb2wgb2YgTWVkaWNpbmUsIE5ldyBZb3JrLCBOWSAxMDAxNiwgVVNBLiYj
-eEQ7RGVwYXJ0bWVudCBvZiBCaW9jaGVtaXN0cnkgYW5kIE1vbGVjdWxhciBQaGFybWFjb2xvZ3ks
-IE5ldyBZb3JrIFVuaXZlcnNpdHkgU2Nob29sIG9mIE1lZGljaW5lLCBOZXcgWW9yaywgTlkgMTAw
-MTYsIFVTQTsgQmlvbWVkaWNhbCBIb3N0aW5nIExMQywgMzMgTGV3aXMgQXZlbnVlLCBBcmxpbmd0
-b24sIE1BIDAyNDc0LCBVU0EuJiN4RDtQZXJsbXV0dGVyIE5ZVSBDYW5jZXIgQ2VudGVyLCBOZXcg
-WW9yayBVbml2ZXJzaXR5IFNjaG9vbCBvZiBNZWRpY2luZSwgTmV3IFlvcmssIE5ZIDEwMDE2LCBV
-U0E7IERlcGFydG1lbnQgb2YgQ2FyZGlvdGhvcmFjaWMgU3VyZ2VyeSwgTmV3IFlvcmsgVW5pdmVy
-c2l0eSBTY2hvb2wgb2YgTWVkaWNpbmUsIE5ldyBZb3JrLCBOWSAxMDAxNiwgVVNBLiYjeEQ7S29j
-aCBJbnN0aXR1dGUgZm9yIEludGVncmF0aXZlIENhbmNlciBSZXNlYXJjaCwgTUlULCA3NyBNYXNz
-YWNodXNldHRzIEF2ZS4gQnVpbGRpbmcgNzYsIENhbWJyaWRnZSwgTUEgMDIxMzksIFVTQS4mI3hE
-O1BlcmxtdXR0ZXIgTllVIENhbmNlciBDZW50ZXIsIE5ldyBZb3JrIFVuaXZlcnNpdHkgU2Nob29s
-IG9mIE1lZGljaW5lLCBOZXcgWW9yaywgTlkgMTAwMTYsIFVTQTsgRGVwYXJ0bWVudCBvZiBQYXRo
-b2xvZ3ksIE5ldyBZb3JrIFVuaXZlcnNpdHkgU2Nob29sIG9mIE1lZGljaW5lLCBOZXcgWW9yaywg
-TlkgMTAwMTYsIFVTQS4gRWxlY3Ryb25pYyBhZGRyZXNzOiBwYXBhZ3QwMUBueXVtYy5vcmcuJiN4
-RDtEZXBhcnRtZW50IG9mIEJpb2NoZW1pc3RyeSBhbmQgTW9sZWN1bGFyIFBoYXJtYWNvbG9neSwg
-TmV3IFlvcmsgVW5pdmVyc2l0eSBTY2hvb2wgb2YgTWVkaWNpbmUsIE5ldyBZb3JrLCBOWSAxMDAx
-NiwgVVNBOyBQZXJsbXV0dGVyIE5ZVSBDYW5jZXIgQ2VudGVyLCBOZXcgWW9yayBVbml2ZXJzaXR5
-IFNjaG9vbCBvZiBNZWRpY2luZSwgTmV3IFlvcmssIE5ZIDEwMDE2LCBVU0E7IEhvd2FyZCBIdWdo
-ZXMgTWVkaWNhbCBJbnN0aXR1dGUsIE5ldyBZb3JrIFVuaXZlcnNpdHkgU2Nob29sIG9mIE1lZGlj
-aW5lLCBOZXcgWW9yaywgTlkgMTAwMTYsIFVTQS4gRWxlY3Ryb25pYyBhZGRyZXNzOiBtaWNoZWxl
-LnBhZ2Fub0BueXVtYy5vcmcuPC9hdXRoLWFkZHJlc3M+PHRpdGxlcz48dGl0bGU+TnJmMiBBY3Rp
-dmF0aW9uIFByb21vdGVzIEx1bmcgQ2FuY2VyIE1ldGFzdGFzaXMgYnkgSW5oaWJpdGluZyB0aGUg
-RGVncmFkYXRpb24gb2YgQmFjaDE8L3RpdGxlPjxzZWNvbmRhcnktdGl0bGU+Q2VsbDwvc2Vjb25k
-YXJ5LXRpdGxlPjwvdGl0bGVzPjxwZXJpb2RpY2FsPjxmdWxsLXRpdGxlPkNlbGw8L2Z1bGwtdGl0
-bGU+PC9wZXJpb2RpY2FsPjxwYWdlcz4zMTYtMzI5LmUxODwvcGFnZXM+PHZvbHVtZT4xNzg8L3Zv
-bHVtZT48bnVtYmVyPjI8L251bWJlcj48ZWRpdGlvbj4yMDE5MDYyNzwvZWRpdGlvbj48a2V5d29y
-ZHM+PGtleXdvcmQ+QW5pbWFsczwva2V5d29yZD48a2V5d29yZD5CYXNpYy1MZXVjaW5lIFppcHBl
-ciBUcmFuc2NyaXB0aW9uIEZhY3RvcnMvYW50YWdvbmlzdHMgJmFtcDs8L2tleXdvcmQ+PGtleXdv
-cmQ+aW5oaWJpdG9ycy9nZW5ldGljcy8qbWV0YWJvbGlzbTwva2V5d29yZD48a2V5d29yZD5DZWxs
-IExpbmUsIFR1bW9yPC9rZXl3b3JkPjxrZXl3b3JkPkNlbGwgTW92ZW1lbnQ8L2tleXdvcmQ+PGtl
-eXdvcmQ+Ri1Cb3ggUHJvdGVpbnMvYW50YWdvbmlzdHMgJmFtcDsgaW5oaWJpdG9ycy9nZW5ldGlj
-cy9tZXRhYm9saXNtPC9rZXl3b3JkPjxrZXl3b3JkPkZlbWFsZTwva2V5d29yZD48a2V5d29yZD5I
-ZW1lIE94eWdlbmFzZS0xL2FudGFnb25pc3RzICZhbXA7IGluaGliaXRvcnMvZ2VuZXRpY3MvbWV0
-YWJvbGlzbTwva2V5d29yZD48a2V5d29yZD5IdW1hbnM8L2tleXdvcmQ+PGtleXdvcmQ+S2FwbGFu
-LU1laWVyIEVzdGltYXRlPC9rZXl3b3JkPjxrZXl3b3JkPktlbGNoLUxpa2UgRUNILUFzc29jaWF0
-ZWQgUHJvdGVpbiAxL2FudGFnb25pc3RzICZhbXA7IGluaGliaXRvcnMvZ2VuZXRpY3MvbWV0YWJv
-bGlzbTwva2V5d29yZD48a2V5d29yZD5MdW5nIE5lb3BsYXNtcy9tZXRhYm9saXNtL21vcnRhbGl0
-eS8qcGF0aG9sb2d5PC9rZXl3b3JkPjxrZXl3b3JkPk1hbGU8L2tleXdvcmQ+PGtleXdvcmQ+TWlj
-ZTwva2V5d29yZD48a2V5d29yZD5NaWNlLCBJbmJyZWQgQzU3Qkw8L2tleXdvcmQ+PGtleXdvcmQ+
-TWljZSwgS25vY2tvdXQ8L2tleXdvcmQ+PGtleXdvcmQ+TkYtRTItUmVsYXRlZCBGYWN0b3IgMi9n
-ZW5ldGljcy8qbWV0YWJvbGlzbTwva2V5d29yZD48a2V5d29yZD5OZW9wbGFzbSBNZXRhc3Rhc2lz
-PC9rZXl3b3JkPjxrZXl3b3JkPlJOQSBJbnRlcmZlcmVuY2U8L2tleXdvcmQ+PGtleXdvcmQ+Uk5B
-LCBTbWFsbCBJbnRlcmZlcmluZy9tZXRhYm9saXNtPC9rZXl3b3JkPjxrZXl3b3JkPlJlY2VwdG9y
-cywgQ3l0b3BsYXNtaWMgYW5kIE51Y2xlYXIvYW50YWdvbmlzdHMgJmFtcDsgaW5oaWJpdG9ycy9n
-ZW5ldGljcy9tZXRhYm9saXNtPC9rZXl3b3JkPjxrZXl3b3JkPlRyYW5zY3JpcHRpb25hbCBBY3Rp
-dmF0aW9uPC9rZXl3b3JkPjxrZXl3b3JkPkJhY2gxPC9rZXl3b3JkPjxrZXl3b3JkPkNSTCBjb21w
-bGV4ZXM8L2tleXdvcmQ+PGtleXdvcmQ+Ri1ib3ggcHJvdGVpbnM8L2tleXdvcmQ+PGtleXdvcmQ+
-RmJ4bzIyPC9rZXl3b3JkPjxrZXl3b3JkPkhlbWU8L2tleXdvcmQ+PGtleXdvcmQ+SG8xIGluaGli
-aXRvcjwva2V5d29yZD48a2V5d29yZD5LZWFwMTwva2V5d29yZD48a2V5d29yZD5OcmYyPC9rZXl3
-b3JkPjxrZXl3b3JkPmN1bGxpbi1SSU5HIHViaXF1aXRpbiBsaWdhc2U8L2tleXdvcmQ+PGtleXdv
-cmQ+bHVuZyBjYW5jZXI8L2tleXdvcmQ+PGtleXdvcmQ+bWV0YXN0YXNpczwva2V5d29yZD48a2V5
-d29yZD51YmlxdWl0aW48L2tleXdvcmQ+PC9rZXl3b3Jkcz48ZGF0ZXM+PHllYXI+MjAxOTwveWVh
-cj48cHViLWRhdGVzPjxkYXRlPkp1bCAxMTwvZGF0ZT48L3B1Yi1kYXRlcz48L2RhdGVzPjxpc2Ju
-PjAwOTItODY3NCAoUHJpbnQpJiN4RDswMDkyLTg2NzQ8L2lzYm4+PGFjY2Vzc2lvbi1udW0+MzEy
-NTcwMjM8L2FjY2Vzc2lvbi1udW0+PHVybHM+PC91cmxzPjxjdXN0b20xPkRlY2xhcmF0aW9uIG9m
-IEludGVyZXN0cyBNLlAuIGlzIGEgbWVtYmVyIG9mIHRoZSBhZHZpc29yeSBib2FyZHMgb2YgQ3Vs
-bGdlbiBJbmMuIGFuZCBLeW1lcmEgVGhlcmFwZXV0aWNzLiBIZSBpcyBhbHNvIGEgY29uc3VsdGFu
-dCBmb3IgQmV5b25kU3ByaW5nIFBoYXJtYWNldXRpY2Fscy48L2N1c3RvbTE+PGN1c3RvbTI+UE1D
-NjYyNTkyMTwvY3VzdG9tMj48Y3VzdG9tNj5OSUhNUzE1MzExOTk8L2N1c3RvbTY+PGVsZWN0cm9u
-aWMtcmVzb3VyY2UtbnVtPjEwLjEwMTYvai5jZWxsLjIwMTkuMDYuMDAzPC9lbGVjdHJvbmljLXJl
-c291cmNlLW51bT48cmVtb3RlLWRhdGFiYXNlLXByb3ZpZGVyPk5MTTwvcmVtb3RlLWRhdGFiYXNl
-LXByb3ZpZGVyPjxsYW5ndWFnZT5lbmc8L2xhbmd1YWdlPjwvcmVjb3JkPjwvQ2l0ZT48Q2l0ZT48
-QXV0aG9yPldpZWw8L0F1dGhvcj48WWVhcj4yMDE5PC9ZZWFyPjxSZWNOdW0+MzY8L1JlY051bT48
-cmVjb3JkPjxyZWMtbnVtYmVyPjM2PC9yZWMtbnVtYmVyPjxmb3JlaWduLWtleXM+PGtleSBhcHA9
-IkVOIiBkYi1pZD0iZXRwendyemFhemZmeGZlZHh4anh3dHA4enN4MnRwdnN2NWQwIiB0aW1lc3Rh
-bXA9IjE3ODAyNTIzMTciPjM2PC9rZXk+PC9mb3JlaWduLWtleXM+PHJlZi10eXBlIG5hbWU9Ikpv
-dXJuYWwgQXJ0aWNsZSI+MTc8L3JlZi10eXBlPjxjb250cmlidXRvcnM+PGF1dGhvcnM+PGF1dGhv
-cj5XaWVsLCBDLjwvYXV0aG9yPjxhdXRob3I+TGUgR2FsLCBLLjwvYXV0aG9yPjxhdXRob3I+SWJy
-YWhpbSwgTS4gWC48L2F1dGhvcj48YXV0aG9yPkphaGFuZ2lyLCBDLiBBLjwvYXV0aG9yPjxhdXRo
-b3I+S2FzaGlmLCBNLjwvYXV0aG9yPjxhdXRob3I+WWFvLCBILjwvYXV0aG9yPjxhdXRob3I+Wmll
-Z2xlciwgRC4gVi48L2F1dGhvcj48YXV0aG9yPlh1LCBYLjwvYXV0aG9yPjxhdXRob3I+R2hvc2gs
-IFQuPC9hdXRob3I+PGF1dGhvcj5Nb25kYWwsIFQuPC9hdXRob3I+PGF1dGhvcj5LYW5kdXJpLCBD
-LjwvYXV0aG9yPjxhdXRob3I+TGluZGFobCwgUC48L2F1dGhvcj48YXV0aG9yPlNheWluLCBWLiBJ
-LjwvYXV0aG9yPjxhdXRob3I+QmVyZ28sIE0uIE8uPC9hdXRob3I+PC9hdXRob3JzPjwvY29udHJp
-YnV0b3JzPjxhdXRoLWFkZHJlc3M+RGVwYXJ0bWVudCBvZiBCaW9zY2llbmNlcyBhbmQgTnV0cml0
-aW9uLCBLYXJvbGluc2thIEluc3RpdHV0ZXQsIDE0MSA4MyBIdWRkaW5nZSwgU3dlZGVuOyBTYWhs
-Z3JlbnNrYSBDYW5jZXIgQ2VudGVyLCBEZXBhcnRtZW50IG9mIE1vbGVjdWxhciBhbmQgQ2xpbmlj
-YWwgTWVkaWNpbmUsIEluc3RpdHV0ZSBvZiBNZWRpY2luZSwgVW5pdmVyc2l0eSBvZiBHb3RoZW5i
-dXJnLCA0MDUgMzAgR290aGVuYnVyZywgU3dlZGVuLiYjeEQ7U2FobGdyZW5za2EgQ2FuY2VyIENl
-bnRlciwgRGVwYXJ0bWVudCBvZiBTdXJnZXJ5LCBJbnN0aXR1dGUgb2YgQ2xpbmljYWwgU2NpZW5j
-ZXMsIFVuaXZlcnNpdHkgb2YgR290aGVuYnVyZywgNDA1IDMwIEdvdGhlbmJ1cmcsIFN3ZWRlbjsg
-V2FsbGVuYmVyZyBDZW50cmUgZm9yIE1vbGVjdWxhciBhbmQgVHJhbnNsYXRpb25hbCBNZWRpY2lu
-ZSwgVW5pdmVyc2l0eSBvZiBHb3RoZW5idXJnLCA0MDUgMzAgR290aGVuYnVyZywgU3dlZGVuLiYj
-eEQ7U2FobGdyZW5za2EgQ2FuY2VyIENlbnRlciwgRGVwYXJ0bWVudCBvZiBNb2xlY3VsYXIgYW5k
-IENsaW5pY2FsIE1lZGljaW5lLCBJbnN0aXR1dGUgb2YgTWVkaWNpbmUsIFVuaXZlcnNpdHkgb2Yg
-R290aGVuYnVyZywgNDA1IDMwIEdvdGhlbmJ1cmcsIFN3ZWRlbi4mI3hEO0RlcGFydG1lbnQgb2Yg
-Qmlvc2NpZW5jZXMgYW5kIE51dHJpdGlvbiwgS2Fyb2xpbnNrYSBJbnN0aXR1dGV0LCAxNDEgODMg
-SHVkZGluZ2UsIFN3ZWRlbi4mI3hEO0RlcGFydG1lbnQgb2YgTWVkaWNhbCBCaW9jaGVtaXN0cnkg
-YW5kIENlbGwgQmlvbG9neSwgSW5zdGl0dXRlIG9mIEJpb21lZGljaW5lLCBVbml2ZXJzaXR5IG9m
-IEdvdGhlbmJ1cmcsIDQwNSAzMCBHb3RoZW5idXJnLCBTd2VkZW4uJiN4RDtUaGUgV2FsbGVuYmVy
-ZyBMYWJvcmF0b3J5LCBEZXBhcnRtZW50IG9mIE1vbGVjdWxhciBhbmQgQ2xpbmljYWwgTWVkaWNp
-bmUsIEluc3RpdHV0ZSBvZiBNZWRpY2luZSwgVW5pdmVyc2l0eSBvZiBHb3RoZW5idXJnLCA0MDUg
-MzAgR290aGVuYnVyZywgU3dlZGVuLiYjeEQ7U2FobGdyZW5za2EgQ2FuY2VyIENlbnRlciwgRGVw
-YXJ0bWVudCBvZiBTdXJnZXJ5LCBJbnN0aXR1dGUgb2YgQ2xpbmljYWwgU2NpZW5jZXMsIFVuaXZl
-cnNpdHkgb2YgR290aGVuYnVyZywgNDA1IDMwIEdvdGhlbmJ1cmcsIFN3ZWRlbjsgV2FsbGVuYmVy
-ZyBDZW50cmUgZm9yIE1vbGVjdWxhciBhbmQgVHJhbnNsYXRpb25hbCBNZWRpY2luZSwgVW5pdmVy
-c2l0eSBvZiBHb3RoZW5idXJnLCA0MDUgMzAgR290aGVuYnVyZywgU3dlZGVuLiBFbGVjdHJvbmlj
-IGFkZHJlc3M6IHZvbGthbi5zYXlpbkBndS5zZS4mI3hEO0RlcGFydG1lbnQgb2YgQmlvc2NpZW5j
-ZXMgYW5kIE51dHJpdGlvbiwgS2Fyb2xpbnNrYSBJbnN0aXR1dGV0LCAxNDEgODMgSHVkZGluZ2Us
-IFN3ZWRlbjsgU2FobGdyZW5za2EgQ2FuY2VyIENlbnRlciwgRGVwYXJ0bWVudCBvZiBNb2xlY3Vs
-YXIgYW5kIENsaW5pY2FsIE1lZGljaW5lLCBJbnN0aXR1dGUgb2YgTWVkaWNpbmUsIFVuaXZlcnNp
-dHkgb2YgR290aGVuYnVyZywgNDA1IDMwIEdvdGhlbmJ1cmcsIFN3ZWRlbi4gRWxlY3Ryb25pYyBh
-ZGRyZXNzOiBtYXJ0aW4uYmVyZ29Aa2kuc2UuPC9hdXRoLWFkZHJlc3M+PHRpdGxlcz48dGl0bGU+
-QkFDSDEgU3RhYmlsaXphdGlvbiBieSBBbnRpb3hpZGFudHMgU3RpbXVsYXRlcyBMdW5nIENhbmNl
-ciBNZXRhc3Rhc2lzPC90aXRsZT48c2Vjb25kYXJ5LXRpdGxlPkNlbGw8L3NlY29uZGFyeS10aXRs
-ZT48L3RpdGxlcz48cGVyaW9kaWNhbD48ZnVsbC10aXRsZT5DZWxsPC9mdWxsLXRpdGxlPjwvcGVy
-aW9kaWNhbD48cGFnZXM+MzMwLTM0NS5lMjI8L3BhZ2VzPjx2b2x1bWU+MTc4PC92b2x1bWU+PG51
-bWJlcj4yPC9udW1iZXI+PGVkaXRpb24+MjAxOTA2Mjc8L2VkaXRpb24+PGtleXdvcmRzPjxrZXl3
-b3JkPkFuaW1hbHM8L2tleXdvcmQ+PGtleXdvcmQ+QW50aW94aWRhbnRzL2FkbWluaXN0cmF0aW9u
-ICZhbXA7IGRvc2FnZS8qcGhhcm1hY29sb2d5PC9rZXl3b3JkPjxrZXl3b3JkPkJhc2ljLUxldWNp
-bmUgWmlwcGVyIFRyYW5zY3JpcHRpb24gRmFjdG9ycy9nZW5ldGljcy8qbWV0YWJvbGlzbTwva2V5
-d29yZD48a2V5d29yZD5DZWxsIE1vdmVtZW50L2RydWcgZWZmZWN0czwva2V5d29yZD48a2V5d29y
-ZD5HbHljZXJhbGRlaHlkZS0zLVBob3NwaGF0ZSBEZWh5ZHJvZ2VuYXNlIChQaG9zcGhvcnlsYXRp
-bmcpL21ldGFib2xpc208L2tleXdvcmQ+PGtleXdvcmQ+R2x5Y29seXNpcy8qZHJ1ZyBlZmZlY3Rz
-PC9rZXl3b3JkPjxrZXl3b3JkPkhlbWUvbWV0YWJvbGlzbTwva2V5d29yZD48a2V5d29yZD5IZXhv
-a2luYXNlL2FudGFnb25pc3RzICZhbXA7IGluaGliaXRvcnMvZ2VuZXRpY3MvbWV0YWJvbGlzbTwv
-a2V5d29yZD48a2V5d29yZD5IdW1hbnM8L2tleXdvcmQ+PGtleXdvcmQ+S2FwbGFuLU1laWVyIEVz
-dGltYXRlPC9rZXl3b3JkPjxrZXl3b3JkPkx1bmcgTmVvcGxhc21zL2RydWcgdGhlcmFweS9tb3J0
-YWxpdHkvKnBhdGhvbG9neTwva2V5d29yZD48a2V5d29yZD5NaWNlPC9rZXl3b3JkPjxrZXl3b3Jk
-Pk1pY2UsIEluYnJlZCBOT0Q8L2tleXdvcmQ+PGtleXdvcmQ+TWljZSwgS25vY2tvdXQ8L2tleXdv
-cmQ+PGtleXdvcmQ+TWljZSwgU0NJRDwva2V5d29yZD48a2V5d29yZD5ORi1FMi1SZWxhdGVkIEZh
-Y3RvciAyL21ldGFib2xpc208L2tleXdvcmQ+PGtleXdvcmQ+TmVvcGxhc20gTWV0YXN0YXNpczwv
-a2V5d29yZD48a2V5d29yZD5STkEgSW50ZXJmZXJlbmNlPC9rZXl3b3JkPjxrZXl3b3JkPlJOQSwg
-U21hbGwgSW50ZXJmZXJpbmcvbWV0YWJvbGlzbTwva2V5d29yZD48a2V5d29yZD5SZWFjdGl2ZSBP
-eHlnZW4gU3BlY2llcy9tZXRhYm9saXNtPC9rZXl3b3JkPjxrZXl3b3JkPkJhY2gxPC9rZXl3b3Jk
-PjxrZXl3b3JkPktyYXM8L2tleXdvcmQ+PGtleXdvcmQ+YW50aW94aWRhbnRzPC9rZXl3b3JkPjxr
-ZXl3b3JkPmhlbWU8L2tleXdvcmQ+PGtleXdvcmQ+bHVuZyBjYW5jZXIgbWV0YXN0YXNpczwva2V5
-d29yZD48a2V5d29yZD5tb3VzZSBtb2RlbHM8L2tleXdvcmQ+PGtleXdvcmQ+b3hpZGF0aXZlIHN0
-cmVzczwva2V5d29yZD48L2tleXdvcmRzPjxkYXRlcz48eWVhcj4yMDE5PC95ZWFyPjxwdWItZGF0
-ZXM+PGRhdGU+SnVsIDExPC9kYXRlPjwvcHViLWRhdGVzPjwvZGF0ZXM+PGlzYm4+MDA5Mi04Njc0
-PC9pc2JuPjxhY2Nlc3Npb24tbnVtPjMxMjU3MDI3PC9hY2Nlc3Npb24tbnVtPjx1cmxzPjwvdXJs
-cz48ZWxlY3Ryb25pYy1yZXNvdXJjZS1udW0+MTAuMTAxNi9qLmNlbGwuMjAxOS4wNi4wMDU8L2Vs
-ZWN0cm9uaWMtcmVzb3VyY2UtbnVtPjxyZW1vdGUtZGF0YWJhc2UtcHJvdmlkZXI+TkxNPC9yZW1v
-dGUtZGF0YWJhc2UtcHJvdmlkZXI+PGxhbmd1YWdlPmVuZzwvbGFuZ3VhZ2U+PC9yZWNvcmQ+PC9D
-aXRlPjwvRW5kTm90ZT5=
-</w:fldData>
-        </w:fldChar>
-      </w:r>
-      <w:r>
-        <w:instrText xml:space="preserve"> ADDIN EN.CITE.DATA </w:instrText>
-      </w:r>
-      <w:r>
-        <w:fldChar w:fldCharType="end"/>
-      </w:r>
-      <w:r>
-        <w:fldChar w:fldCharType="separate"/>
-      </w:r>
-      <w:r>
-        <w:rPr>
-          <w:noProof/>
+        <w:t>7-10,22</w:t>
+      </w:r>
+      <w:r>
+        <w:rPr/>
+        <w:t>. Our previous clinical and functional study further suggested context-dependent BACH1 biology in NSCLC, motivating investigation of the malignant epithelial states in which BACH1-associated transcription occurs</w:t>
+      </w:r>
+      <w:r>
+        <w:rPr>
           <w:vertAlign w:val="superscript"/>
         </w:rPr>
-        <w:t>9, 10</w:t>
-      </w:r>
-      <w:r>
-        <w:fldChar w:fldCharType="end"/>
-      </w:r>
-      <w:r>
-        <w:t>. A recent perturbation and chromatin immunoprecipitation sequencing (</w:t>
-      </w:r>
-      <w:proofErr w:type="spellStart"/>
-      <w:r>
-        <w:t>ChIP</w:t>
-      </w:r>
-      <w:proofErr w:type="spellEnd"/>
-      <w:r>
-        <w:t xml:space="preserve">-seq) study further defined BACH1-responsive genes in lung cancer cell lines </w:t>
-      </w:r>
-      <w:r>
-        <w:fldChar w:fldCharType="begin">
-          <w:fldData xml:space="preserve">PEVuZE5vdGU+PENpdGU+PEF1dGhvcj5LbGVuamEtU2t1ZHJpbmphPC9BdXRob3I+PFllYXI+MjAy
-NTwvWWVhcj48UmVjTnVtPjYwPC9SZWNOdW0+PERpc3BsYXlUZXh0PjxzdHlsZSBmYWNlPSJzdXBl
-cnNjcmlwdCI+MTE8L3N0eWxlPjwvRGlzcGxheVRleHQ+PHJlY29yZD48cmVjLW51bWJlcj42MDwv
-cmVjLW51bWJlcj48Zm9yZWlnbi1rZXlzPjxrZXkgYXBwPSJFTiIgZGItaWQ9ImV0cHp3cnphYXpm
-ZnhmZWR4eGp4d3RwOHpzeDJ0cHZzdjVkMCIgdGltZXN0YW1wPSIxNzgwMzIzODE1Ij42MDwva2V5
-PjwvZm9yZWlnbi1rZXlzPjxyZWYtdHlwZSBuYW1lPSJKb3VybmFsIEFydGljbGUiPjE3PC9yZWYt
-dHlwZT48Y29udHJpYnV0b3JzPjxhdXRob3JzPjxhdXRob3I+S2xlbmphLVNrdWRyaW5qYSwgRC48
-L2F1dGhvcj48YXV0aG9yPkFsaSwgSy4gWC48L2F1dGhvcj48YXV0aG9yPldhbGtlciwgRC48L2F1
-dGhvcj48YXV0aG9yPkhpZ2dpbnMsIE0uPC9hdXRob3I+PGF1dGhvcj5QYXRlbCwgQS4gQS48L2F1
-dGhvcj48YXV0aG9yPlJhaiwgRC48L2F1dGhvcj48YXV0aG9yPkNyZWVsbWFuLCBBLjwvYXV0aG9y
-PjxhdXRob3I+TWNEb3dhbGwsIEMuPC9hdXRob3I+PGF1dGhvcj5UYXlsb3IsIEMuPC9hdXRob3I+
-PGF1dGhvcj5XZW50YSwgVC48L2F1dGhvcj48YXV0aG9yPkxhcnNzb24sIEUuPC9hdXRob3I+PGF1
-dGhvcj5XaWVsLCBDLjwvYXV0aG9yPjxhdXRob3I+U2F5aW4sIFYuIEkuPC9hdXRob3I+PGF1dGhv
-cj5kZSBsYSBWZWdhLCBMLjwvYXV0aG9yPjwvYXV0aG9ycz48L2NvbnRyaWJ1dG9ycz48YXV0aC1h
-ZGRyZXNzPkphY3F1aSBXb29kIENhbmNlciBDZW50cmUsIERpdmlzaW9uIG9mIENhbmNlciBSZXNl
-YXJjaCwgU2Nob29sIG9mIE1lZGljaW5lLCBVbml2ZXJzaXR5IG9mIER1bmRlZSwgVUsuJiN4RDtJ
-bnN0aXR1dGUgb2YgQ2xpbmljYWwgU2NpZW5jZXMsIERlcGFydG1lbnQgb2YgU3VyZ2VyeSwgU2Fo
-bGdyZW5za2EgQ2VudGVyIGZvciBDYW5jZXIgUmVzZWFyY2gsIFVuaXZlcnNpdHkgb2YgR290aGVu
-YnVyZywgR290aGVuYnVyZywgU3dlZGVuOyBXYWxsZW5iZXJnIENlbnRyZSBmb3IgTW9sZWN1bGFy
-IGFuZCBUcmFuc2xhdGlvbmFsIE1lZGljaW5lLCBVbml2ZXJzaXR5IG9mIEdvdGhlbmJ1cmcsIEdv
-dGhlbmJ1cmcsIFN3ZWRlbi4mI3hEO0RlcGFydG1lbnQgb2YgR2VuZXJhbCBhbmQgTWVkaWNhbCBC
-aW9jaGVtaXN0cnksIEZhY3VsdHkgb2YgQmlvbG9neSwgVW5pdmVyc2l0eSBvZiBHZGFuc2ssIFBv
-bGFuZC4mI3hEO0RlcGFydG1lbnQgb2YgTWVkaWNhbCBCaW9jaGVtaXN0cnkgYW5kIENlbGwgQmlv
-bG9neSwgSW5zdGl0dXRlIG9mIEJpb21lZGljaW5lLCBUaGUgU2FobGdyZW5za2EgQWNhZGVteSwg
-VW5pdmVyc2l0eSBvZiBHb3RoZW5idXJnLCBHb3RoZW5idXJnLCBTd2VkZW4uJiN4RDtJbnN0aXR1
-dGUgb2YgQ2xpbmljYWwgU2NpZW5jZXMsIERlcGFydG1lbnQgb2YgU3VyZ2VyeSwgU2FobGdyZW5z
-a2EgQ2VudGVyIGZvciBDYW5jZXIgUmVzZWFyY2gsIFVuaXZlcnNpdHkgb2YgR290aGVuYnVyZywg
-R290aGVuYnVyZywgU3dlZGVuOyBXYWxsZW5iZXJnIENlbnRyZSBmb3IgTW9sZWN1bGFyIGFuZCBU
-cmFuc2xhdGlvbmFsIE1lZGljaW5lLCBVbml2ZXJzaXR5IG9mIEdvdGhlbmJ1cmcsIEdvdGhlbmJ1
-cmcsIFN3ZWRlbi4gRWxlY3Ryb25pYyBhZGRyZXNzOiB2b2xrYW4uc2F5aW5AZ3Uuc2UuJiN4RDtK
-YWNxdWkgV29vZCBDYW5jZXIgQ2VudHJlLCBEaXZpc2lvbiBvZiBDYW5jZXIgUmVzZWFyY2gsIFNj
-aG9vbCBvZiBNZWRpY2luZSwgVW5pdmVyc2l0eSBvZiBEdW5kZWUsIFVLLiBFbGVjdHJvbmljIGFk
-ZHJlc3M6IGwuZGVsYXZlZ2FAZHVuZGVlLmFjLnVrLjwvYXV0aC1hZGRyZXNzPjx0aXRsZXM+PHRp
-dGxlPklkZW50aWZpY2F0aW9uIG9mIGEgQkFDSDEgbHVuZyBjYW5jZXIgc2lnbmF0dXJlOiBBIG5v
-dmVsIHRvb2wgZm9yIHVuZGVyc3RhbmRpbmcgQkFDSDEgYmlvbG9neSBhbmQgaWRlbnRpZnlpbmcg
-bmV3IGluaGliaXRvcnM8L3RpdGxlPjxzZWNvbmRhcnktdGl0bGU+UmVkb3ggQmlvbDwvc2Vjb25k
-YXJ5LXRpdGxlPjwvdGl0bGVzPjxwZXJpb2RpY2FsPjxmdWxsLXRpdGxlPlJlZG94IEJpb2w8L2Z1
-bGwtdGl0bGU+PC9wZXJpb2RpY2FsPjxwYWdlcz4xMDM3ODk8L3BhZ2VzPjx2b2x1bWU+ODU8L3Zv
-bHVtZT48ZWRpdGlvbj4yMDI1MDcyMzwvZWRpdGlvbj48a2V5d29yZHM+PGtleXdvcmQ+SHVtYW5z
-PC9rZXl3b3JkPjxrZXl3b3JkPipCYXNpYy1MZXVjaW5lIFppcHBlciBUcmFuc2NyaXB0aW9uIEZh
-Y3RvcnMvZ2VuZXRpY3MvbWV0YWJvbGlzbS9hbnRhZ29uaXN0cyAmYW1wOzwva2V5d29yZD48a2V5
-d29yZD5pbmhpYml0b3JzPC9rZXl3b3JkPjxrZXl3b3JkPipMdW5nIE5lb3BsYXNtcy9nZW5ldGlj
-cy9tZXRhYm9saXNtL3BhdGhvbG9neS9kcnVnIHRoZXJhcHk8L2tleXdvcmQ+PGtleXdvcmQ+Q2Vs
-bCBMaW5lLCBUdW1vcjwva2V5d29yZD48a2V5d29yZD5HZW5lIEV4cHJlc3Npb24gUmVndWxhdGlv
-biwgTmVvcGxhc3RpYy9kcnVnIGVmZmVjdHM8L2tleXdvcmQ+PGtleXdvcmQ+TkYtRTItUmVsYXRl
-ZCBGYWN0b3IgMi9tZXRhYm9saXNtL2dlbmV0aWNzPC9rZXl3b3JkPjxrZXl3b3JkPipGYW5jb25p
-IEFuZW1pYSBDb21wbGVtZW50YXRpb24gR3JvdXAgUHJvdGVpbnMvZ2VuZXRpY3MvbWV0YWJvbGlz
-bTwva2V5d29yZD48a2V5d29yZD5CYWNoMTwva2V5d29yZD48a2V5d29yZD5HZW5lIHNpZ25hdHVy
-ZTwva2V5d29yZD48a2V5d29yZD5MdW5nIGNhbmNlcjwva2V5d29yZD48a2V5d29yZD5NZXRhc3Rh
-c2lzPC9rZXl3b3JkPjwva2V5d29yZHM+PGRhdGVzPjx5ZWFyPjIwMjU8L3llYXI+PHB1Yi1kYXRl
-cz48ZGF0ZT5TZXA8L2RhdGU+PC9wdWItZGF0ZXM+PC9kYXRlcz48aXNibj4yMjEzLTIzMTc8L2lz
-Ym4+PGFjY2Vzc2lvbi1udW0+NDA3MTYxNTI8L2FjY2Vzc2lvbi1udW0+PHVybHM+PC91cmxzPjxj
-dXN0b20xPkRlY2xhcmF0aW9uIG9mIGNvbXBldGluZyBpbnRlcmVzdCBOb25lLjwvY3VzdG9tMT48
-Y3VzdG9tMj5QTUMxMjMxNDMyODwvY3VzdG9tMj48ZWxlY3Ryb25pYy1yZXNvdXJjZS1udW0+MTAu
-MTAxNi9qLnJlZG94LjIwMjUuMTAzNzg5PC9lbGVjdHJvbmljLXJlc291cmNlLW51bT48cmVtb3Rl
-LWRhdGFiYXNlLXByb3ZpZGVyPk5MTTwvcmVtb3RlLWRhdGFiYXNlLXByb3ZpZGVyPjxsYW5ndWFn
-ZT5lbmc8L2xhbmd1YWdlPjwvcmVjb3JkPjwvQ2l0ZT48L0VuZE5vdGU+
-</w:fldData>
-        </w:fldChar>
-      </w:r>
-      <w:r>
-        <w:instrText xml:space="preserve"> ADDIN EN.CITE </w:instrText>
-      </w:r>
-      <w:r>
-        <w:fldChar w:fldCharType="begin">
-          <w:fldData xml:space="preserve">PEVuZE5vdGU+PENpdGU+PEF1dGhvcj5LbGVuamEtU2t1ZHJpbmphPC9BdXRob3I+PFllYXI+MjAy
-NTwvWWVhcj48UmVjTnVtPjYwPC9SZWNOdW0+PERpc3BsYXlUZXh0PjxzdHlsZSBmYWNlPSJzdXBl
-cnNjcmlwdCI+MTE8L3N0eWxlPjwvRGlzcGxheVRleHQ+PHJlY29yZD48cmVjLW51bWJlcj42MDwv
-cmVjLW51bWJlcj48Zm9yZWlnbi1rZXlzPjxrZXkgYXBwPSJFTiIgZGItaWQ9ImV0cHp3cnphYXpm
-ZnhmZWR4eGp4d3RwOHpzeDJ0cHZzdjVkMCIgdGltZXN0YW1wPSIxNzgwMzIzODE1Ij42MDwva2V5
-PjwvZm9yZWlnbi1rZXlzPjxyZWYtdHlwZSBuYW1lPSJKb3VybmFsIEFydGljbGUiPjE3PC9yZWYt
-dHlwZT48Y29udHJpYnV0b3JzPjxhdXRob3JzPjxhdXRob3I+S2xlbmphLVNrdWRyaW5qYSwgRC48
-L2F1dGhvcj48YXV0aG9yPkFsaSwgSy4gWC48L2F1dGhvcj48YXV0aG9yPldhbGtlciwgRC48L2F1
-dGhvcj48YXV0aG9yPkhpZ2dpbnMsIE0uPC9hdXRob3I+PGF1dGhvcj5QYXRlbCwgQS4gQS48L2F1
-dGhvcj48YXV0aG9yPlJhaiwgRC48L2F1dGhvcj48YXV0aG9yPkNyZWVsbWFuLCBBLjwvYXV0aG9y
-PjxhdXRob3I+TWNEb3dhbGwsIEMuPC9hdXRob3I+PGF1dGhvcj5UYXlsb3IsIEMuPC9hdXRob3I+
-PGF1dGhvcj5XZW50YSwgVC48L2F1dGhvcj48YXV0aG9yPkxhcnNzb24sIEUuPC9hdXRob3I+PGF1
-dGhvcj5XaWVsLCBDLjwvYXV0aG9yPjxhdXRob3I+U2F5aW4sIFYuIEkuPC9hdXRob3I+PGF1dGhv
-cj5kZSBsYSBWZWdhLCBMLjwvYXV0aG9yPjwvYXV0aG9ycz48L2NvbnRyaWJ1dG9ycz48YXV0aC1h
-ZGRyZXNzPkphY3F1aSBXb29kIENhbmNlciBDZW50cmUsIERpdmlzaW9uIG9mIENhbmNlciBSZXNl
-YXJjaCwgU2Nob29sIG9mIE1lZGljaW5lLCBVbml2ZXJzaXR5IG9mIER1bmRlZSwgVUsuJiN4RDtJ
-bnN0aXR1dGUgb2YgQ2xpbmljYWwgU2NpZW5jZXMsIERlcGFydG1lbnQgb2YgU3VyZ2VyeSwgU2Fo
-bGdyZW5za2EgQ2VudGVyIGZvciBDYW5jZXIgUmVzZWFyY2gsIFVuaXZlcnNpdHkgb2YgR290aGVu
-YnVyZywgR290aGVuYnVyZywgU3dlZGVuOyBXYWxsZW5iZXJnIENlbnRyZSBmb3IgTW9sZWN1bGFy
-IGFuZCBUcmFuc2xhdGlvbmFsIE1lZGljaW5lLCBVbml2ZXJzaXR5IG9mIEdvdGhlbmJ1cmcsIEdv
-dGhlbmJ1cmcsIFN3ZWRlbi4mI3hEO0RlcGFydG1lbnQgb2YgR2VuZXJhbCBhbmQgTWVkaWNhbCBC
-aW9jaGVtaXN0cnksIEZhY3VsdHkgb2YgQmlvbG9neSwgVW5pdmVyc2l0eSBvZiBHZGFuc2ssIFBv
-bGFuZC4mI3hEO0RlcGFydG1lbnQgb2YgTWVkaWNhbCBCaW9jaGVtaXN0cnkgYW5kIENlbGwgQmlv
-bG9neSwgSW5zdGl0dXRlIG9mIEJpb21lZGljaW5lLCBUaGUgU2FobGdyZW5za2EgQWNhZGVteSwg
-VW5pdmVyc2l0eSBvZiBHb3RoZW5idXJnLCBHb3RoZW5idXJnLCBTd2VkZW4uJiN4RDtJbnN0aXR1
-dGUgb2YgQ2xpbmljYWwgU2NpZW5jZXMsIERlcGFydG1lbnQgb2YgU3VyZ2VyeSwgU2FobGdyZW5z
-a2EgQ2VudGVyIGZvciBDYW5jZXIgUmVzZWFyY2gsIFVuaXZlcnNpdHkgb2YgR290aGVuYnVyZywg
-R290aGVuYnVyZywgU3dlZGVuOyBXYWxsZW5iZXJnIENlbnRyZSBmb3IgTW9sZWN1bGFyIGFuZCBU
-cmFuc2xhdGlvbmFsIE1lZGljaW5lLCBVbml2ZXJzaXR5IG9mIEdvdGhlbmJ1cmcsIEdvdGhlbmJ1
-cmcsIFN3ZWRlbi4gRWxlY3Ryb25pYyBhZGRyZXNzOiB2b2xrYW4uc2F5aW5AZ3Uuc2UuJiN4RDtK
-YWNxdWkgV29vZCBDYW5jZXIgQ2VudHJlLCBEaXZpc2lvbiBvZiBDYW5jZXIgUmVzZWFyY2gsIFNj
-aG9vbCBvZiBNZWRpY2luZSwgVW5pdmVyc2l0eSBvZiBEdW5kZWUsIFVLLiBFbGVjdHJvbmljIGFk
-ZHJlc3M6IGwuZGVsYXZlZ2FAZHVuZGVlLmFjLnVrLjwvYXV0aC1hZGRyZXNzPjx0aXRsZXM+PHRp
-dGxlPklkZW50aWZpY2F0aW9uIG9mIGEgQkFDSDEgbHVuZyBjYW5jZXIgc2lnbmF0dXJlOiBBIG5v
-dmVsIHRvb2wgZm9yIHVuZGVyc3RhbmRpbmcgQkFDSDEgYmlvbG9neSBhbmQgaWRlbnRpZnlpbmcg
-bmV3IGluaGliaXRvcnM8L3RpdGxlPjxzZWNvbmRhcnktdGl0bGU+UmVkb3ggQmlvbDwvc2Vjb25k
-YXJ5LXRpdGxlPjwvdGl0bGVzPjxwZXJpb2RpY2FsPjxmdWxsLXRpdGxlPlJlZG94IEJpb2w8L2Z1
-bGwtdGl0bGU+PC9wZXJpb2RpY2FsPjxwYWdlcz4xMDM3ODk8L3BhZ2VzPjx2b2x1bWU+ODU8L3Zv
-bHVtZT48ZWRpdGlvbj4yMDI1MDcyMzwvZWRpdGlvbj48a2V5d29yZHM+PGtleXdvcmQ+SHVtYW5z
-PC9rZXl3b3JkPjxrZXl3b3JkPipCYXNpYy1MZXVjaW5lIFppcHBlciBUcmFuc2NyaXB0aW9uIEZh
-Y3RvcnMvZ2VuZXRpY3MvbWV0YWJvbGlzbS9hbnRhZ29uaXN0cyAmYW1wOzwva2V5d29yZD48a2V5
-d29yZD5pbmhpYml0b3JzPC9rZXl3b3JkPjxrZXl3b3JkPipMdW5nIE5lb3BsYXNtcy9nZW5ldGlj
-cy9tZXRhYm9saXNtL3BhdGhvbG9neS9kcnVnIHRoZXJhcHk8L2tleXdvcmQ+PGtleXdvcmQ+Q2Vs
-bCBMaW5lLCBUdW1vcjwva2V5d29yZD48a2V5d29yZD5HZW5lIEV4cHJlc3Npb24gUmVndWxhdGlv
-biwgTmVvcGxhc3RpYy9kcnVnIGVmZmVjdHM8L2tleXdvcmQ+PGtleXdvcmQ+TkYtRTItUmVsYXRl
-ZCBGYWN0b3IgMi9tZXRhYm9saXNtL2dlbmV0aWNzPC9rZXl3b3JkPjxrZXl3b3JkPipGYW5jb25p
-IEFuZW1pYSBDb21wbGVtZW50YXRpb24gR3JvdXAgUHJvdGVpbnMvZ2VuZXRpY3MvbWV0YWJvbGlz
-bTwva2V5d29yZD48a2V5d29yZD5CYWNoMTwva2V5d29yZD48a2V5d29yZD5HZW5lIHNpZ25hdHVy
-ZTwva2V5d29yZD48a2V5d29yZD5MdW5nIGNhbmNlcjwva2V5d29yZD48a2V5d29yZD5NZXRhc3Rh
-c2lzPC9rZXl3b3JkPjwva2V5d29yZHM+PGRhdGVzPjx5ZWFyPjIwMjU8L3llYXI+PHB1Yi1kYXRl
-cz48ZGF0ZT5TZXA8L2RhdGU+PC9wdWItZGF0ZXM+PC9kYXRlcz48aXNibj4yMjEzLTIzMTc8L2lz
-Ym4+PGFjY2Vzc2lvbi1udW0+NDA3MTYxNTI8L2FjY2Vzc2lvbi1udW0+PHVybHM+PC91cmxzPjxj
-dXN0b20xPkRlY2xhcmF0aW9uIG9mIGNvbXBldGluZyBpbnRlcmVzdCBOb25lLjwvY3VzdG9tMT48
-Y3VzdG9tMj5QTUMxMjMxNDMyODwvY3VzdG9tMj48ZWxlY3Ryb25pYy1yZXNvdXJjZS1udW0+MTAu
-MTAxNi9qLnJlZG94LjIwMjUuMTAzNzg5PC9lbGVjdHJvbmljLXJlc291cmNlLW51bT48cmVtb3Rl
-LWRhdGFiYXNlLXByb3ZpZGVyPk5MTTwvcmVtb3RlLWRhdGFiYXNlLXByb3ZpZGVyPjxsYW5ndWFn
-ZT5lbmc8L2xhbmd1YWdlPjwvcmVjb3JkPjwvQ2l0ZT48L0VuZE5vdGU+
-</w:fldData>
-        </w:fldChar>
-      </w:r>
-      <w:r>
-        <w:instrText xml:space="preserve"> ADDIN EN.CITE.DATA </w:instrText>
-      </w:r>
-      <w:r>
-        <w:fldChar w:fldCharType="end"/>
-      </w:r>
-      <w:r>
-        <w:fldChar w:fldCharType="separate"/>
-      </w:r>
-      <w:r>
-        <w:rPr>
-          <w:noProof/>
-          <w:vertAlign w:val="superscript"/>
-        </w:rPr>
-        <w:t>11</w:t>
-      </w:r>
-      <w:r>
-        <w:fldChar w:fldCharType="end"/>
-      </w:r>
-      <w:r>
-        <w:t xml:space="preserve">. In our previous clinical and functional NSCLC study, </w:t>
-      </w:r>
-      <w:r>
-        <w:rPr>
-          <w:i/>
-        </w:rPr>
-        <w:t>BACH1</w:t>
-      </w:r>
-      <w:r>
-        <w:t xml:space="preserve"> expression showed context-dependent associations with disease stage and outcome; high </w:t>
-      </w:r>
-      <w:r>
-        <w:rPr>
-          <w:i/>
-        </w:rPr>
-        <w:t>BACH1</w:t>
-      </w:r>
-      <w:r>
-        <w:t xml:space="preserve"> expression was associated with shorter disease-free survival in lung adenocarcinoma, particularly among patients receiving adjuvant chemotherapy, while </w:t>
-      </w:r>
-      <w:r>
-        <w:rPr>
-          <w:i/>
-        </w:rPr>
-        <w:t>BACH1</w:t>
-      </w:r>
-      <w:r>
-        <w:t xml:space="preserve"> silencing enhanced cisplatin-induced cell death and reduced migration and clonogenic growth in NSCLC cells </w:t>
-      </w:r>
-      <w:r>
-        <w:fldChar w:fldCharType="begin"/>
-      </w:r>
-      <w:r>
-        <w:instrText xml:space="preserve"> ADDIN EN.CITE &lt;EndNote&gt;&lt;Cite&gt;&lt;Author&gt;Liu&lt;/Author&gt;&lt;Year&gt;2026&lt;/Year&gt;&lt;RecNum&gt;95&lt;/RecNum&gt;&lt;DisplayText&gt;&lt;style face="superscript"&gt;12&lt;/style&gt;&lt;/DisplayText&gt;&lt;record&gt;&lt;rec-number&gt;95&lt;/rec-number&gt;&lt;foreign-keys&gt;&lt;key app="EN" db-id="etpzwrzaazffxfedxxjxwtp8zsx2tpvsv5d0" timestamp="1786361836"&gt;95&lt;/key&gt;&lt;/foreign-keys&gt;&lt;ref-type name="Journal Article"&gt;17&lt;/ref-type&gt;&lt;contributors&gt;&lt;authors&gt;&lt;author&gt;Liu, J.&lt;/author&gt;&lt;author&gt;Schneider, M. A.&lt;/author&gt;&lt;author&gt;Held, J.&lt;/author&gt;&lt;author&gt;Wrenger, S.&lt;/author&gt;&lt;author&gt;Si, W.&lt;/author&gt;&lt;author&gt;Allgaeuer, M.&lt;/author&gt;&lt;author&gt;Eichhorn, F.&lt;/author&gt;&lt;author&gt;Janciauskiene, S.&lt;/author&gt;&lt;/authors&gt;&lt;/contributors&gt;&lt;auth-address&gt;Department of Respiratory Medicine and Infectious Diseases, Hannover Medical School, Hannover, Germany.&amp;#xD;German Center for Lung Research (DZL), Biomedical Research in Endstage and Obstructive Lung Disease Hannover (BREATH), Hannover, Germany.&amp;#xD;Department of Thoracic Surgery, Thoraxklinik at Heidelberg University Hospital, Heidelberg, Germany.&amp;#xD;Translational Lung Research Center Heidelberg (TLRC), Member of the German Center for Lung Research (DZL), Heidelberg, Germany.&amp;#xD;Institute of Pathology, University Hospital Heidelberg, Heidelberg, Germany.&lt;/auth-address&gt;&lt;titles&gt;&lt;title&gt;Clinical Relevance of BACH1 Expression in Non-Small Cell Lung Cancer&lt;/title&gt;&lt;secondary-title&gt;Int J Cancer&lt;/secondary-title&gt;&lt;/titles&gt;&lt;periodical&gt;&lt;full-title&gt;Int J Cancer&lt;/full-title&gt;&lt;/periodical&gt;&lt;edition&gt;20260726&lt;/edition&gt;&lt;keywords&gt;&lt;keyword&gt;Bach1&lt;/keyword&gt;&lt;keyword&gt;chemoresistance&lt;/keyword&gt;&lt;keyword&gt;lung adenocarcinoma&lt;/keyword&gt;&lt;keyword&gt;prognostic biomarker&lt;/keyword&gt;&lt;keyword&gt;siRNA knockdown&lt;/keyword&gt;&lt;/keywords&gt;&lt;dates&gt;&lt;year&gt;2026&lt;/year&gt;&lt;pub-dates&gt;&lt;date&gt;Jul 26&lt;/date&gt;&lt;/pub-dates&gt;&lt;/dates&gt;&lt;isbn&gt;0020-7136&lt;/isbn&gt;&lt;accession-num&gt;42503861&lt;/accession-num&gt;&lt;urls&gt;&lt;/urls&gt;&lt;electronic-resource-num&gt;10.1002/ijc.70673&lt;/electronic-resource-num&gt;&lt;remote-database-provider&gt;NLM&lt;/remote-database-provider&gt;&lt;language&gt;eng&lt;/language&gt;&lt;/record&gt;&lt;/Cite&gt;&lt;/EndNote&gt;</w:instrText>
-      </w:r>
-      <w:r>
-        <w:fldChar w:fldCharType="separate"/>
-      </w:r>
-      <w:r>
-        <w:rPr>
-          <w:noProof/>
-          <w:vertAlign w:val="superscript"/>
-        </w:rPr>
         <w:t>12</w:t>
       </w:r>
       <w:r>
-        <w:fldChar w:fldCharType="end"/>
-      </w:r>
-      <w:r>
-        <w:t xml:space="preserve">. These findings support the clinical and functional relevance of BACH1 in NSCLC and motivate analysis of the primary malignant epithelial states in which </w:t>
-      </w:r>
-      <w:r>
-        <w:rPr>
-          <w:i/>
-        </w:rPr>
-        <w:t>BACH1</w:t>
-      </w:r>
-      <w:r>
-        <w:t>-associated transcriptional signals occur.</w:t>
+        <w:rPr/>
+        <w:t>.</w:t>
       </w:r>
     </w:p>
     <w:p>
@@ -2778,376 +2029,7 @@
         </w:rPr>
       </w:pPr>
       <w:r>
-        <w:t xml:space="preserve">Bulk-tissue, cell-line and molecular assays have established important BACH1-associated mechanisms. Single-cell approaches now add resolution by mapping these signals to malignant epithelial contexts within primary tumours. Transcript abundance, TF signature scores and chromatin accessibility each </w:t>
-      </w:r>
-      <w:r>
-        <w:lastRenderedPageBreak/>
-        <w:t xml:space="preserve">capture different aspects of the biology. Integrating these layers can define the epithelial contexts in which BACH1-associated score signals occur and prioritize candidate regulatory features for follow-up </w:t>
-      </w:r>
-      <w:r>
-        <w:fldChar w:fldCharType="begin">
-          <w:fldData xml:space="preserve">PEVuZE5vdGU+PENpdGU+PEF1dGhvcj5TdW5kYXJhbTwvQXV0aG9yPjxZZWFyPjIwMjQ8L1llYXI+
-PFJlY051bT4xODY8L1JlY051bT48RGlzcGxheVRleHQ+PHN0eWxlIGZhY2U9InN1cGVyc2NyaXB0
-Ij4xMywgMTQ8L3N0eWxlPjwvRGlzcGxheVRleHQ+PHJlY29yZD48cmVjLW51bWJlcj4xODY8L3Jl
-Yy1udW1iZXI+PGZvcmVpZ24ta2V5cz48a2V5IGFwcD0iRU4iIGRiLWlkPSJldHB6d3J6YWF6ZmZ4
-ZmVkeHhqeHd0cDh6c3gydHB2c3Y1ZDAiIHRpbWVzdGFtcD0iMTc4NzMwMjAyMSI+MTg2PC9rZXk+
-PC9mb3JlaWduLWtleXM+PHJlZi10eXBlIG5hbWU9IkpvdXJuYWwgQXJ0aWNsZSI+MTc8L3JlZi10
-eXBlPjxjb250cmlidXRvcnM+PGF1dGhvcnM+PGF1dGhvcj5TdW5kYXJhbSwgTC48L2F1dGhvcj48
-YXV0aG9yPkt1bWFyLCBBLjwvYXV0aG9yPjxhdXRob3I+WmF0em1hbiwgTS48L2F1dGhvcj48YXV0
-aG9yPlNhbGNlZG8sIEEuPC9hdXRob3I+PGF1dGhvcj5SYXZpbmRyYSwgTi48L2F1dGhvcj48YXV0
-aG9yPlNoYW1zLCBTLjwvYXV0aG9yPjxhdXRob3I+TG91aWUsIEIuIEguPC9hdXRob3I+PGF1dGhv
-cj5CYWdkYXRsaSwgUy4gVC48L2F1dGhvcj48YXV0aG9yPk15ZXJzLCBNLiBBLjwvYXV0aG9yPjxh
-dXRob3I+U2FybWFzaGdoaSwgUy48L2F1dGhvcj48YXV0aG9yPkNob2ksIEguIFkuPC9hdXRob3I+
-PGF1dGhvcj5DaG9pLCBXLiBZLjwvYXV0aG9yPjxhdXRob3I+WW9zdCwgSy4gRS48L2F1dGhvcj48
-YXV0aG9yPlpoYW8sIFkuPC9hdXRob3I+PGF1dGhvcj5HcmFuamEsIEouIE0uPC9hdXRob3I+PGF1
-dGhvcj5IaW5vdWUsIFQuPC9hdXRob3I+PGF1dGhvcj5IYXllcywgRC4gTi48L2F1dGhvcj48YXV0
-aG9yPkNoZXJuaWFjaywgQS48L2F1dGhvcj48YXV0aG9yPkZlbGF1LCBJLjwvYXV0aG9yPjxhdXRo
-b3I+Q2hvdWRocnksIEguPC9hdXRob3I+PGF1dGhvcj5aZW5rbHVzZW4sIEouIEMuPC9hdXRob3I+
-PGF1dGhvcj5GYXJoLCBLLiBLLjwvYXV0aG9yPjxhdXRob3I+TWNQaGVyc29uLCBBLjwvYXV0aG9y
-PjxhdXRob3I+Q3VydGlzLCBDLjwvYXV0aG9yPjxhdXRob3I+TGFpcmQsIFAuIFcuPC9hdXRob3I+
-PGF1dGhvcj5EZW1jaG9rLCBKLiBBLjwvYXV0aG9yPjxhdXRob3I+WWFuZywgTC48L2F1dGhvcj48
-YXV0aG9yPlRhcm51enplciwgUi48L2F1dGhvcj48YXV0aG9yPkNhZXNhci1Kb2huc29uLCBTLiBK
-LjwvYXV0aG9yPjxhdXRob3I+V2FuZywgWi48L2F1dGhvcj48YXV0aG9yPkRvYW5lLCBBLiBTLjwv
-YXV0aG9yPjxhdXRob3I+S2h1cmFuYSwgRS48L2F1dGhvcj48YXV0aG9yPkNhc3RybywgTS4gQS4g
-QS48L2F1dGhvcj48YXV0aG9yPkxhemFyLCBBLiBKLjwvYXV0aG9yPjxhdXRob3I+QnJvb20sIEIu
-IE0uPC9hdXRob3I+PGF1dGhvcj5XZWluc3RlaW4sIEouIE4uPC9hdXRob3I+PGF1dGhvcj5Ba2Jh
-bmksIFIuPC9hdXRob3I+PGF1dGhvcj5LdW1hciwgUy4gVi48L2F1dGhvcj48YXV0aG9yPlJhcGhh
-ZWwsIEIuIEouPC9hdXRob3I+PGF1dGhvcj5Xb25nLCBDLiBLLjwvYXV0aG9yPjxhdXRob3I+U3R1
-YXJ0LCBKLiBNLjwvYXV0aG9yPjxhdXRob3I+U2FmYXZpLCBSLjwvYXV0aG9yPjxhdXRob3I+QmVu
-eiwgQy4gQy48L2F1dGhvcj48YXV0aG9yPkpvaG5zb24sIEIuIEsuPC9hdXRob3I+PGF1dGhvcj5L
-eWksIEMuPC9hdXRob3I+PGF1dGhvcj5TaGVuLCBILjwvYXV0aG9yPjxhdXRob3I+Q29yY2VzLCBN
-LiBSLjwvYXV0aG9yPjxhdXRob3I+Q2hhbmcsIEguIFkuPC9hdXRob3I+PGF1dGhvcj5HcmVlbmxl
-YWYsIFcuIEouPC9hdXRob3I+PC9hdXRob3JzPjwvY29udHJpYnV0b3JzPjxhdXRoLWFkZHJlc3M+
-RGVwYXJ0bWVudCBvZiBHZW5ldGljcywgU3RhbmZvcmQgVW5pdmVyc2l0eSBTY2hvb2wgb2YgTWVk
-aWNpbmUsIFN0YW5mb3JkLCBDQSwgVVNBLiYjeEQ7RGVwYXJ0bWVudCBvZiBDb21wdXRlciBTY2ll
-bmNlLCBTdGFuZm9yZCBVbml2ZXJzaXR5LCBTdGFuZm9yZCwgQ0EsIFVTQS4mI3hEO0lsbHVtaW5h
-IEFJIGxhYm9yYXRvcnksIElsbHVtaW5hIEluYywgRm9zdGVyIENpdHksIENBLCBVU0EuJiN4RDtO
-VklESUEgQmlvIFJlc2VhcmNoLCBOVklESUEsIFNhbnRhIENsYXJhLCBDQSwgVVNBLiYjeEQ7Q29t
-cHV0YXRpb25hbCBPbmNvbG9neSwgRGVwYXJ0bWVudCBvZiBFcGlkZW1pb2xvZ3kgYW5kIEJpb3N0
-YXRpc3RpY3MsIE1lbW9yaWFsIFNsb2FuIEtldHRlcmluZyBDYW5jZXIgQ2VudGVyLCBOZXcgWW9y
-aywgTlksIFVTQS4mI3hEO0RlcGFydG1lbnQgb2YgRGVybWF0b2xvZ3ksIFN0YW5mb3JkIFVuaXZl
-cnNpdHkgU2Nob29sIG9mIE1lZGljaW5lLCBTdGFuZm9yZCwgQ0EsIFVTQS4mI3hEO0NlbnRlciBm
-b3IgUGVyc29uYWwgRHluYW1pYyBSZWd1bG9tZXMsIFN0YW5mb3JkIFVuaXZlcnNpdHksIFN0YW5m
-b3JkLCBDQSA5NDMwNSwgVVNBLiYjeEQ7QnJvYWQgSW5zdGl0dXRlIG9mIE1JVCBhbmQgSGFydmFy
-ZCwgQ2FtYnJpZGdlLCBNQSwgVVNBLiYjeEQ7RGVwYXJ0bWVudCBvZiBQcmV2ZW50aXZlIE1lZGlj
-aW5lLCBVbml2ZXJzaXR5IG9mIFRlbm5lc3NlZSBIZWFsdGggU2NpZW5jZSBDZW50ZXIsIE1lbXBo
-aXMsIFROLCBVU0EuJiN4RDtEZXBhcnRtZW50IG9mIE1lZGljaW5lLCBVbml2ZXJzaXR5IG9mIFRl
-bm5lc3NlZSBIZWFsdGggU2NpZW5jZSBDZW50ZXIsIE1lbXBoaXMsIFROLCBVU0EuJiN4RDtVVEhT
-QyBDZW50ZXIgZm9yIENhbmNlciBSZXNlYXJjaCwgVW5pdmVyc2l0eSBvZiBUZW5uZXNzZWUgSGVh
-bHRoIFNjaWVuY2UgQ2VudGVyLCBNZW1waGlzLCBUTiwgVVNBLiYjeEQ7Q2VudGVyIGZvciBFcGln
-ZW5ldGljcywgVmFuIEFuZGVsIEluc3RpdHV0ZSwgR3JhbmQgUmFwaWRzLCBNSSA0OTUwMywgVVNB
-LiYjeEQ7TmF0aW9uYWwgQ2FuY2VyIEluc3RpdHV0ZSwgTmF0aW9uYWwgSW5zdGl0dXRlcyBvZiBI
-ZWFsdGgsIEJldGhlc2RhLCBNRCAyMDg5MiwgVVNBLiYjeEQ7RGVwYXJ0bWVudCBvZiBCaW9jaGVt
-aXN0cnksIEZhY3VsdHkgb2YgU2NpZW5jZSwgQ2FuY2VyIGFuZCBNdXRhZ2VuZXNpcyBVbml0LCBL
-aW5nIEZhaGQgQ2VudGVyIGZvciBNZWRpY2FsIFJlc2VhcmNoLCBLaW5nIEFiZHVsYXppeiBVbml2
-ZXJzaXR5LCBKZWRkYWgsIFNhdWRpIEFyYWJpYS4mI3hEO0RlcGFydG1lbnQgb2YgTWVkaWNpbmUs
-IFN0YW5mb3JkIFVuaXZlcnNpdHkgU2Nob29sIG9mIE1lZGljaW5lLCBTdGFuZm9yZCwgQ0EsIFVT
-QS4mI3hEO0RlcGFydG1lbnQgb2YgQmlvbWVkaWNhbCBEYXRhIFNjaWVuY2UsIFN0YW5mb3JkIFVu
-aXZlcnNpdHkgU2Nob29sIG9mIE1lZGljaW5lLCBTdGFuZm9yZCwgQ0EsIFVTQS4mI3hEO0NoYW4g
-WnVja2VyYmVyZyBCaW9odWIsIFNhbiBGcmFuY2lzY28sIENBLCBVU0EuJiN4RDtDZW50ZXIgZm9y
-IENhbmNlciBHZW5vbWljcywgTmF0aW9uYWwgQ2FuY2VyIEluc3RpdHV0ZSwgQmV0aGVzZGEsIE1E
-IDIwODkyLCBVU0EuJiN4RDtDZW50ZXIgZm9yIEJpb21lZGljYWwgSW5mb3JtYXRpY3MgYW5kIElu
-Zm9ybWF0aW9uIFRlY2hub2xvZ3ksIE5hdGlvbmFsIENhbmNlciBJbnN0aXR1dGUsIE5JSCwgOTYw
-OSBNZWRpY2FsIENlbnRlciBEcml2ZSwgUm9ja3ZpbGxlLCBNRCAyMDg1MCwgVVNBLiYjeEQ7SW5z
-dGl0dXRlIGZvciBDb21wdXRhdGlvbmFsIEJpb21lZGljaW5lLCBXZWlsbCBDb3JuZWxsIE1lZGlj
-aW5lLCBOZXcgWW9yaywgTlkgMTAwNjUsIFVTQS4mI3hEO1NhbmRyYSBhbmQgRWR3YXJkIE1leWVy
-IENhbmNlciBDZW50ZXIsIFdlaWxsIENvcm5lbGwgTWVkaWNpbmUsIE5ldyBZb3JrLCBOWSAxMDA2
-NSwgVVNBLiYjeEQ7RGVwYXJ0bWVudCBvZiBQaHlzaW9sb2d5IGFuZCBCaW9waHlzaWNzLCBXZWls
-bCBDb3JuZWxsIE1lZGljaW5lLCBOZXcgWW9yaywgTlkgMTAwNjUsIFVTQS4mI3hEO0VuZ2xhbmRl
-ciBJbnN0aXR1dGUgZm9yIFByZWNpc2lvbiBNZWRpY2luZSwgV2VpbGwgQ29ybmVsbCBNZWRpY2lu
-ZSwgTmV3IFlvcmssIE5ZIDEwMDY1LCBVU0EuJiN4RDtCaW9pbmZvcm1hdGljcyBhbmQgU3lzdGVt
-cyBCaW9sb2d5IExhYm9yYXRvcnksIEZlZGVyYWwgVW5pdmVyc2l0eSBvZiBQYXJhbsOhLCBDdXJp
-dGliYSA4MTUyMC0yNjAsIEJyYXppbC4mI3hEO0RlcGFydG1lbnRzIG9mIFBhdGhvbG9neSAmYW1w
-OyBHZW5vbWljIE1lZGljaW5lLCBUaGUgVW5pdmVyc2l0eSBvZiBUZXhhcyBNRCBBbmRlcnNvbiBD
-YW5jZXIgQ2VudGVyLCBIb3VzdG9uLCBUWCwgVVNBLiYjeEQ7RGVwYXJ0bWVudCBvZiBCaW9pbmZv
-cm1hdGljcyBhbmQgQ29tcHV0YXRpb25hbCBCaW9sb2d5LCBUaGUgVW5pdmVyc2l0eSBvZiBUZXhh
-cyBNRCBBbmRlcnNvbiBDYW5jZXIgQ2VudGVyLCBIb3VzdG9uLCBUWCA3NzAzMCwgVVNBLiYjeEQ7
-RGVwYXJ0bWVudCBvZiBTeXN0ZW1zIEJpb2xvZ3ksIFVuaXZlcnNpdHkgb2YgVGV4YXMgTUQgQW5k
-ZXJzb24gQ2FuY2VyIENlbnRlciwgSG91c3RvbiwgVFggNzcwMzAuJiN4RDtEZXBhcnRtZW50IG9m
-IENvbXB1dGVyIFNjaWVuY2UsIFByaW5jZXRvbiBVbml2ZXJzaXR5LCAzNSBPbGRlbiBTdHJlZXQs
-IFByaW5jZXRvbiwgTkogMDg1NDAuJiN4RDtCaW9tb2xlY3VsYXIgRW5naW5lZXJpbmcgRGVwYXJ0
-bWVudCwgU2Nob29sIG9mIEVuZ2luZWVyaW5nLCBVbml2ZXJzaXR5IG9mIENhbGlmb3JuaWEsIFNh
-bnRhIENydXosIFNhbnRhIENydXosIENBIDk1MDY0LCBVU0EuJiN4RDtCdWNrIEluc3RpdHV0ZSBm
-b3IgUmVzZWFyY2ggb24gQWdpbmcsIE5vdmF0bywgQ0EgOTQ5NDUsIFVTQS4mI3hEO0dsYWRzdG9u
-ZSBJbnN0aXR1dGUgb2YgTmV1cm9sb2dpY2FsIERpc2Vhc2UsIEdsYWRzdG9uZSBJbnN0aXR1dGVz
-LCBTYW4gRnJhbmNpc2NvLCBDQSwgVVNBLiYjeEQ7R2xhZHN0b25lIEluc3RpdHV0ZSBvZiBEYXRh
-IFNjaWVuY2UgYW5kIEJpb3RlY2hub2xvZ3ksIEdsYWRzdG9uZSBJbnN0aXR1dGVzLCBTYW4gRnJh
-bmNpc2NvLCBDQSwgVVNBLiYjeEQ7RGVwYXJ0bWVudCBvZiBOZXVyb2xvZ3ksIFVuaXZlcnNpdHkg
-b2YgQ2FsaWZvcm5pYSBTYW4gRnJhbmNpc2NvLCBTYW4gRnJhbmNpc2NvLCBDQSwgVVNBLiYjeEQ7
-SG93YXJkIEh1Z2hlcyBNZWRpY2FsIEluc3RpdHV0ZSwgU3RhbmZvcmQgVW5pdmVyc2l0eSwgU2No
-b29sIG9mIE1lZGljaW5lLCBTdGFuZm9yZCwgQ0EsIFVTQS4mI3hEO0RlcGFydG1lbnQgb2YgQXBw
-bGllZCBQaHlzaWNzLCBTdGFuZm9yZCBVbml2ZXJzaXR5LCBTdGFuZm9yZCwgQ0EsIFVTQS48L2F1
-dGgtYWRkcmVzcz48dGl0bGVzPjx0aXRsZT5TaW5nbGUtY2VsbCBjaHJvbWF0aW4gYWNjZXNzaWJp
-bGl0eSByZXZlYWxzIG1hbGlnbmFudCByZWd1bGF0b3J5IHByb2dyYW1zIGluIHByaW1hcnkgaHVt
-YW4gY2FuY2VyczwvdGl0bGU+PHNlY29uZGFyeS10aXRsZT5TY2llbmNlPC9zZWNvbmRhcnktdGl0
-bGU+PC90aXRsZXM+PHBlcmlvZGljYWw+PGZ1bGwtdGl0bGU+U2NpZW5jZTwvZnVsbC10aXRsZT48
-L3BlcmlvZGljYWw+PHBhZ2VzPmVhZGs5MjE3PC9wYWdlcz48dm9sdW1lPjM4NTwvdm9sdW1lPjxu
-dW1iZXI+NjcxMzwvbnVtYmVyPjxlZGl0aW9uPjIwMjQwOTA2PC9lZGl0aW9uPjxrZXl3b3Jkcz48
-a2V5d29yZD5IdW1hbnM8L2tleXdvcmQ+PGtleXdvcmQ+KkNocm9tYXRpbi9tZXRhYm9saXNtL2dl
-bmV0aWNzPC9rZXl3b3JkPjxrZXl3b3JkPipTaW5nbGUtQ2VsbCBBbmFseXNpczwva2V5d29yZD48
-a2V5d29yZD4qTmVvcGxhc21zL2dlbmV0aWNzPC9rZXl3b3JkPjxrZXl3b3JkPipHZW5lIEV4cHJl
-c3Npb24gUmVndWxhdGlvbiwgTmVvcGxhc3RpYzwva2V5d29yZD48a2V5d29yZD5OZXVyYWwgTmV0
-d29ya3MsIENvbXB1dGVyPC9rZXl3b3JkPjxrZXl3b3JkPk11dGF0aW9uPC9rZXl3b3JkPjxrZXl3
-b3JkPkROQSBDb3B5IE51bWJlciBWYXJpYXRpb25zPC9rZXl3b3JkPjxrZXl3b3JkPkJyZWFzdCBO
-ZW9wbGFzbXMvZ2VuZXRpY3MvcGF0aG9sb2d5PC9rZXl3b3JkPjwva2V5d29yZHM+PGRhdGVzPjx5
-ZWFyPjIwMjQ8L3llYXI+PHB1Yi1kYXRlcz48ZGF0ZT5TZXAgNjwvZGF0ZT48L3B1Yi1kYXRlcz48
-L2RhdGVzPjxpc2JuPjAwMzYtODA3NSAoUHJpbnQpJiN4RDswMDM2LTgwNzU8L2lzYm4+PGFjY2Vz
-c2lvbi1udW0+MzkyMzYxNjk8L2FjY2Vzc2lvbi1udW0+PHVybHM+PC91cmxzPjxjdXN0b20xPkNv
-bXBldGluZyBJbnRlcmVzdHMgV0pHIGFuZCBIWUMgYXJlIG5hbWVkIGFzIGFuIGludmVudG9yIG9u
-IHBhdGVudHMgZGVzY3JpYmluZyBBVEFDLXNlcSBtZXRob2RzLiAxMHggR2Vub21pY3MgaGFzIGxp
-Y2Vuc2VkIGludGVsbGVjdHVhbCBwcm9wZXJ0eSBvbiB3aGljaCBXSkcgYW5kIEhZQyBhcmUgbGlz
-dGVkIGFzIGludmVudG9ycy4gV0pHIGhvbGRzIG9wdGlvbnMgaW4gMTB4IEdlbm9taWNzIGFuZCBp
-cyBhIGNvbnN1bHRhbnQgZm9yIFVsdGltYSBHZW5vbWljcyBhbmQgR3VhcmRhbnQgSGVhbHRoLiBX
-SkcgaXMgYSBzY2llbnRpZmljIGNvLWZvdW5kZXIgb2YgUHJvdGlsbGlvbiBCaW9zY2llbmNlcy4g
-QUsgYW5kIEtGIGFyZSBlbXBsb3llZXMgb2YgSWxsdW1pbmEuIExTLCBOR1IgYW5kIEFTIHdlcmUg
-ZW1wbG95ZWVzIG9mIElsbHVtaW5hLiBMUyBpcyBjdXJyZW50bHkgYW4gZW1wbG95ZWUgb2YgTlZJ
-RElBLiBUaGUgb3RoZXIgYXV0aG9ycyBkZWNsYXJlIG5vIGNvbXBldGluZyBpbnRlcmVzdHMuIEFD
-IGhhcyBSZXNlYXJjaCBmdW5kaW5nIGZyb20gQmF5ZXIgYW5kIGlzIGNvbnN1bHRhbnQgZm9yIEJp
-cmRzRXllIEJpby4gUFdMIGlzIGEgU0FCIGJyb2FkIG1lbWJlciBmb3IgVGFnb21pY3MsIExMQywg
-Rk9YTyBUZWNobm9sb2dpZXMsIGFuZCBBbmNob3JEWC48L2N1c3RvbTE+PGN1c3RvbTI+UE1DMTIy
-ODkzNDY8L2N1c3RvbTI+PGN1c3RvbTY+TklITVMyMDk0ODE4PC9jdXN0b202PjxlbGVjdHJvbmlj
-LXJlc291cmNlLW51bT4xMC4xMTI2L3NjaWVuY2UuYWRrOTIxNzwvZWxlY3Ryb25pYy1yZXNvdXJj
-ZS1udW0+PHJlbW90ZS1kYXRhYmFzZS1wcm92aWRlcj5OTE08L3JlbW90ZS1kYXRhYmFzZS1wcm92
-aWRlcj48bGFuZ3VhZ2U+ZW5nPC9sYW5ndWFnZT48L3JlY29yZD48L0NpdGU+PENpdGU+PEF1dGhv
-cj5WYW4gZGUgU2FuZGU8L0F1dGhvcj48WWVhcj4yMDIwPC9ZZWFyPjxSZWNOdW0+MTg4PC9SZWNO
-dW0+PHJlY29yZD48cmVjLW51bWJlcj4xODg8L3JlYy1udW1iZXI+PGZvcmVpZ24ta2V5cz48a2V5
-IGFwcD0iRU4iIGRiLWlkPSJldHB6d3J6YWF6ZmZ4ZmVkeHhqeHd0cDh6c3gydHB2c3Y1ZDAiIHRp
-bWVzdGFtcD0iMTc4NzMwMjA5MCI+MTg4PC9rZXk+PC9mb3JlaWduLWtleXM+PHJlZi10eXBlIG5h
-bWU9IkpvdXJuYWwgQXJ0aWNsZSI+MTc8L3JlZi10eXBlPjxjb250cmlidXRvcnM+PGF1dGhvcnM+
-PGF1dGhvcj5WYW4gZGUgU2FuZGUsIEIuPC9hdXRob3I+PGF1dGhvcj5GbGVyaW4sIEMuPC9hdXRo
-b3I+PGF1dGhvcj5EYXZpZSwgSy48L2F1dGhvcj48YXV0aG9yPkRlIFdhZWdlbmVlciwgTS48L2F1
-dGhvcj48YXV0aG9yPkh1bHNlbG1hbnMsIEcuPC9hdXRob3I+PGF1dGhvcj5BaWJhciwgUy48L2F1
-dGhvcj48YXV0aG9yPlNldXJpbmNrLCBSLjwvYXV0aG9yPjxhdXRob3I+U2FlbGVucywgVy48L2F1
-dGhvcj48YXV0aG9yPkNhbm5vb2R0LCBSLjwvYXV0aG9yPjxhdXRob3I+Um91Y2hvbiwgUS48L2F1
-dGhvcj48YXV0aG9yPlZlcmJlaXJlbiwgVC48L2F1dGhvcj48YXV0aG9yPkRlIE1hZXllciwgRC48
-L2F1dGhvcj48YXV0aG9yPlJldW1lcnMsIEouPC9hdXRob3I+PGF1dGhvcj5TYWV5cywgWS48L2F1
-dGhvcj48YXV0aG9yPkFlcnRzLCBTLjwvYXV0aG9yPjwvYXV0aG9ycz48L2NvbnRyaWJ1dG9ycz48
-YXV0aC1hZGRyZXNzPlZJQiBDZW50ZXIgZm9yIEJyYWluICZhbXA7IERpc2Vhc2UgUmVzZWFyY2gs
-IEtVIExldXZlbiwgTGV1dmVuLCBCZWxnaXVtLiYjeEQ7RGVwYXJ0bWVudCBvZiBIdW1hbiBHZW5l
-dGljcywgS1UgTGV1dmVuLCBMZXV2ZW4sIEJlbGdpdW0uJiN4RDtEYXRhIE1pbmluZyBhbmQgTW9k
-ZWxsaW5nIGZvciBCaW9tZWRpY2luZSwgVklCIENlbnRlciBmb3IgSW5mbGFtbWF0aW9uIFJlc2Vh
-cmNoLCBHaGVudCwgQmVsZ2l1bS4mI3hEO0RlcGFydG1lbnQgb2YgQXBwbGllZCBNYXRoZW1hdGlj
-cywgQ29tcHV0ZXIgU2NpZW5jZSBhbmQgU3RhdGlzdGljcywgR2hlbnQgVW5pdmVyc2l0eSwgR2hl
-bnQsIEJlbGdpdW0uJiN4RDtDZW50ZXIgZm9yIE1lZGljYWwgR2VuZXRpY3MsIEdoZW50IFVuaXZl
-cnNpdHkgSG9zcGl0YWwsIEdoZW50LCBCZWxnaXVtLiYjeEQ7SmFuc3NlbiBQaGFybWFjZXV0aWNh
-LCBCZWVyc2UsIEJlbGdpdW0uJiN4RDtEYXRhIEludHVpdGl2ZSwgR2hlbnQsIEJlbGdpdW0uJiN4
-RDtWSUIgQ2VudGVyIGZvciBCcmFpbiAmYW1wOyBEaXNlYXNlIFJlc2VhcmNoLCBLVSBMZXV2ZW4s
-IExldXZlbiwgQmVsZ2l1bS4gc3RlaW4uYWVydHNAa3VsZXV2ZW4udmliLmJlLiYjeEQ7RGVwYXJ0
-bWVudCBvZiBIdW1hbiBHZW5ldGljcywgS1UgTGV1dmVuLCBMZXV2ZW4sIEJlbGdpdW0uIHN0ZWlu
-LmFlcnRzQGt1bGV1dmVuLnZpYi5iZS48L2F1dGgtYWRkcmVzcz48dGl0bGVzPjx0aXRsZT5BIHNj
-YWxhYmxlIFNDRU5JQyB3b3JrZmxvdyBmb3Igc2luZ2xlLWNlbGwgZ2VuZSByZWd1bGF0b3J5IG5l
-dHdvcmsgYW5hbHlzaXM8L3RpdGxlPjxzZWNvbmRhcnktdGl0bGU+TmF0IFByb3RvYzwvc2Vjb25k
-YXJ5LXRpdGxlPjwvdGl0bGVzPjxwZXJpb2RpY2FsPjxmdWxsLXRpdGxlPk5hdCBQcm90b2M8L2Z1
-bGwtdGl0bGU+PC9wZXJpb2RpY2FsPjxwYWdlcz4yMjQ3LTIyNzY8L3BhZ2VzPjx2b2x1bWU+MTU8
-L3ZvbHVtZT48bnVtYmVyPjc8L251bWJlcj48ZWRpdGlvbj4yMDIwMDYxOTwvZWRpdGlvbj48a2V5
-d29yZHM+PGtleXdvcmQ+QW5pbWFsczwva2V5d29yZD48a2V5d29yZD5DZWxsIExpbmUsIFR1bW9y
-PC9rZXl3b3JkPjxrZXl3b3JkPipHZW5lIFJlZ3VsYXRvcnkgTmV0d29ya3M8L2tleXdvcmQ+PGtl
-eXdvcmQ+SHVtYW5zPC9rZXl3b3JkPjxrZXl3b3JkPk1pY2U8L2tleXdvcmQ+PGtleXdvcmQ+U2lu
-Z2xlLUNlbGwgQW5hbHlzaXMvKm1ldGhvZHM8L2tleXdvcmQ+PGtleXdvcmQ+KldvcmtmbG93PC9r
-ZXl3b3JkPjwva2V5d29yZHM+PGRhdGVzPjx5ZWFyPjIwMjA8L3llYXI+PHB1Yi1kYXRlcz48ZGF0
-ZT5KdWw8L2RhdGU+PC9wdWItZGF0ZXM+PC9kYXRlcz48aXNibj4xNzUwLTI3OTk8L2lzYm4+PGFj
-Y2Vzc2lvbi1udW0+MzI1NjE4ODg8L2FjY2Vzc2lvbi1udW0+PHVybHM+PC91cmxzPjxlbGVjdHJv
-bmljLXJlc291cmNlLW51bT4xMC4xMDM4L3M0MTU5Ni0wMjAtMDMzNi0yPC9lbGVjdHJvbmljLXJl
-c291cmNlLW51bT48cmVtb3RlLWRhdGFiYXNlLXByb3ZpZGVyPk5MTTwvcmVtb3RlLWRhdGFiYXNl
-LXByb3ZpZGVyPjxsYW5ndWFnZT5lbmc8L2xhbmd1YWdlPjwvcmVjb3JkPjwvQ2l0ZT48L0VuZE5v
-dGU+AG==
-</w:fldData>
-        </w:fldChar>
-      </w:r>
-      <w:r>
-        <w:instrText xml:space="preserve"> ADDIN EN.CITE </w:instrText>
-      </w:r>
-      <w:r>
-        <w:fldChar w:fldCharType="begin">
-          <w:fldData xml:space="preserve">PEVuZE5vdGU+PENpdGU+PEF1dGhvcj5TdW5kYXJhbTwvQXV0aG9yPjxZZWFyPjIwMjQ8L1llYXI+
-PFJlY051bT4xODY8L1JlY051bT48RGlzcGxheVRleHQ+PHN0eWxlIGZhY2U9InN1cGVyc2NyaXB0
-Ij4xMywgMTQ8L3N0eWxlPjwvRGlzcGxheVRleHQ+PHJlY29yZD48cmVjLW51bWJlcj4xODY8L3Jl
-Yy1udW1iZXI+PGZvcmVpZ24ta2V5cz48a2V5IGFwcD0iRU4iIGRiLWlkPSJldHB6d3J6YWF6ZmZ4
-ZmVkeHhqeHd0cDh6c3gydHB2c3Y1ZDAiIHRpbWVzdGFtcD0iMTc4NzMwMjAyMSI+MTg2PC9rZXk+
-PC9mb3JlaWduLWtleXM+PHJlZi10eXBlIG5hbWU9IkpvdXJuYWwgQXJ0aWNsZSI+MTc8L3JlZi10
-eXBlPjxjb250cmlidXRvcnM+PGF1dGhvcnM+PGF1dGhvcj5TdW5kYXJhbSwgTC48L2F1dGhvcj48
-YXV0aG9yPkt1bWFyLCBBLjwvYXV0aG9yPjxhdXRob3I+WmF0em1hbiwgTS48L2F1dGhvcj48YXV0
-aG9yPlNhbGNlZG8sIEEuPC9hdXRob3I+PGF1dGhvcj5SYXZpbmRyYSwgTi48L2F1dGhvcj48YXV0
-aG9yPlNoYW1zLCBTLjwvYXV0aG9yPjxhdXRob3I+TG91aWUsIEIuIEguPC9hdXRob3I+PGF1dGhv
-cj5CYWdkYXRsaSwgUy4gVC48L2F1dGhvcj48YXV0aG9yPk15ZXJzLCBNLiBBLjwvYXV0aG9yPjxh
-dXRob3I+U2FybWFzaGdoaSwgUy48L2F1dGhvcj48YXV0aG9yPkNob2ksIEguIFkuPC9hdXRob3I+
-PGF1dGhvcj5DaG9pLCBXLiBZLjwvYXV0aG9yPjxhdXRob3I+WW9zdCwgSy4gRS48L2F1dGhvcj48
-YXV0aG9yPlpoYW8sIFkuPC9hdXRob3I+PGF1dGhvcj5HcmFuamEsIEouIE0uPC9hdXRob3I+PGF1
-dGhvcj5IaW5vdWUsIFQuPC9hdXRob3I+PGF1dGhvcj5IYXllcywgRC4gTi48L2F1dGhvcj48YXV0
-aG9yPkNoZXJuaWFjaywgQS48L2F1dGhvcj48YXV0aG9yPkZlbGF1LCBJLjwvYXV0aG9yPjxhdXRo
-b3I+Q2hvdWRocnksIEguPC9hdXRob3I+PGF1dGhvcj5aZW5rbHVzZW4sIEouIEMuPC9hdXRob3I+
-PGF1dGhvcj5GYXJoLCBLLiBLLjwvYXV0aG9yPjxhdXRob3I+TWNQaGVyc29uLCBBLjwvYXV0aG9y
-PjxhdXRob3I+Q3VydGlzLCBDLjwvYXV0aG9yPjxhdXRob3I+TGFpcmQsIFAuIFcuPC9hdXRob3I+
-PGF1dGhvcj5EZW1jaG9rLCBKLiBBLjwvYXV0aG9yPjxhdXRob3I+WWFuZywgTC48L2F1dGhvcj48
-YXV0aG9yPlRhcm51enplciwgUi48L2F1dGhvcj48YXV0aG9yPkNhZXNhci1Kb2huc29uLCBTLiBK
-LjwvYXV0aG9yPjxhdXRob3I+V2FuZywgWi48L2F1dGhvcj48YXV0aG9yPkRvYW5lLCBBLiBTLjwv
-YXV0aG9yPjxhdXRob3I+S2h1cmFuYSwgRS48L2F1dGhvcj48YXV0aG9yPkNhc3RybywgTS4gQS4g
-QS48L2F1dGhvcj48YXV0aG9yPkxhemFyLCBBLiBKLjwvYXV0aG9yPjxhdXRob3I+QnJvb20sIEIu
-IE0uPC9hdXRob3I+PGF1dGhvcj5XZWluc3RlaW4sIEouIE4uPC9hdXRob3I+PGF1dGhvcj5Ba2Jh
-bmksIFIuPC9hdXRob3I+PGF1dGhvcj5LdW1hciwgUy4gVi48L2F1dGhvcj48YXV0aG9yPlJhcGhh
-ZWwsIEIuIEouPC9hdXRob3I+PGF1dGhvcj5Xb25nLCBDLiBLLjwvYXV0aG9yPjxhdXRob3I+U3R1
-YXJ0LCBKLiBNLjwvYXV0aG9yPjxhdXRob3I+U2FmYXZpLCBSLjwvYXV0aG9yPjxhdXRob3I+QmVu
-eiwgQy4gQy48L2F1dGhvcj48YXV0aG9yPkpvaG5zb24sIEIuIEsuPC9hdXRob3I+PGF1dGhvcj5L
-eWksIEMuPC9hdXRob3I+PGF1dGhvcj5TaGVuLCBILjwvYXV0aG9yPjxhdXRob3I+Q29yY2VzLCBN
-LiBSLjwvYXV0aG9yPjxhdXRob3I+Q2hhbmcsIEguIFkuPC9hdXRob3I+PGF1dGhvcj5HcmVlbmxl
-YWYsIFcuIEouPC9hdXRob3I+PC9hdXRob3JzPjwvY29udHJpYnV0b3JzPjxhdXRoLWFkZHJlc3M+
-RGVwYXJ0bWVudCBvZiBHZW5ldGljcywgU3RhbmZvcmQgVW5pdmVyc2l0eSBTY2hvb2wgb2YgTWVk
-aWNpbmUsIFN0YW5mb3JkLCBDQSwgVVNBLiYjeEQ7RGVwYXJ0bWVudCBvZiBDb21wdXRlciBTY2ll
-bmNlLCBTdGFuZm9yZCBVbml2ZXJzaXR5LCBTdGFuZm9yZCwgQ0EsIFVTQS4mI3hEO0lsbHVtaW5h
-IEFJIGxhYm9yYXRvcnksIElsbHVtaW5hIEluYywgRm9zdGVyIENpdHksIENBLCBVU0EuJiN4RDtO
-VklESUEgQmlvIFJlc2VhcmNoLCBOVklESUEsIFNhbnRhIENsYXJhLCBDQSwgVVNBLiYjeEQ7Q29t
-cHV0YXRpb25hbCBPbmNvbG9neSwgRGVwYXJ0bWVudCBvZiBFcGlkZW1pb2xvZ3kgYW5kIEJpb3N0
-YXRpc3RpY3MsIE1lbW9yaWFsIFNsb2FuIEtldHRlcmluZyBDYW5jZXIgQ2VudGVyLCBOZXcgWW9y
-aywgTlksIFVTQS4mI3hEO0RlcGFydG1lbnQgb2YgRGVybWF0b2xvZ3ksIFN0YW5mb3JkIFVuaXZl
-cnNpdHkgU2Nob29sIG9mIE1lZGljaW5lLCBTdGFuZm9yZCwgQ0EsIFVTQS4mI3hEO0NlbnRlciBm
-b3IgUGVyc29uYWwgRHluYW1pYyBSZWd1bG9tZXMsIFN0YW5mb3JkIFVuaXZlcnNpdHksIFN0YW5m
-b3JkLCBDQSA5NDMwNSwgVVNBLiYjeEQ7QnJvYWQgSW5zdGl0dXRlIG9mIE1JVCBhbmQgSGFydmFy
-ZCwgQ2FtYnJpZGdlLCBNQSwgVVNBLiYjeEQ7RGVwYXJ0bWVudCBvZiBQcmV2ZW50aXZlIE1lZGlj
-aW5lLCBVbml2ZXJzaXR5IG9mIFRlbm5lc3NlZSBIZWFsdGggU2NpZW5jZSBDZW50ZXIsIE1lbXBo
-aXMsIFROLCBVU0EuJiN4RDtEZXBhcnRtZW50IG9mIE1lZGljaW5lLCBVbml2ZXJzaXR5IG9mIFRl
-bm5lc3NlZSBIZWFsdGggU2NpZW5jZSBDZW50ZXIsIE1lbXBoaXMsIFROLCBVU0EuJiN4RDtVVEhT
-QyBDZW50ZXIgZm9yIENhbmNlciBSZXNlYXJjaCwgVW5pdmVyc2l0eSBvZiBUZW5uZXNzZWUgSGVh
-bHRoIFNjaWVuY2UgQ2VudGVyLCBNZW1waGlzLCBUTiwgVVNBLiYjeEQ7Q2VudGVyIGZvciBFcGln
-ZW5ldGljcywgVmFuIEFuZGVsIEluc3RpdHV0ZSwgR3JhbmQgUmFwaWRzLCBNSSA0OTUwMywgVVNB
-LiYjeEQ7TmF0aW9uYWwgQ2FuY2VyIEluc3RpdHV0ZSwgTmF0aW9uYWwgSW5zdGl0dXRlcyBvZiBI
-ZWFsdGgsIEJldGhlc2RhLCBNRCAyMDg5MiwgVVNBLiYjeEQ7RGVwYXJ0bWVudCBvZiBCaW9jaGVt
-aXN0cnksIEZhY3VsdHkgb2YgU2NpZW5jZSwgQ2FuY2VyIGFuZCBNdXRhZ2VuZXNpcyBVbml0LCBL
-aW5nIEZhaGQgQ2VudGVyIGZvciBNZWRpY2FsIFJlc2VhcmNoLCBLaW5nIEFiZHVsYXppeiBVbml2
-ZXJzaXR5LCBKZWRkYWgsIFNhdWRpIEFyYWJpYS4mI3hEO0RlcGFydG1lbnQgb2YgTWVkaWNpbmUs
-IFN0YW5mb3JkIFVuaXZlcnNpdHkgU2Nob29sIG9mIE1lZGljaW5lLCBTdGFuZm9yZCwgQ0EsIFVT
-QS4mI3hEO0RlcGFydG1lbnQgb2YgQmlvbWVkaWNhbCBEYXRhIFNjaWVuY2UsIFN0YW5mb3JkIFVu
-aXZlcnNpdHkgU2Nob29sIG9mIE1lZGljaW5lLCBTdGFuZm9yZCwgQ0EsIFVTQS4mI3hEO0NoYW4g
-WnVja2VyYmVyZyBCaW9odWIsIFNhbiBGcmFuY2lzY28sIENBLCBVU0EuJiN4RDtDZW50ZXIgZm9y
-IENhbmNlciBHZW5vbWljcywgTmF0aW9uYWwgQ2FuY2VyIEluc3RpdHV0ZSwgQmV0aGVzZGEsIE1E
-IDIwODkyLCBVU0EuJiN4RDtDZW50ZXIgZm9yIEJpb21lZGljYWwgSW5mb3JtYXRpY3MgYW5kIElu
-Zm9ybWF0aW9uIFRlY2hub2xvZ3ksIE5hdGlvbmFsIENhbmNlciBJbnN0aXR1dGUsIE5JSCwgOTYw
-OSBNZWRpY2FsIENlbnRlciBEcml2ZSwgUm9ja3ZpbGxlLCBNRCAyMDg1MCwgVVNBLiYjeEQ7SW5z
-dGl0dXRlIGZvciBDb21wdXRhdGlvbmFsIEJpb21lZGljaW5lLCBXZWlsbCBDb3JuZWxsIE1lZGlj
-aW5lLCBOZXcgWW9yaywgTlkgMTAwNjUsIFVTQS4mI3hEO1NhbmRyYSBhbmQgRWR3YXJkIE1leWVy
-IENhbmNlciBDZW50ZXIsIFdlaWxsIENvcm5lbGwgTWVkaWNpbmUsIE5ldyBZb3JrLCBOWSAxMDA2
-NSwgVVNBLiYjeEQ7RGVwYXJ0bWVudCBvZiBQaHlzaW9sb2d5IGFuZCBCaW9waHlzaWNzLCBXZWls
-bCBDb3JuZWxsIE1lZGljaW5lLCBOZXcgWW9yaywgTlkgMTAwNjUsIFVTQS4mI3hEO0VuZ2xhbmRl
-ciBJbnN0aXR1dGUgZm9yIFByZWNpc2lvbiBNZWRpY2luZSwgV2VpbGwgQ29ybmVsbCBNZWRpY2lu
-ZSwgTmV3IFlvcmssIE5ZIDEwMDY1LCBVU0EuJiN4RDtCaW9pbmZvcm1hdGljcyBhbmQgU3lzdGVt
-cyBCaW9sb2d5IExhYm9yYXRvcnksIEZlZGVyYWwgVW5pdmVyc2l0eSBvZiBQYXJhbsOhLCBDdXJp
-dGliYSA4MTUyMC0yNjAsIEJyYXppbC4mI3hEO0RlcGFydG1lbnRzIG9mIFBhdGhvbG9neSAmYW1w
-OyBHZW5vbWljIE1lZGljaW5lLCBUaGUgVW5pdmVyc2l0eSBvZiBUZXhhcyBNRCBBbmRlcnNvbiBD
-YW5jZXIgQ2VudGVyLCBIb3VzdG9uLCBUWCwgVVNBLiYjeEQ7RGVwYXJ0bWVudCBvZiBCaW9pbmZv
-cm1hdGljcyBhbmQgQ29tcHV0YXRpb25hbCBCaW9sb2d5LCBUaGUgVW5pdmVyc2l0eSBvZiBUZXhh
-cyBNRCBBbmRlcnNvbiBDYW5jZXIgQ2VudGVyLCBIb3VzdG9uLCBUWCA3NzAzMCwgVVNBLiYjeEQ7
-RGVwYXJ0bWVudCBvZiBTeXN0ZW1zIEJpb2xvZ3ksIFVuaXZlcnNpdHkgb2YgVGV4YXMgTUQgQW5k
-ZXJzb24gQ2FuY2VyIENlbnRlciwgSG91c3RvbiwgVFggNzcwMzAuJiN4RDtEZXBhcnRtZW50IG9m
-IENvbXB1dGVyIFNjaWVuY2UsIFByaW5jZXRvbiBVbml2ZXJzaXR5LCAzNSBPbGRlbiBTdHJlZXQs
-IFByaW5jZXRvbiwgTkogMDg1NDAuJiN4RDtCaW9tb2xlY3VsYXIgRW5naW5lZXJpbmcgRGVwYXJ0
-bWVudCwgU2Nob29sIG9mIEVuZ2luZWVyaW5nLCBVbml2ZXJzaXR5IG9mIENhbGlmb3JuaWEsIFNh
-bnRhIENydXosIFNhbnRhIENydXosIENBIDk1MDY0LCBVU0EuJiN4RDtCdWNrIEluc3RpdHV0ZSBm
-b3IgUmVzZWFyY2ggb24gQWdpbmcsIE5vdmF0bywgQ0EgOTQ5NDUsIFVTQS4mI3hEO0dsYWRzdG9u
-ZSBJbnN0aXR1dGUgb2YgTmV1cm9sb2dpY2FsIERpc2Vhc2UsIEdsYWRzdG9uZSBJbnN0aXR1dGVz
-LCBTYW4gRnJhbmNpc2NvLCBDQSwgVVNBLiYjeEQ7R2xhZHN0b25lIEluc3RpdHV0ZSBvZiBEYXRh
-IFNjaWVuY2UgYW5kIEJpb3RlY2hub2xvZ3ksIEdsYWRzdG9uZSBJbnN0aXR1dGVzLCBTYW4gRnJh
-bmNpc2NvLCBDQSwgVVNBLiYjeEQ7RGVwYXJ0bWVudCBvZiBOZXVyb2xvZ3ksIFVuaXZlcnNpdHkg
-b2YgQ2FsaWZvcm5pYSBTYW4gRnJhbmNpc2NvLCBTYW4gRnJhbmNpc2NvLCBDQSwgVVNBLiYjeEQ7
-SG93YXJkIEh1Z2hlcyBNZWRpY2FsIEluc3RpdHV0ZSwgU3RhbmZvcmQgVW5pdmVyc2l0eSwgU2No
-b29sIG9mIE1lZGljaW5lLCBTdGFuZm9yZCwgQ0EsIFVTQS4mI3hEO0RlcGFydG1lbnQgb2YgQXBw
-bGllZCBQaHlzaWNzLCBTdGFuZm9yZCBVbml2ZXJzaXR5LCBTdGFuZm9yZCwgQ0EsIFVTQS48L2F1
-dGgtYWRkcmVzcz48dGl0bGVzPjx0aXRsZT5TaW5nbGUtY2VsbCBjaHJvbWF0aW4gYWNjZXNzaWJp
-bGl0eSByZXZlYWxzIG1hbGlnbmFudCByZWd1bGF0b3J5IHByb2dyYW1zIGluIHByaW1hcnkgaHVt
-YW4gY2FuY2VyczwvdGl0bGU+PHNlY29uZGFyeS10aXRsZT5TY2llbmNlPC9zZWNvbmRhcnktdGl0
-bGU+PC90aXRsZXM+PHBlcmlvZGljYWw+PGZ1bGwtdGl0bGU+U2NpZW5jZTwvZnVsbC10aXRsZT48
-L3BlcmlvZGljYWw+PHBhZ2VzPmVhZGs5MjE3PC9wYWdlcz48dm9sdW1lPjM4NTwvdm9sdW1lPjxu
-dW1iZXI+NjcxMzwvbnVtYmVyPjxlZGl0aW9uPjIwMjQwOTA2PC9lZGl0aW9uPjxrZXl3b3Jkcz48
-a2V5d29yZD5IdW1hbnM8L2tleXdvcmQ+PGtleXdvcmQ+KkNocm9tYXRpbi9tZXRhYm9saXNtL2dl
-bmV0aWNzPC9rZXl3b3JkPjxrZXl3b3JkPipTaW5nbGUtQ2VsbCBBbmFseXNpczwva2V5d29yZD48
-a2V5d29yZD4qTmVvcGxhc21zL2dlbmV0aWNzPC9rZXl3b3JkPjxrZXl3b3JkPipHZW5lIEV4cHJl
-c3Npb24gUmVndWxhdGlvbiwgTmVvcGxhc3RpYzwva2V5d29yZD48a2V5d29yZD5OZXVyYWwgTmV0
-d29ya3MsIENvbXB1dGVyPC9rZXl3b3JkPjxrZXl3b3JkPk11dGF0aW9uPC9rZXl3b3JkPjxrZXl3
-b3JkPkROQSBDb3B5IE51bWJlciBWYXJpYXRpb25zPC9rZXl3b3JkPjxrZXl3b3JkPkJyZWFzdCBO
-ZW9wbGFzbXMvZ2VuZXRpY3MvcGF0aG9sb2d5PC9rZXl3b3JkPjwva2V5d29yZHM+PGRhdGVzPjx5
-ZWFyPjIwMjQ8L3llYXI+PHB1Yi1kYXRlcz48ZGF0ZT5TZXAgNjwvZGF0ZT48L3B1Yi1kYXRlcz48
-L2RhdGVzPjxpc2JuPjAwMzYtODA3NSAoUHJpbnQpJiN4RDswMDM2LTgwNzU8L2lzYm4+PGFjY2Vz
-c2lvbi1udW0+MzkyMzYxNjk8L2FjY2Vzc2lvbi1udW0+PHVybHM+PC91cmxzPjxjdXN0b20xPkNv
-bXBldGluZyBJbnRlcmVzdHMgV0pHIGFuZCBIWUMgYXJlIG5hbWVkIGFzIGFuIGludmVudG9yIG9u
-IHBhdGVudHMgZGVzY3JpYmluZyBBVEFDLXNlcSBtZXRob2RzLiAxMHggR2Vub21pY3MgaGFzIGxp
-Y2Vuc2VkIGludGVsbGVjdHVhbCBwcm9wZXJ0eSBvbiB3aGljaCBXSkcgYW5kIEhZQyBhcmUgbGlz
-dGVkIGFzIGludmVudG9ycy4gV0pHIGhvbGRzIG9wdGlvbnMgaW4gMTB4IEdlbm9taWNzIGFuZCBp
-cyBhIGNvbnN1bHRhbnQgZm9yIFVsdGltYSBHZW5vbWljcyBhbmQgR3VhcmRhbnQgSGVhbHRoLiBX
-SkcgaXMgYSBzY2llbnRpZmljIGNvLWZvdW5kZXIgb2YgUHJvdGlsbGlvbiBCaW9zY2llbmNlcy4g
-QUsgYW5kIEtGIGFyZSBlbXBsb3llZXMgb2YgSWxsdW1pbmEuIExTLCBOR1IgYW5kIEFTIHdlcmUg
-ZW1wbG95ZWVzIG9mIElsbHVtaW5hLiBMUyBpcyBjdXJyZW50bHkgYW4gZW1wbG95ZWUgb2YgTlZJ
-RElBLiBUaGUgb3RoZXIgYXV0aG9ycyBkZWNsYXJlIG5vIGNvbXBldGluZyBpbnRlcmVzdHMuIEFD
-IGhhcyBSZXNlYXJjaCBmdW5kaW5nIGZyb20gQmF5ZXIgYW5kIGlzIGNvbnN1bHRhbnQgZm9yIEJp
-cmRzRXllIEJpby4gUFdMIGlzIGEgU0FCIGJyb2FkIG1lbWJlciBmb3IgVGFnb21pY3MsIExMQywg
-Rk9YTyBUZWNobm9sb2dpZXMsIGFuZCBBbmNob3JEWC48L2N1c3RvbTE+PGN1c3RvbTI+UE1DMTIy
-ODkzNDY8L2N1c3RvbTI+PGN1c3RvbTY+TklITVMyMDk0ODE4PC9jdXN0b202PjxlbGVjdHJvbmlj
-LXJlc291cmNlLW51bT4xMC4xMTI2L3NjaWVuY2UuYWRrOTIxNzwvZWxlY3Ryb25pYy1yZXNvdXJj
-ZS1udW0+PHJlbW90ZS1kYXRhYmFzZS1wcm92aWRlcj5OTE08L3JlbW90ZS1kYXRhYmFzZS1wcm92
-aWRlcj48bGFuZ3VhZ2U+ZW5nPC9sYW5ndWFnZT48L3JlY29yZD48L0NpdGU+PENpdGU+PEF1dGhv
-cj5WYW4gZGUgU2FuZGU8L0F1dGhvcj48WWVhcj4yMDIwPC9ZZWFyPjxSZWNOdW0+MTg4PC9SZWNO
-dW0+PHJlY29yZD48cmVjLW51bWJlcj4xODg8L3JlYy1udW1iZXI+PGZvcmVpZ24ta2V5cz48a2V5
-IGFwcD0iRU4iIGRiLWlkPSJldHB6d3J6YWF6ZmZ4ZmVkeHhqeHd0cDh6c3gydHB2c3Y1ZDAiIHRp
-bWVzdGFtcD0iMTc4NzMwMjA5MCI+MTg4PC9rZXk+PC9mb3JlaWduLWtleXM+PHJlZi10eXBlIG5h
-bWU9IkpvdXJuYWwgQXJ0aWNsZSI+MTc8L3JlZi10eXBlPjxjb250cmlidXRvcnM+PGF1dGhvcnM+
-PGF1dGhvcj5WYW4gZGUgU2FuZGUsIEIuPC9hdXRob3I+PGF1dGhvcj5GbGVyaW4sIEMuPC9hdXRo
-b3I+PGF1dGhvcj5EYXZpZSwgSy48L2F1dGhvcj48YXV0aG9yPkRlIFdhZWdlbmVlciwgTS48L2F1
-dGhvcj48YXV0aG9yPkh1bHNlbG1hbnMsIEcuPC9hdXRob3I+PGF1dGhvcj5BaWJhciwgUy48L2F1
-dGhvcj48YXV0aG9yPlNldXJpbmNrLCBSLjwvYXV0aG9yPjxhdXRob3I+U2FlbGVucywgVy48L2F1
-dGhvcj48YXV0aG9yPkNhbm5vb2R0LCBSLjwvYXV0aG9yPjxhdXRob3I+Um91Y2hvbiwgUS48L2F1
-dGhvcj48YXV0aG9yPlZlcmJlaXJlbiwgVC48L2F1dGhvcj48YXV0aG9yPkRlIE1hZXllciwgRC48
-L2F1dGhvcj48YXV0aG9yPlJldW1lcnMsIEouPC9hdXRob3I+PGF1dGhvcj5TYWV5cywgWS48L2F1
-dGhvcj48YXV0aG9yPkFlcnRzLCBTLjwvYXV0aG9yPjwvYXV0aG9ycz48L2NvbnRyaWJ1dG9ycz48
-YXV0aC1hZGRyZXNzPlZJQiBDZW50ZXIgZm9yIEJyYWluICZhbXA7IERpc2Vhc2UgUmVzZWFyY2gs
-IEtVIExldXZlbiwgTGV1dmVuLCBCZWxnaXVtLiYjeEQ7RGVwYXJ0bWVudCBvZiBIdW1hbiBHZW5l
-dGljcywgS1UgTGV1dmVuLCBMZXV2ZW4sIEJlbGdpdW0uJiN4RDtEYXRhIE1pbmluZyBhbmQgTW9k
-ZWxsaW5nIGZvciBCaW9tZWRpY2luZSwgVklCIENlbnRlciBmb3IgSW5mbGFtbWF0aW9uIFJlc2Vh
-cmNoLCBHaGVudCwgQmVsZ2l1bS4mI3hEO0RlcGFydG1lbnQgb2YgQXBwbGllZCBNYXRoZW1hdGlj
-cywgQ29tcHV0ZXIgU2NpZW5jZSBhbmQgU3RhdGlzdGljcywgR2hlbnQgVW5pdmVyc2l0eSwgR2hl
-bnQsIEJlbGdpdW0uJiN4RDtDZW50ZXIgZm9yIE1lZGljYWwgR2VuZXRpY3MsIEdoZW50IFVuaXZl
-cnNpdHkgSG9zcGl0YWwsIEdoZW50LCBCZWxnaXVtLiYjeEQ7SmFuc3NlbiBQaGFybWFjZXV0aWNh
-LCBCZWVyc2UsIEJlbGdpdW0uJiN4RDtEYXRhIEludHVpdGl2ZSwgR2hlbnQsIEJlbGdpdW0uJiN4
-RDtWSUIgQ2VudGVyIGZvciBCcmFpbiAmYW1wOyBEaXNlYXNlIFJlc2VhcmNoLCBLVSBMZXV2ZW4s
-IExldXZlbiwgQmVsZ2l1bS4gc3RlaW4uYWVydHNAa3VsZXV2ZW4udmliLmJlLiYjeEQ7RGVwYXJ0
-bWVudCBvZiBIdW1hbiBHZW5ldGljcywgS1UgTGV1dmVuLCBMZXV2ZW4sIEJlbGdpdW0uIHN0ZWlu
-LmFlcnRzQGt1bGV1dmVuLnZpYi5iZS48L2F1dGgtYWRkcmVzcz48dGl0bGVzPjx0aXRsZT5BIHNj
-YWxhYmxlIFNDRU5JQyB3b3JrZmxvdyBmb3Igc2luZ2xlLWNlbGwgZ2VuZSByZWd1bGF0b3J5IG5l
-dHdvcmsgYW5hbHlzaXM8L3RpdGxlPjxzZWNvbmRhcnktdGl0bGU+TmF0IFByb3RvYzwvc2Vjb25k
-YXJ5LXRpdGxlPjwvdGl0bGVzPjxwZXJpb2RpY2FsPjxmdWxsLXRpdGxlPk5hdCBQcm90b2M8L2Z1
-bGwtdGl0bGU+PC9wZXJpb2RpY2FsPjxwYWdlcz4yMjQ3LTIyNzY8L3BhZ2VzPjx2b2x1bWU+MTU8
-L3ZvbHVtZT48bnVtYmVyPjc8L251bWJlcj48ZWRpdGlvbj4yMDIwMDYxOTwvZWRpdGlvbj48a2V5
-d29yZHM+PGtleXdvcmQ+QW5pbWFsczwva2V5d29yZD48a2V5d29yZD5DZWxsIExpbmUsIFR1bW9y
-PC9rZXl3b3JkPjxrZXl3b3JkPipHZW5lIFJlZ3VsYXRvcnkgTmV0d29ya3M8L2tleXdvcmQ+PGtl
-eXdvcmQ+SHVtYW5zPC9rZXl3b3JkPjxrZXl3b3JkPk1pY2U8L2tleXdvcmQ+PGtleXdvcmQ+U2lu
-Z2xlLUNlbGwgQW5hbHlzaXMvKm1ldGhvZHM8L2tleXdvcmQ+PGtleXdvcmQ+KldvcmtmbG93PC9r
-ZXl3b3JkPjwva2V5d29yZHM+PGRhdGVzPjx5ZWFyPjIwMjA8L3llYXI+PHB1Yi1kYXRlcz48ZGF0
-ZT5KdWw8L2RhdGU+PC9wdWItZGF0ZXM+PC9kYXRlcz48aXNibj4xNzUwLTI3OTk8L2lzYm4+PGFj
-Y2Vzc2lvbi1udW0+MzI1NjE4ODg8L2FjY2Vzc2lvbi1udW0+PHVybHM+PC91cmxzPjxlbGVjdHJv
-bmljLXJlc291cmNlLW51bT4xMC4xMDM4L3M0MTU5Ni0wMjAtMDMzNi0yPC9lbGVjdHJvbmljLXJl
-c291cmNlLW51bT48cmVtb3RlLWRhdGFiYXNlLXByb3ZpZGVyPk5MTTwvcmVtb3RlLWRhdGFiYXNl
-LXByb3ZpZGVyPjxsYW5ndWFnZT5lbmc8L2xhbmd1YWdlPjwvcmVjb3JkPjwvQ2l0ZT48L0VuZE5v
-dGU+AG==
-</w:fldData>
-        </w:fldChar>
-      </w:r>
-      <w:r>
-        <w:instrText xml:space="preserve"> ADDIN EN.CITE.DATA </w:instrText>
-      </w:r>
-      <w:r>
-        <w:fldChar w:fldCharType="end"/>
-      </w:r>
-      <w:r>
-        <w:fldChar w:fldCharType="separate"/>
-      </w:r>
-      <w:r>
-        <w:rPr>
-          <w:noProof/>
-          <w:vertAlign w:val="superscript"/>
-        </w:rPr>
-        <w:t>13, 14</w:t>
-      </w:r>
-      <w:r>
-        <w:fldChar w:fldCharType="end"/>
-      </w:r>
-      <w:r>
-        <w:t>.</w:t>
+        <w:t>Bulk tumour analyses cannot determine how much of an observed BACH1-hypoxia association reflects transcriptional coupling within malignant cells versus differences in malignant epithelial-state composition between patients. Cell-line experiments, in turn, do not resolve how these signals are distributed across primary human tumour states.</w:t>
       </w:r>
     </w:p>
     <w:p>
@@ -3159,7 +2041,7 @@
         </w:rPr>
       </w:pPr>
       <w:r>
-        <w:t>Here, we mapped BACH1 transcript detection in primary malignant epithelial cells to an externally defined BACH1 score and a hypoxia-associated transcriptional context. We constructed an NSCLC single-cell atlas, defined a 16-patient primary malignant epithelial set using author annotations and CNV support, retained a restricted CNV-consensus set for sensitivity analyses, placed BACH1 within the broader DoRothEA TF landscape, tested the main DoRothEA-hypoxia result against gene-set overlap, matched random gene sets, technical covariates and patient-level composition, and used TCGA and tumour-tissue ATAC to place the signal in bulk and chromatin context. Together, these analyses test whether BACH1-associated hypoxia covariance localizes to patient-resolved malignant epithelial-state architecture while distinguishing transcriptional co-variation from causal regulatory inference.</w:t>
+        <w:t>We therefore asked to what extent patient-level BACH1-hypoxia covariance persists after accounting for malignant epithelial-state architecture. We tested this using patient-resolved scRNA-seq, evaluated transcription-factor specificity and bulk reproducibility, and then asked whether the same state-dependent pattern was independently recapitulated in spatial transcriptomic tissue sections.</w:t>
       </w:r>
     </w:p>
     <w:p>
@@ -3577,22 +2459,6 @@
     </w:p>
     <w:p>
       <w:pPr>
-        <w:spacing w:line="480" w:lineRule="auto"/>
-      </w:pPr>
-      <w:r>
-        <w:t xml:space="preserve">Chromatin-accessibility analyses used author-processed </w:t>
-      </w:r>
-      <w:proofErr w:type="spellStart"/>
-      <w:r>
-        <w:t>scATAC</w:t>
-      </w:r>
-      <w:proofErr w:type="spellEnd"/>
-      <w:r>
-        <w:t>-seq peak-by-cell matrices from five GSE274934 samples (28,500 filtered cells).</w:t>
-      </w:r>
-    </w:p>
-    <w:p>
-      <w:pPr>
         <w:pStyle w:val="berschrift2"/>
         <w:spacing w:line="480" w:lineRule="auto"/>
         <w:jc w:val="left"/>
@@ -3772,7 +2638,7 @@
           <w:noProof/>
           <w:vertAlign w:val="superscript"/>
         </w:rPr>
-        <w:t>15</w:t>
+        <w:t>13</w:t>
       </w:r>
       <w:r>
         <w:fldChar w:fldCharType="end"/>
@@ -3926,7 +2792,7 @@
           <w:noProof/>
           <w:vertAlign w:val="superscript"/>
         </w:rPr>
-        <w:t>16</w:t>
+        <w:t>14</w:t>
       </w:r>
       <w:r>
         <w:fldChar w:fldCharType="end"/>
@@ -4110,7 +2976,7 @@
           <w:noProof/>
           <w:vertAlign w:val="superscript"/>
         </w:rPr>
-        <w:t>17</w:t>
+        <w:t>15</w:t>
       </w:r>
       <w:r>
         <w:fldChar w:fldCharType="end"/>
@@ -4156,7 +3022,7 @@
           <w:noProof/>
           <w:vertAlign w:val="superscript"/>
         </w:rPr>
-        <w:t>18</w:t>
+        <w:t>16</w:t>
       </w:r>
       <w:r>
         <w:fldChar w:fldCharType="end"/>
@@ -4194,7 +3060,7 @@
           <w:noProof/>
           <w:vertAlign w:val="superscript"/>
         </w:rPr>
-        <w:t>19</w:t>
+        <w:t>17</w:t>
       </w:r>
       <w:r>
         <w:fldChar w:fldCharType="end"/>
@@ -4224,7 +3090,7 @@
           <w:noProof/>
           <w:vertAlign w:val="superscript"/>
         </w:rPr>
-        <w:t>20</w:t>
+        <w:t>18</w:t>
       </w:r>
       <w:r>
         <w:fldChar w:fldCharType="end"/>
@@ -4368,71 +3234,7 @@
         <w:spacing w:line="480" w:lineRule="auto"/>
       </w:pPr>
       <w:r>
-        <w:t xml:space="preserve">Expression-derived CNV profiles were inferred with </w:t>
-      </w:r>
-      <w:proofErr w:type="spellStart"/>
-      <w:r>
-        <w:t>infercnvpy</w:t>
-      </w:r>
-      <w:proofErr w:type="spellEnd"/>
-      <w:r>
-        <w:t xml:space="preserve"> v0.6.1. An immune-reference analysis used 3,413 sampled T/NK cells with 24,481 epithelial cells and 22,955 autosomal genes ordered by </w:t>
-      </w:r>
-      <w:proofErr w:type="spellStart"/>
-      <w:r>
-        <w:t>Ensembl</w:t>
-      </w:r>
-      <w:proofErr w:type="spellEnd"/>
-      <w:r>
-        <w:t xml:space="preserve"> </w:t>
-      </w:r>
-      <w:proofErr w:type="spellStart"/>
-      <w:r>
-        <w:t>BioMart</w:t>
-      </w:r>
-      <w:proofErr w:type="spellEnd"/>
-      <w:r>
-        <w:t xml:space="preserve"> coordinates. Profiles were smoothed with a 100-gene window, step size ten and log-fold-change clipping at 3.</w:t>
-      </w:r>
-    </w:p>
-    <w:p>
-      <w:pPr>
-        <w:spacing w:line="480" w:lineRule="auto"/>
-      </w:pPr>
-      <w:r>
-        <w:t xml:space="preserve">Three CNV strategies were compared: T/NK-reference stringent calling with </w:t>
-      </w:r>
-      <w:proofErr w:type="spellStart"/>
-      <w:r>
-        <w:t>dynamic_threshold</w:t>
-      </w:r>
-      <w:proofErr w:type="spellEnd"/>
-      <w:r>
-        <w:t>=1.5, T/NK-reference sensitivity calling without dynamic thresholding, and non-</w:t>
-      </w:r>
-      <w:proofErr w:type="spellStart"/>
-      <w:r>
-        <w:t>tumour</w:t>
-      </w:r>
-      <w:proofErr w:type="spellEnd"/>
-      <w:r>
-        <w:t xml:space="preserve"> epithelial-reference calling using 3,397 reference epithelial cells. All used 28 CNV PCA components, 15 </w:t>
-      </w:r>
-      <w:proofErr w:type="spellStart"/>
-      <w:r>
-        <w:t>neighbours</w:t>
-      </w:r>
-      <w:proofErr w:type="spellEnd"/>
-      <w:r>
-        <w:t>, Leiden resolution 0.5 and random seed 7.</w:t>
-      </w:r>
-    </w:p>
-    <w:p>
-      <w:pPr>
-        <w:spacing w:line="480" w:lineRule="auto"/>
-      </w:pPr>
-      <w:r>
-        <w:t>Per-cell CNV burden was defined as the mean absolute inferred CNV value, and reference-derived burden thresholds used the larger of the 99th reference percentile and the reference median plus three scaled MADs. The primary malignant epithelial set combined GSE131907 author malignant annotations with GSE274934 cells supported by at least one CNV strategy, yielding 13,694 cells from 16 patients. The stricter CNV-consensus sensitivity set required support from at least two strategies and contained 4,906 cells.</w:t>
+        <w:t>Expression-derived CNV support was inferred with infercnvpy v0.6.1 using immune and non-tumour epithelial reference populations. The primary malignant epithelial set combined GSE131907 author malignant annotations with GSE274934 cells supported by at least one of three CNV strategies, yielding 13,694 cells from 16 patients. The restricted sensitivity set required support from at least two CNV strategies and contained 4,906 cells. Reference construction, smoothing, clustering and burden-threshold parameters are provided in the Supplementary Methods.</w:t>
       </w:r>
     </w:p>
     <w:p>
@@ -4454,22 +3256,7 @@
         </w:rPr>
       </w:pPr>
       <w:r>
-        <w:rPr>
-          <w:rFonts w:ascii="Times New Roman" w:eastAsia="Times New Roman" w:hAnsi="Times New Roman"/>
-          <w:i/>
-          <w:sz w:val="22"/>
-          <w:szCs w:val="22"/>
-        </w:rPr>
-        <w:lastRenderedPageBreak/>
-        <w:t>BACH1</w:t>
-      </w:r>
-      <w:r>
-        <w:rPr>
-          <w:rFonts w:ascii="Times New Roman" w:eastAsia="Times New Roman" w:hAnsi="Times New Roman"/>
-          <w:sz w:val="22"/>
-          <w:szCs w:val="22"/>
-        </w:rPr>
-        <w:t xml:space="preserve"> expression, differential expression and co-expression</w:t>
+        <w:t>BACH1 transcript detection</w:t>
       </w:r>
     </w:p>
     <w:p>
@@ -4504,49 +3291,7 @@
         </w:rPr>
       </w:pPr>
       <w:r>
-        <w:t>Differential expression used two-sided Wilcoxon rank-sum tests on log-</w:t>
-      </w:r>
-      <w:proofErr w:type="spellStart"/>
-      <w:proofErr w:type="gramStart"/>
-      <w:r>
-        <w:t>normalised</w:t>
-      </w:r>
-      <w:proofErr w:type="spellEnd"/>
-      <w:proofErr w:type="gramEnd"/>
-      <w:r>
-        <w:t xml:space="preserve"> expression with Benjamini-Hochberg correction. Candidate genes required adjusted P &lt; 0.05 and absolute log fold change </w:t>
-      </w:r>
-      <w:r>
-        <w:rPr>
-          <w:rFonts w:ascii="Times New Roman Regular" w:hAnsi="Times New Roman Regular" w:cs="Times New Roman Regular"/>
-        </w:rPr>
-        <w:t>≥</w:t>
-      </w:r>
-      <w:r>
-        <w:rPr>
-          <w:rFonts w:cs="Times New Roman"/>
-        </w:rPr>
-        <w:t xml:space="preserve"> </w:t>
-      </w:r>
-      <w:r>
-        <w:t xml:space="preserve">0.25. Global </w:t>
-      </w:r>
-      <w:r>
-        <w:rPr>
-          <w:i/>
-        </w:rPr>
-        <w:t>BACH1</w:t>
-      </w:r>
-      <w:r>
-        <w:t xml:space="preserve"> co-expression used Pearson correlation; partial correlations used residual expression after adjustment for dataset, sample identity, epithelial Leiden cluster, total counts, detected genes and mitochondrial percentage.</w:t>
-      </w:r>
-    </w:p>
-    <w:p>
-      <w:pPr>
-        <w:spacing w:line="480" w:lineRule="auto"/>
-      </w:pPr>
-      <w:r>
-        <w:t>Partial BACH1 associations were retained as one component of the downstream recurrent-candidate context matrix.</w:t>
+        <w:t>Differential-expression, co-expression and partial-correlation analyses were retained as supplementary regulatory-candidate context and are described in the Supplementary Methods and Supplementary Tables 3-4.</w:t>
       </w:r>
     </w:p>
     <w:p>
@@ -4570,83 +3315,15 @@
         <w:spacing w:line="480" w:lineRule="auto"/>
       </w:pPr>
       <w:r>
-        <w:t xml:space="preserve">Externally defined BACH1 signature scores were evaluated in the 16-patient primary malignant epithelial set using the Klenja-Skudrinja lung perturbation/ChIP-seq signature, DoRothEA A-C BACH1 targets, CollecTRI BACH1 targets retrieved through OmniPath </w:t>
-      </w:r>
-      <w:r>
-        <w:rPr>
-          <w:vertAlign w:val="superscript"/>
-        </w:rPr>
-        <w:t>21</w:t>
-      </w:r>
-      <w:r>
-        <w:t xml:space="preserve"> and a descriptive lung cancer BACH1 effector set. Signature membership, weights, direction and source are provided in Supplementary Table 1. Directional mean-z scores used gene-wise standardised log-normalised expression and signed weights. After filtering and duplicate collapse, 84 DoRothEA targets contributed to the primary score; shared-gene removal excluded ALDOA, HMOX1 and IL6 from both DoRothEA and Hallmark hypoxia scores, leaving 81 and 191 genes, respectively. Patient-pseudobulk ssGSEA and decoupler ULM/MLM estimates were retained as sensitivity analyses.</w:t>
+        <w:t>DoRothEA was used as the primary BACH1 score after comparison with predefined external BACH1 resources; alternative resources and scoring implementations are detailed in the Supplementary Methods and Supplementary Table 2. Directional mean-z scores used gene-wise standardized log-normalised expression and signed weights. After filtering and duplicate collapse, 84 DoRothEA targets contributed to the primary score; removal of ALDOA, HMOX1 and IL6 from both DoRothEA and Hallmark hypoxia scores left 81 and 191 genes, respectively.</w:t>
       </w:r>
     </w:p>
     <w:p>
       <w:pPr>
         <w:spacing w:line="480" w:lineRule="auto"/>
       </w:pPr>
-      <w:proofErr w:type="spellStart"/>
-      <w:r>
-        <w:t>DoRothEA</w:t>
-      </w:r>
-      <w:proofErr w:type="spellEnd"/>
-      <w:r>
-        <w:t>-hypoxia overlap was quantified by intersection size, Jaccard index and overlap coefficient, followed by recalculation after shared-gene removal. Two independent 1,000-</w:t>
-      </w:r>
-      <w:proofErr w:type="gramStart"/>
-      <w:r>
-        <w:t>permutation</w:t>
-      </w:r>
-      <w:proofErr w:type="gramEnd"/>
-      <w:r>
-        <w:t xml:space="preserve"> matched random gene-set analyses were run: the original 84-gene score versus Hallmark hypoxia with seed 1701 </w:t>
-      </w:r>
-      <w:r>
-        <w:lastRenderedPageBreak/>
-        <w:t xml:space="preserve">and the de-overlapped 81-gene score versus de-overlapped hypoxia with seed 1702. Null genes were matched by 20-bin mean expression and detection fraction, sampled without replacement, and excluded original </w:t>
-      </w:r>
-      <w:proofErr w:type="spellStart"/>
-      <w:r>
-        <w:t>DoRothEA</w:t>
-      </w:r>
-      <w:proofErr w:type="spellEnd"/>
-      <w:r>
-        <w:t xml:space="preserve"> genes, Hallmark hypoxia genes and BACH1; de-overlapped nulls also excluded ALDOA, HMOX1 and IL6. Empirical one-sided P values used (b+1)/(B+1), and diagnostics are reported in </w:t>
-      </w:r>
-      <w:r>
-        <w:rPr>
-          <w:b/>
-          <w:bCs/>
-        </w:rPr>
-        <w:t>Supplementary Table 2</w:t>
-      </w:r>
-      <w:r>
-        <w:t xml:space="preserve">. Patient-level QC-adjusted models used the shared-gene-removed </w:t>
-      </w:r>
-      <w:proofErr w:type="spellStart"/>
-      <w:r>
-        <w:t>DoRothEA</w:t>
-      </w:r>
-      <w:proofErr w:type="spellEnd"/>
-      <w:r>
-        <w:t xml:space="preserve"> score as outcome and BACH1 detection, log total counts, detected genes, mitochondrial percentage and simplified epithelial state as covariates. Patients were considered evaluable when they contributed at least 20 malignant epithelial cells, including at least three BACH1-detected and three BACH1-undetected cells. Patient-specific BACH1-detection coefficients were tested against zero using a two-sided Wilcoxon signed-rank test. Shared-gene-removed </w:t>
-      </w:r>
-      <w:proofErr w:type="spellStart"/>
-      <w:r>
-        <w:t>DoRothEA</w:t>
-      </w:r>
-      <w:proofErr w:type="spellEnd"/>
-      <w:r>
-        <w:t xml:space="preserve"> and hypoxia scores were also </w:t>
-      </w:r>
-      <w:proofErr w:type="spellStart"/>
-      <w:r>
-        <w:t>residualized</w:t>
-      </w:r>
-      <w:proofErr w:type="spellEnd"/>
-      <w:r>
-        <w:t xml:space="preserve"> for dataset, patient-level QC features and two epithelial-state composition PCs.</w:t>
+      <w:r>
+        <w:t>DoRothEA-hypoxia overlap was quantified before and after shared-gene removal. Independent 1,000-permutation matched random-gene-set analyses were run for the original 84-gene and de-overlapped 81-gene scores, using 20-bin matching for mean expression and detection fraction; empirical one-sided P values used (b+1)/(B+1). Leave-one-patient-out analyses recalculated correlations after omitting each patient. Patient-level QC-adjusted models used the de-overlapped DoRothEA score as outcome and BACH1 detection, log total counts, detected genes, mitochondrial percentage and simplified epithelial state as covariates. Patients were evaluable when they contributed at least 20 malignant epithelial cells, including at least three BACH1-detected and three BACH1-undetected cells; patient-specific coefficients were tested against zero with a two-sided Wilcoxon signed-rank test. Both scores were also residualized for dataset, patient-level QC features and two epithelial-state composition PCs. Full diagnostics are provided in Supplementary Table 2.</w:t>
       </w:r>
     </w:p>
     <w:p>
@@ -4662,7 +3339,7 @@
         <w:spacing w:line="480" w:lineRule="auto"/>
       </w:pPr>
       <w:r>
-        <w:t>For state-level analyses, primary malignant epithelial cells were collapsed to six interpretable epithelial-state classes. The main figures display Stress-associated, Ciliated-like, Epithelial core, Proliferative, AT2-like and Other; source tables retain the internal labels Stress_AP1, Ciliated, Epithelial_core and AT2_like where applicable. Per-state summaries reported cell counts, contributing patients, BACH1 transcript-detection fraction and mean scores for DoRothEA BACH1, Hallmark hypoxia, glycolysis, NRF2/oxidative response, heme metabolism, reactive oxygen species pathway, oxidative phosphorylation, epithelial-mesenchymal transition and proliferation. A state-specific malignancy audit summarized author-annotation or expression-derived CNV support, CNV burden and the largest patient contribution for each state. The 22-gene stress-associated marker set used for the immediate-early sensitivity audit is reported in Supplementary Table 4K, with overlap summaries in Supplementary Table 4L. To audit immediate-early or dissociation-associated signal, a canonical score was calculated from FOS, FOSB, JUN, JUNB, JUND, EGR1, EGR2, EGR3, ATF3, DUSP1, IER2, IER3 and ZFP36, and selected programme scores were recalculated after removing these genes where present. Patient-state units with at least ten cells were used for within-state Spearman correlations between shared-gene-removed DoRothEA and hypoxia scores. For states with at least four evaluable patient-state units, two-sided exact Spearman permutation P values were obtained by enumerating all possible rank permutations when n ≤ 9; all three evaluable states used exact enumeration. Holm correction was applied across the three evaluable states. Approximate 95% confidence intervals for Spearman’s ρ were calculated using Fisher’s z transformation; exact permutation tests, rather than these intervals, were used for statistical inference in the small within-state analyses. Patient-level attenuation was assessed by residualizing both scores for dataset, QC features and epithelial-state composition PCs before recalculating Spearman correlations. State-composition PCs were generated from centred patient-level proportions of the six epithelial-state classes without CLR transformation; PC1 and PC2 were z-scaled and explained 57.4% and 35.2% of composition variance, respectively. A compositional-data sensitivity repeated the residualization with CLR-transformed state proportions using a 0.5-cell pseudocount before PCA.</w:t>
+        <w:t>For state-level analyses, primary malignant epithelial cells were collapsed to six interpretable epithelial-state classes: Stress-associated, Ciliated-like, Epithelial core, Proliferative, AT2-like and Other. Per-state summaries reported cell and patient counts, BACH1 transcript detection and pathway scores; malignancy support and patient dominance were audited separately. A predefined immediate-early/dissociation programme was used as a sensitivity analysis (Supplementary Methods and Supplementary Table 4). Patient-state units with at least ten cells were used for within-state Spearman correlations. For the three states with at least four evaluable units, two-sided exact P values were obtained by enumerating all rank permutations (n≤9) and were Holm-adjusted across states; displayed Fisher-z 95% confidence intervals were approximate and not used for inference. Patient-level attenuation residualized both scores for dataset, QC features and two composition PCs derived from centred proportions of the six states; a CLR-transformed sensitivity used a 0.5-cell pseudocount before PCA.</w:t>
       </w:r>
     </w:p>
     <w:p>
@@ -4944,7 +3621,7 @@
           <w:noProof/>
           <w:vertAlign w:val="superscript"/>
         </w:rPr>
-        <w:t>24-26</w:t>
+        <w:t>19-21</w:t>
       </w:r>
       <w:r>
         <w:fldChar w:fldCharType="end"/>
@@ -4966,92 +3643,19 @@
         <w:pStyle w:val="berschrift2"/>
       </w:pPr>
       <w:r>
-        <w:t>BACH1-focused pySCENIC analysis</w:t>
+        <w:t>Spatial transcriptomic projection and spatial null sensitivity</w:t>
       </w:r>
     </w:p>
     <w:p>
-      <w:r>
-        <w:t>pySCENIC v0.12.1 assessed de novo network recurrence. Final recurrent-target discovery used full-transcription-factor pySCENIC in the 4,906-cell restricted CNV-consensus set. Five full-TF seeds (777-781) were completed; seed-specific AUCell and motif-pruning outputs were retained as source-level diagnostics, while the main manuscript uses cross-seed recurrence only for candidate prioritisation.</w:t>
+      <w:pPr/>
+      <w:r>
+        <w:t>Independent lung spatial transcriptomic sections from GSE292299 were analysed as an orthogonal tissue-level extension. Filtered 10x Visium matrices and array coordinates were imported with Scanpy; in-tissue spots were retained, library-size normalisation was applied to a target sum of 10,000 counts per spot, and values were log1p-transformed. The shared-gene-removed DoRothEA BACH1 and Hallmark hypoxia scores, together with Stress_AP1, Epithelial_core, AT2_like and Ciliated programme scores, were projected using the frozen gene-level score definitions. Spot-level Spearman correlations were treated as descriptive because spots within a section are not independent inferential units.</w:t>
       </w:r>
     </w:p>
     <w:p>
-      <w:r>
-        <w:t>pySCENIC used GRNBoost2, cisTarget motif pruning and AUCell scoring with hg38 10-kb and 500-bp cisTarget v10 ranking databases and motif-v10nr annotations. BACH1 itself was excluded from target-frequency tables to avoid self-target inflation.</w:t>
-      </w:r>
-    </w:p>
-    <w:p>
-      <w:r>
-        <w:t>The 46 genes recovered in ≥ 3 of 5 full-TF seeds defined the recurrent restricted-consensus BACH1-associated candidate set and were carried forward into descriptive ATAC and integrative candidate-context analyses.</w:t>
-      </w:r>
-    </w:p>
-    <w:p>
-      <w:pPr>
-        <w:pStyle w:val="berschrift2"/>
-      </w:pPr>
-      <w:r>
-        <w:t>scATAC-seq peak and BACH1-family motif analysis</w:t>
-      </w:r>
-    </w:p>
-    <w:p>
-      <w:r>
-        <w:t>scATAC-seq analyses used author-filtered peak-by-barcode HDF5 matrices and quality-control summaries for AL05, AL08, AL10, AL11 and AL12, comprising 28,500 cells and 640,447 sample-specific peaks. FASTQ files were not reprocessed, peak calling was not repeated and no additional hard cell-level filtering was imposed.</w:t>
-      </w:r>
-    </w:p>
-    <w:p>
-      <w:r/>
-      <w:r/>
-      <w:r/>
-      <w:r>
-        <w:rPr>
-          <w:vertAlign w:val="superscript"/>
-        </w:rPr>
-      </w:r>
-      <w:r/>
-      <w:r/>
-      <w:r/>
-      <w:r/>
-      <w:r>
-        <w:rPr>
-          <w:vertAlign w:val="superscript"/>
-        </w:rPr>
-      </w:r>
-      <w:r/>
-      <w:r/>
-      <w:r>
-        <w:t>BACH1 (JASPAR MA1633.2) and BACH1::Mafk (MA0591.2) motif coordinates were obtained from the UCSC hg38 JASPAR2026 bigBed resource on 10-11 September 2026</w:t>
-      </w:r>
-      <w:r>
-        <w:t xml:space="preserve"> </w:t>
-      </w:r>
-      <w:r>
-        <w:rPr>
-          <w:vertAlign w:val="superscript"/>
-        </w:rPr>
-        <w:t>22</w:t>
-      </w:r>
-      <w:r>
-        <w:t>.</w:t>
-      </w:r>
-      <w:r>
-        <w:t xml:space="preserve"> Merged TSS +/-10-kb windows for recurrent candidates were queried with bigBedToBed and intersected with the five author-filtered scATAC peak matrices. Records retained motif model, UCSC score, sample identity, accessibility and TSS distance. Promoter-window support was defined as a motif-overlapping accessible peak within +/-2 kb of the annotated TSS. Score-threshold summaries at 300, 400 and 500 are reported descriptively in Supplementary Table 3. Inference was anchored in transcriptomic and patient-level analyses; scATAC results provide descriptive proximal motif context.</w:t>
-      </w:r>
-    </w:p>
-    <w:p>
-      <w:r>
-        <w:t>GENCODE human release 44 on GRCh38.p14 23 defined TSS positions. Accessible motif-bearing peaks within TSS +/-10 kb were linked to genes, with occupancy, enhancer-promoter contact, cell type of origin and regulatory direction reserved for orthogonal assays.</w:t>
-      </w:r>
-    </w:p>
-    <w:p>
-      <w:pPr>
-        <w:pStyle w:val="berschrift2"/>
-      </w:pPr>
-      <w:r>
-        <w:t>Integration of pySCENIC and scATAC-seq evidence</w:t>
-      </w:r>
-    </w:p>
-    <w:p>
-      <w:r>
-        <w:t>The 14 genes recovered in at least four of five full-TF pySCENIC seeds were displayed as the final candidate-tier matrix. Tier 1 required recovery in all five seeds plus motif-overlapping accessible peaks in all five scATAC samples and promoter-window support at a UCSC motif score threshold of ≥300. Tier 2 required recovery in at least four seeds, five-sample motif context at the same threshold and promoter-window support. Remaining recurrent genes were retained as context-limited candidates. This tiering was used for transparent candidate nomination only and was not interpreted as direct BACH1 binding or functional validation.</w:t>
+      <w:pPr/>
+      <w:r>
+        <w:t>For DoRothEA-hypoxia analyses, the four projected epithelial programmes were standardised within section and reduced to three pooled state PCs, explaining 84.1% of their variance. For Stress_AP1-hypoxia analyses, leave-one-programme-out PCs were constructed from Epithelial_core, AT2_like and Ciliated, with the first two PCs explaining 73.7% of the variance. Scores were residualised against log total counts, detected-gene counts and the corresponding state PCs. Spatial concordance was quantified with bivariate Moran's I using a six-neighbour array-coordinate graph. Null expectations were generated by permuting score labels within 10, 15, 20 or 30 array-coordinate blocks, with 1,000 permutations per block size and empirical P values calculated as (b+1)/(B+1). This was treated as a locally constrained exploratory null rather than a variogram-preserving spatial surrogate. As a gene-overlap sensitivity, all 272 genes in the union of the de-overlapped DoRothEA and Hallmark hypoxia sets were removed from each state programme before rescoring and rebuilding the PC basis.</w:t>
       </w:r>
     </w:p>
     <w:p>
@@ -5090,27 +3694,8 @@
         </w:rPr>
       </w:pPr>
       <w:r>
-        <w:t>Core scRNA-seq, CNV and scATAC workflows used Python 3.11.5; final robustness and TCGA scripts used Python 3.12.5; and pySCENIC ran in an isolated Python 3.11.5 environment. Key package versions, random seeds and external resource access dates are summarized in Supplementary Table 4D. Publication figures were generated with matplotlib/seaborn and checked against the underlying result tables.</w:t>
-      </w:r>
-      <w:proofErr w:type="spellStart"/>
-      <w:r/>
-      <w:proofErr w:type="spellEnd"/>
-      <w:r/>
-      <w:proofErr w:type="spellStart"/>
-      <w:r/>
-      <w:proofErr w:type="spellEnd"/>
-      <w:r/>
-      <w:proofErr w:type="spellStart"/>
-      <w:r/>
-      <w:proofErr w:type="spellEnd"/>
-      <w:r/>
-      <w:r>
-        <w:rPr>
-          <w:b/>
-          <w:bCs/>
-        </w:rPr>
-      </w:r>
-      <w:r/>
+        <w:t>Core scRNA-seq and CNV workflows used Python 3.11.5; final robustness, TCGA and spatial scripts used Python 3.12.5. Package versions, random seeds and external-resource access dates, including supplementary pySCENIC and scATAC analyses, are provided in Supplementary Table 4D. Figures were generated with matplotlib/seaborn and checked against their source tables.</w:t>
+      </w:r>
     </w:p>
     <w:p>
       <w:pPr>
@@ -5321,31 +3906,26 @@
         </w:rPr>
       </w:pPr>
       <w:r>
-        <w:t>We next tested whether BACH1 transcript detection was accompanied by externally defined BACH1-associated scores. Of the three external resources represented in the primary malignant epithelial set, the DoRothEA BACH1 mean-z score was modestly higher in BACH1-detected cells within patients (median delta=0.0874, n=15, Holm-adjusted P=3.1×10⁻⁴; Fig. 2a,b). The shared-gene-removed DoRothEA score showed a similar pattern (median delta=0.0962, Holm-adjusted P=3.1×10⁻⁴), and per-patient QC-adjusted models were positive in 12 of 14 evaluable patients (median beta=0.0265; P=0.0067). The descriptive lung BACH1 effector score was also positive as a sensitivity analysis.</w:t>
+        <w:t>Among the external BACH1 resources evaluated, the DoRothEA mean-z score showed the most consistent within-patient relationship with BACH1 transcript detection and was therefore used for the primary contextual analyses (median within-patient delta=0.0874, Holm-adjusted P=3.1×10⁻⁴; Fig. 2a,b). Alternative resources and scoring implementations provided weaker or inconsistent sensitivity estimates and are summarized in Supplementary Table 2.</w:t>
       </w:r>
     </w:p>
     <w:p>
-      <w:r>
-        <w:t>DoRothEA mean-z scoring provided the most consistent external BACH1-associated signal. The CollecTRI BACH1 mean-z score was directionally higher but did not pass the five-comparison Holm correction (median delta=0.0364, Holm-adjusted P=0.051; Fig. 2b), whereas the inverted Klenja-Skudrinja three-gene direct signature showed no increase in BACH1-detected cells (median delta=-0.0151, Holm-adjusted P=0.502; Fig. 2b). ULM, MLM and ssGSEA implementations were retained as sensitivity estimates but were not uniformly supportive.</w:t>
+      <w:pPr>
+        <w:spacing w:line="480" w:lineRule="auto"/>
+        <w:rPr>
+          <w:lang w:eastAsia="zh-CN"/>
+        </w:rPr>
+      </w:pPr>
+      <w:r>
+        <w:t>Across patients, the DoRothEA BACH1 mean-z score correlated most strongly with Hallmark hypoxia (ρ=0.909, P=1.1×10⁻⁶). The two signatures shared only ALDOA, HMOX1 and IL6 (Jaccard=0.0109); after removing them from both scores, the association remained positive (ρ=0.868, Holm-adjusted P=2.7×10⁻⁵) and stable in leave-one-patient-out runs (ρ range 0.846-0.896; Fig. 2c,d).</w:t>
       </w:r>
     </w:p>
     <w:p>
       <w:pPr>
         <w:spacing w:line="480" w:lineRule="auto"/>
-        <w:rPr>
-          <w:lang w:eastAsia="zh-CN"/>
-        </w:rPr>
-      </w:pPr>
-      <w:r>
-        <w:t>Across patients, the DoRothEA BACH1 mean-z score correlated most strongly with Hallmark hypoxia (ρ=0.909, P=1.1×10⁻⁶). The two signatures shared only ALDOA, HMOX1 and IL6 (Jaccard=0.0109); after removing them from both scores, the association remained positive (ρ=0.868, Holm-adjusted P=2.7×10⁻⁵) and stable in leave-one-patient-out runs (ρ range 0.846-0.896; Fig. 2c,d).</w:t>
-      </w:r>
-    </w:p>
-    <w:p>
-      <w:pPr>
-        <w:spacing w:line="480" w:lineRule="auto"/>
-      </w:pPr>
-      <w:r>
-        <w:t>Matched-null testing assessed whether the observed DoRothEA-hypoxia correlation exceeded expectations for gene sets with similar expression and detection properties. For the shared-gene-removed comparison, the observed correlation was ρ=0.868, compared with a null mean of ρ=0.504 across 1,000 independently generated 81-gene null sets (empirical one-sided P=0.002; Fig. 2e). The positive null mean revealed patient-level transcriptional structure shared across many similarly expressed genes. We therefore asked whether this covariance reflected broader malignant epithelial-state structure.</w:t>
+      </w:pPr>
+      <w:r>
+        <w:t>Matched-null testing assessed whether the observed DoRothEA-hypoxia correlation exceeded expectations for gene sets with similar expression and detection properties. For the shared-gene-removed comparison, the observed correlation was ρ=0.868, compared with a null mean of ρ=0.504 across 1,000 independently generated 81-gene null sets (empirical one-sided P=0.002; Fig. 2e). The positive null mean indicated substantial background patient-level transcriptional structure among expression- and detection-matched gene sets. We therefore asked whether this covariance reflected broader malignant epithelial-state structure.</w:t>
       </w:r>
     </w:p>
     <w:p>
@@ -5365,56 +3945,49 @@
     </w:p>
     <w:p>
       <w:r>
-        <w:t>We next asked which malignant epithelial states carried the coordinated BACH1-associated and hypoxia-associated transcriptional signal. Six simplified malignant epithelial-state classes were retained for interpretability (Fig. 3a). The stress-associated state had the highest mean shared-gene-removed hypoxia score (n=3,780 cells from 14 patients; mean=0.119) and also showed elevated shared-gene-removed DoRothEA BACH1 score (mean=0.0886), glycolysis, EMT and proliferation scores (Fig. 3b). A ciliated-like malignant epithelial population had the highest BACH1 transcript-detection fraction (27.5%) and NRF2/oxidative-response score. State-specific audit showed that ciliated-like cells were retained by the operational malignant definition through GSE274934 CNV support (95.9%) or GSE131907 author malignant annotation (4.1%); their median sensitive CNV burden (0.0446) was comparable to the stress-associated state (0.0410). Because 95.9% of ciliated-like cells originated from AL11, this population was interpreted descriptively. The separation between hypoxia-high stress-associated cells and BACH1/NRF2-high ciliated-like malignant epithelial cells defined a multi-state epithelial context for the BACH1-hypoxia score association.</w:t>
+        <w:t>Six simplified malignant epithelial-state classes were retained for interpretation (Fig. 3a). The stress-associated state showed the highest hypoxia score together with elevated DoRothEA BACH1, glycolysis, EMT and proliferation scores (Fig. 3b). A ciliated-like population showed higher BACH1 detection and NRF2-related transcription but was strongly dominated by a single patient and was therefore considered descriptive.</w:t>
       </w:r>
     </w:p>
     <w:p>
-      <w:pPr>
-        <w:spacing w:line="480" w:lineRule="auto"/>
-      </w:pPr>
-      <w:r>
-        <w:t>A canonical immediate-early/dissociation score based on FOS/JUN/EGR-family and related response genes ranked fourth among the six states, and the 22-gene stress-associated marker set used in this sensitivity analysis had no overlap with the canonical immediate-early list. After removing canonical immediate-early genes from programme scoring, the stress-associated state remained highest for hypoxia and glycolysis, whereas the de-overlapped DoRothEA BACH1 score remained highest in the ciliated-like state and second-highest in the stress-associated state. This sensitivity analysis supports the stress-associated hypoxia and glycolysis pattern beyond the tested canonical immediate-early genes, while retaining the state label as a broad epithelial-context descriptor.</w:t>
+      <w:r>
+        <w:t>Patient-level attenuation analysis showed that the strong DoRothEA-hypoxia association was progressively reduced after accounting for broader context. The original correlation was ρ=0.909 and the shared-gene-removed correlation was ρ=0.868. Residualization for dataset and QC features reduced the association to ρ=0.506 (P=0.046), and additional adjustment for epithelial-state composition PCs reduced it to ρ=0.135 (P=0.617); among patients with at least 20 malignant epithelial cells, the fully residualized correlation was ρ=0.011 (P=0.97; Fig. 3c). Exact permutation analysis retained evidence only in the stress-associated state after correction (ρ=0.881, Holm-adjusted P=0.0217; Fig. 3d); the Epithelial_core estimate was positive but imprecise, and AT2_like showed no association. Additional compositional sensitivities are reported in Supplementary Table 4.</w:t>
       </w:r>
     </w:p>
     <w:p>
-      <w:r>
-        <w:t>Patient-level attenuation analysis showed that the strong DoRothEA-hypoxia association was progressively reduced after accounting for broader context. The original patient-level score correlation was ρ=0.909 and the shared-gene-removed correlation was ρ=0.868. Residualization for dataset and QC features reduced the association to ρ=0.506 (P=0.046), and additional adjustment for epithelial-state composition PCs reduced it to ρ=0.135 (P=0.617); among patients with at least 20 malignant epithelial cells, the fully residualized correlation was ρ=0.011 (P=0.97; Fig. 3c). Exact permutation-based within-state analyses retained evidence in the stress-associated state after correction (ρ=0.881, n=8 patient-state units, exact P=0.0072, Holm-adjusted P=0.0217). Epithelial core was positive but imprecise after correction (ρ=0.886, n=6, exact P=0.033, Holm-adjusted P=0.0667), and AT2-like showed no association (ρ=0.095, n=8, Holm-adjusted P=0.840). These small patient-state analyses map exploratory localization within available patient-state units (Fig. 3d). A CLR-transformed compositional sensitivity produced the same qualitative attenuation pattern: residual correlations were lower than the dataset/QC-adjusted estimate and non-significant (all patients: ρ=0.376, P=0.151; patients with at least 20 cells: ρ=0.165, P=0.573).</w:t>
+      <w:pPr>
+        <w:pStyle w:val="berschrift2"/>
+      </w:pPr>
+      <w:r>
+        <w:t>Pan-TF benchmarking and TCGA score replication define boundary conditions</w:t>
       </w:r>
     </w:p>
     <w:p>
-      <w:pPr>
-        <w:pStyle w:val="berschrift2"/>
-      </w:pPr>
-      <w:r>
-        <w:t>Pan-TF benchmarking, cohort stratification and TCGA score replication define boundary conditions</w:t>
+      <w:r>
+        <w:t>To place the DoRothEA BACH1-hypoxia association within the broader TF-score landscape, we recomputed patient-level scores for all DoRothEA A-C TFs and removed TF-specific Hallmark hypoxia-overlapping targets before ranking. BACH1 retained 81 expressed targets after de-overlap and ranked fourth among 267 evaluable TFs (ρ=0.868, FDR=8.9×10⁻⁴; 98.9th percentile; Fig. 4a), below SRF, NFE2 and ETS1. EPAS1 (rank 7, ρ=0.832), HIF1A (rank 8, ρ=0.821) and FOS (rank 9, ρ=0.818) also remained among the leading hypoxia-associated regulon scores after their own overlapping targets were removed, whereas JUN, ATF4, NFE2L2 and MYC ranked lower. This pan-TF contextual benchmark places BACH1 among the most strongly hypoxia-associated DoRothEA regulon scores within a broader stress- and hypoxia-associated TF-score landscape.</w:t>
       </w:r>
     </w:p>
     <w:p>
       <w:r>
-        <w:t>To place the DoRothEA BACH1-hypoxia association within the broader TF-score landscape, we recomputed patient-level scores for all DoRothEA A-C TFs and removed TF-specific Hallmark hypoxia-overlapping targets before ranking. BACH1 retained 81 expressed targets after de-overlap and ranked fourth among 267 evaluable TFs (ρ=0.868, FDR=8.9×10⁻⁴; 98.9th percentile; Fig. 4a), below SRF, NFE2 and ETS1. EPAS1 (rank 7, ρ=0.832), HIF1A (rank 8, ρ=0.821) and FOS (rank 9, ρ=0.818) also remained among the leading hypoxia-associated regulon scores after their own overlapping targets were removed, whereas JUN, ATF4, NFE2L2 and MYC ranked lower. This pan-TF contextual benchmark places BACH1 among the most strongly hypoxia-associated DoRothEA regulon scores within a broader stress- and hypoxia-associated TF-score landscape.</w:t>
+        <w:t>Cohort-stratified estimates remained directionally positive in both scRNA-seq datasets, although the five-patient GSE274934 estimate was imprecise (Supplementary Fig. 4 and Supplementary Table 5).</w:t>
       </w:r>
     </w:p>
     <w:p>
       <w:r>
-        <w:t>When the scRNA-seq cohorts were evaluated separately, the shared-gene-removed DoRothEA-hypoxia association remained positive in both datasets but was better powered in GSE131907 (n=11 patients, ρ=0.700, P=0.016) than in GSE274934 (n=5 patients, ρ=0.500, P=0.391; Fig. 4b). The estimated direction was concordant across cohorts, with wider uncertainty in the five-patient GSE274934 subset.</w:t>
+        <w:t>TCGA-LUAD/LUSC provided independent bulk-cohort replication of a weaker tumour-level score association (Fig. 4b,c). Among 1,017 primary tumours, shared-gene-removed DoRothEA and hypoxia scores were positively correlated in the combined cohort (ρ=0.307, Holm-adjusted P=2.8×10⁻²³), LUAD (ρ=0.396) and LUSC (ρ=0.224). In the primary adjusted complete-case model (n=774), the standardized DoRothEA coefficient was 0.314 (95% CI 0.245-0.383, P=4.3×10⁻¹⁹), and the cohort interaction was not significant (P=0.105). LUAD purity-adjusted and LUSC stage/smoking-adjusted models remained positive. This bulk analysis supports tumour-level reproducibility of the score association.</w:t>
       </w:r>
     </w:p>
     <w:p>
-      <w:r>
-        <w:t>TCGA-LUAD/LUSC provided independent bulk-cohort replication of a weaker tumour-level score association (Fig. 4c,d). Among 1,017 primary tumours, shared-gene-removed DoRothEA and hypoxia scores were positively correlated in the combined cohort (ρ=0.307, Holm-adjusted P=2.8×10⁻²³), LUAD (ρ=0.396) and LUSC (ρ=0.224). In the primary adjusted complete-case model (n=774), the standardized DoRothEA coefficient was 0.314 (95% CI 0.245-0.383, P=4.3×10⁻¹⁹), and the cohort interaction was not significant (P=0.105). LUAD purity-adjusted and LUSC stage/smoking-adjusted models remained positive. This bulk analysis supports tumour-level reproducibility of the score association, with regulatory interpretation anchored by the single-cell and candidate-prioritisation analyses.</w:t>
+      <w:pPr>
+        <w:pStyle w:val="berschrift2"/>
+      </w:pPr>
+      <w:r>
+        <w:t>Independent spatial transcriptomics reproduces state-embedded BACH1-hypoxia covariance</w:t>
       </w:r>
     </w:p>
     <w:p>
-      <w:pPr>
-        <w:pStyle w:val="berschrift2"/>
-      </w:pPr>
-      <w:r>
-        <w:t>Multi-omic candidate prioritisation nominates recurrent BACH1-associated features</w:t>
-      </w:r>
-    </w:p>
-    <w:p>
-      <w:r>
-        <w:t>In the 4,906-cell restricted CNV-consensus set, five full-TF pySCENIC seeds yielded 331 union targets, including 46 targets recovered in at least three seeds and 14 recovered in at least four seeds (mean Jaccard=0.143). The final matrix retained all 14 recurrent candidates, tiered them according to cross-seed recurrence and descriptive ATAC/promoter context, and separately summarized GRNBoost2 importance, partial BACH1 association and stress-associated expression enrichment. SOCS5 and SPECC1 formed Tier 1, both being recovered in all five seeds and showing motif-overlapping accessible peaks across all five ATAC samples with promoter-window context. Tier 2 contained nine four-seed candidates with five-sample promoter motif context, including PDK4, SETD1B and SEMA4A; FSTL1, FAT1 and PALM2-AKAP2 were retained as context-limited recurrent candidates (Fig. 5a-c; Supplementary Fig. 2).</w:t>
+      <w:pPr/>
+      <w:r>
+        <w:t>Independent spatial transcriptomic data provided orthogonal support for the state-dependent BACH1-hypoxia relationship. Across four NSCLC tissue sections, the de-overlapped DoRothEA BACH1 score correlated positively with de-overlapped Hallmark hypoxia (Spearman ρ=0.626-0.840), and spatial concordance was positive by bivariate Moran's I. The projected stress-associated programme was likewise positively associated with hypoxia across all four spatial sections, providing a spatial counterpart to the stress-associated epithelial context identified by scRNA-seq. After adjustment for sequencing-depth features and projected epithelial-state PCs, residual correlations were 0.135, 0.057 and 0.139 in the three LUAD sections and 0.401 in the single LUSC section (Fig. 5). Removing the complete 272-gene DoRothEA/hypoxia union from the state programmes before rebuilding PCs produced nearly identical residuals (0.139, 0.060, 0.141 and 0.408, respectively; Supplementary Table 6). Residual spatial concordance remained above locally constrained null expectations across block sizes of 10-30 array coordinates (Supplementary Fig. 5). These findings reproduce strong spatial covariance while showing that much of the relationship is embedded within epithelial-state architecture; the single LUSC section was interpreted descriptively.</w:t>
       </w:r>
     </w:p>
     <w:p>
@@ -5438,516 +4011,373 @@
     </w:p>
     <w:p>
       <w:pPr/>
-      <w:r/>
-      <w:r>
-        <w:t>This study places BACH1-associated transcription within the malignant epithelial-state architecture of primary NSCLC. The principal finding is that a DoRothEA-derived BACH1 score covaried strongly with hypoxia-associated transcription across patients and ranked fourth among 267 evaluable DoRothEA regulons after TF-specific removal of Hallmark hypoxia-overlapping targets. Much of this covariance was attenuated after accounting for patient-level quality-control features and epithelial-state composition, and the only within-state association retained after multiplicity correction localized to a stress-associated malignant epithelial population. These results align with single-cell studies showing that lung cancers contain coexisting malignant epithelial states linked to metastatic progression, tumour evolution and therapy-associated adaptation, and with pan-cancer work identifying recurrent stress, cell-cycle and lineage-related malignant-cell programmes across tumour</w:t>
-      </w:r>
-      <w:r>
-        <w:t xml:space="preserve"> types </w:t>
-      </w:r>
-      <w:r>
-        <w:rPr>
-          <w:vertAlign w:val="superscript"/>
-        </w:rPr>
-        <w:t>3-5,27</w:t>
-      </w:r>
-      <w:r>
-        <w:t>.</w:t>
-      </w:r>
-      <w:r>
-        <w:t xml:space="preserve"> Our analysis extends this framework by localizing patient-level BACH1-hypoxia covariance to malignant epithelial-state architecture and showing that the DoRothEA-derived BACH1 score varies across tumour epithelial states.</w:t>
+      <w:r>
+        <w:t>This study identifies strong patient-level covariance between a DoRothEA-derived BACH1 score and hypoxia-associated transcription, then shows that much of this relationship is embedded within malignant epithelial-state architecture. Dataset- and QC-adjusted correlations weakened further after epithelial-state composition adjustment, with the strict patient subset approaching zero. Independent spatial sections reproduced the same pattern: strong raw covariance across tissue sections followed by marked attenuation after projected-state adjustment. Together, the single-cell and spatial analyses support a state-embedded relationship rather than a uniform BACH1-hypoxia regulatory axis.</w:t>
       </w:r>
     </w:p>
     <w:p>
       <w:pPr/>
-      <w:r/>
+      <w:r>
+        <w:rPr/>
+        <w:t>This interpretation is biologically compatible with experimental work linking BACH1 to heme and redox sensing, NRF2-dependent stabilization, glycolytic adaptation, metastasis and angiogenic transcription in lung cancer</w:t>
+      </w:r>
       <w:r>
         <w:rPr>
           <w:vertAlign w:val="superscript"/>
         </w:rPr>
-      </w:r>
-      <w:r/>
-      <w:r>
-        <w:rPr>
-          <w:vertAlign w:val="superscript"/>
-        </w:rPr>
-      </w:r>
-      <w:r/>
-      <w:r/>
-      <w:r/>
-      <w:r>
-        <w:rPr>
-          <w:vertAlign w:val="superscript"/>
-        </w:rPr>
-      </w:r>
-      <w:r/>
-      <w:r/>
-      <w:r/>
-      <w:r>
-        <w:rPr>
-          <w:vertAlign w:val="superscript"/>
-        </w:rPr>
-      </w:r>
-      <w:r/>
-      <w:r/>
-      <w:r/>
-      <w:r>
-        <w:rPr>
-          <w:vertAlign w:val="superscript"/>
-        </w:rPr>
-      </w:r>
-      <w:r/>
-      <w:r/>
-      <w:r/>
-      <w:r>
-        <w:rPr>
-          <w:vertAlign w:val="superscript"/>
-        </w:rPr>
-      </w:r>
-      <w:r/>
-      <w:r/>
-      <w:r/>
-      <w:r>
-        <w:rPr>
-          <w:vertAlign w:val="superscript"/>
-        </w:rPr>
-      </w:r>
-      <w:r/>
-      <w:r>
-        <w:t>The association between BACH1-related transcription and hypoxia is consistent with experimental studies connecting BACH1 to redox sensing, heme metabolism, metabolic adaptation and angiogenic transcription in lung cancer. KEAP1 loss and NRF2 activation can stabilize BACH1 through an HO1-heme-dependent mechanism, while antioxidant-mediated BACH1 stabilization promotes glycolysis-dependent metastatic</w:t>
-      </w:r>
-      <w:r>
-        <w:t xml:space="preserve"> phenotypes </w:t>
-      </w:r>
-      <w:r>
-        <w:rPr>
-          <w:vertAlign w:val="superscript"/>
-        </w:rPr>
-        <w:t>9,10</w:t>
-      </w:r>
-      <w:r>
-        <w:t>.</w:t>
-      </w:r>
-      <w:r>
-        <w:t xml:space="preserve"> Wang et al. further identified BACH1 as an oxygen- and redox-sensitive transcription factor that promotes tumour angiogenesis, linking BACH1 induction to HIF1α while also showing HIF1α-independent downstream</w:t>
-      </w:r>
-      <w:r>
-        <w:t xml:space="preserve"> effects </w:t>
-      </w:r>
-      <w:r>
-        <w:rPr>
-          <w:vertAlign w:val="superscript"/>
-        </w:rPr>
-        <w:t>28</w:t>
-      </w:r>
-      <w:r>
-        <w:t>.</w:t>
-      </w:r>
-      <w:r>
-        <w:t xml:space="preserve"> Our patient-level single-cell results complement these perturbational findings by showing that BACH1-associated and hypoxia-associated transcription frequently coexist in primary tumour epithelium, with coupling that varies across epithelial states. Together with previous clinical and functional observations linking BACH1 expression to disease course and cisplatin response in NSCLC, the present results provide a cellular-state context in which BACH1-associated transcription occurs, while not directly testing treatment</w:t>
-      </w:r>
-      <w:r>
-        <w:t xml:space="preserve"> response </w:t>
-      </w:r>
-      <w:r>
-        <w:rPr>
-          <w:vertAlign w:val="superscript"/>
-        </w:rPr>
-        <w:t>12</w:t>
-      </w:r>
-      <w:r>
-        <w:t>.</w:t>
+        <w:t>9,10,22</w:t>
+      </w:r>
+      <w:r>
+        <w:rPr/>
+        <w:t>. The stress-associated epithelial state combined elevated hypoxia, glycolysis, EMT and BACH1-score signals, providing a plausible cellular context in which these programmes coexist. The present observational analyses do not establish that BACH1 initiates or maintains this state; they identify the malignant epithelial context in which BACH1-associated transcription is most consistently observed.</w:t>
       </w:r>
     </w:p>
     <w:p>
       <w:pPr/>
       <w:r>
-        <w:t>The pan-TF benchmark places this result in a broader regulatory neighbourhood. EPAS1 and HIF1A, as expected for canonical oxygen-responsive regulators, ranked among the leading hypoxia-associated regulon scores, and FOS also ranked highly. BACH1 remained near the top after removal of direct gene-set overlap, indicating persistence of the association after control for shared Hallmark hypoxia targets. At the same time, SRF, NFE2 and ETS1 ranked above BACH1, supporting interpretation of the signal as part of a wider stress- and hypoxia-associated TF-score landscape. The observation that stress-associated cells had the highest hypoxia score, whereas a patient-skewed ciliated-like population had the highest BACH1 transcript-detection fraction and DoRothEA score, further supports a multi-state architecture in which BACH1-hypoxia coupling is distributed across epithelial contexts.</w:t>
+        <w:rPr/>
+        <w:t>Pan-TF benchmarking showed that BACH1 was among, but not unique among, highly hypoxia-associated regulon scores, while alternative BACH1 resources were less concordant</w:t>
+      </w:r>
+      <w:r>
+        <w:rPr>
+          <w:vertAlign w:val="superscript"/>
+        </w:rPr>
+        <w:t>11</w:t>
+      </w:r>
+      <w:r>
+        <w:rPr/>
+        <w:t>. These findings reinforce that the measured quantity should be interpreted specifically as a DoRothEA-derived transcriptional score rather than as resource-independent BACH1 activity or protein function.</w:t>
       </w:r>
     </w:p>
     <w:p>
       <w:pPr/>
       <w:r>
-        <w:t xml:space="preserve">The differences among BACH1 scoring resources sharpen this interpretation. DoRothEA provided the most consistent within-patient and hypoxia-associated signal, whereas CollecTRI and the Klenja-Skudrinja perturbation/ChIP-derived lung signature were less concordant in the present single-cell dataset. Klenja-Skudrinja et al. reported limited overlap among published BACH1 targets across cancer models, emphasizing context dependence in BACH1 transcriptional outputs </w:t>
-      </w:r>
-      <w:r>
-        <w:rPr>
-          <w:vertAlign w:val="superscript"/>
-        </w:rPr>
-        <w:t>11</w:t>
-      </w:r>
-      <w:r>
-        <w:t>. The contrast between resource-derived scores therefore distinguishes perturbation-defined BACH1 activity in controlled models from transcriptional covariance measured in heterogeneous human tumours. This is why the manuscript uses the restricted term DoRothEA-derived BACH1 score while avoiding inference of a resource-independent measure of BACH1 activity.</w:t>
+        <w:t>Several limitations constrain interpretation. The single-cell analysis included 16 patients from public cohorts with different designs, the restricted CNV-consensus set and some epithelial populations were patient-skewed, and TCGA supplied bulk rather than independent single-cell replication. The spatial extension comprised four sections, including only one LUSC specimen, and used a locally constrained block null rather than a variogram-preserving generative model. TF scores do not measure protein activity directly, and the study did not test BACH1 occupancy or causal regulation. Supplementary pySCENIC and scATAC analyses therefore serve only as candidate context.</w:t>
       </w:r>
     </w:p>
     <w:p>
       <w:pPr/>
-      <w:r/>
-      <w:r>
-        <w:rPr>
+      <w:r>
+        <w:t>More broadly, these findings illustrate a general interpretive issue in tumour transcriptomics: strong patient-level covariance between transcription-factor and pathway scores can arise partly from differences in malignant-cell state composition rather than uniform regulatory coupling within individual tumour cells. The important result is not that BACH1 defines a new hypoxic state, but that BACH1-associated transcription is embedded within pre-existing malignant epithelial-state architecture. State-resolved perturbation, direct occupancy assays and longitudinal treatment cohorts will be required to determine whether BACH1 actively contributes to acquisition or maintenance of these states.</w:t>
+      </w:r>
+    </w:p>
+    <w:p>
+      <w:pPr>
+        <w:spacing w:line="480" w:lineRule="auto"/>
+        <w:rPr>
+          <w:b/>
+          <w:bCs/>
+        </w:rPr>
+      </w:pPr>
+      <w:r>
+        <w:rPr>
+          <w:b/>
+          <w:bCs/>
+        </w:rPr>
+        <w:t>Author Contributions</w:t>
+      </w:r>
+    </w:p>
+    <w:p>
+      <w:pPr>
+        <w:spacing w:line="480" w:lineRule="auto"/>
+      </w:pPr>
+      <w:r>
+        <w:rPr>
+          <w:b/>
+          <w:bCs/>
+        </w:rPr>
+        <w:t>Jing Liu:</w:t>
+      </w:r>
+      <w:r>
+        <w:t xml:space="preserve"> conceptualization, methodology, investigation, funding acquisition, validation, formal analysis, visualization, writing – original draft. </w:t>
+      </w:r>
+      <w:r>
+        <w:rPr>
+          <w:b/>
+          <w:szCs w:val="36"/>
+        </w:rPr>
+        <w:t>Haijun Tang</w:t>
+      </w:r>
+      <w:r>
+        <w:rPr>
+          <w:b/>
+        </w:rPr>
+        <w:t>:</w:t>
+      </w:r>
+      <w:r>
+        <w:t xml:space="preserve"> writing – original draft, methodology, investigation, formal analysis, resources. </w:t>
+      </w:r>
+      <w:r>
+        <w:rPr>
+          <w:b/>
+          <w:bCs/>
+        </w:rPr>
+        <w:t>Heiko Golpon:</w:t>
+      </w:r>
+      <w:r>
+        <w:t xml:space="preserve"> review and editing. </w:t>
+      </w:r>
+      <w:r>
+        <w:rPr>
+          <w:b/>
+          <w:szCs w:val="36"/>
+        </w:rPr>
+        <w:t>Radosław</w:t>
+      </w:r>
+      <w:r>
+        <w:rPr>
+          <w:b/>
+          <w:szCs w:val="36"/>
           <w:vertAlign w:val="superscript"/>
         </w:rPr>
-      </w:r>
-      <w:r/>
-      <w:r/>
-      <w:r/>
+        <w:t xml:space="preserve"> </w:t>
+      </w:r>
+      <w:r>
+        <w:rPr>
+          <w:b/>
+          <w:szCs w:val="36"/>
+        </w:rPr>
+        <w:t>Dzik</w:t>
+      </w:r>
+      <w:r>
+        <w:rPr>
+          <w:b/>
+        </w:rPr>
+        <w:t>:</w:t>
+      </w:r>
+      <w:r>
+        <w:t xml:space="preserve"> writing – review and editing, formal analysis, investigation. </w:t>
+      </w:r>
+      <w:r>
+        <w:rPr>
+          <w:b/>
+          <w:szCs w:val="36"/>
+        </w:rPr>
+        <w:t>Sabina Janciauskiene</w:t>
+      </w:r>
+      <w:r>
+        <w:rPr>
+          <w:b/>
+        </w:rPr>
+        <w:t>:</w:t>
+      </w:r>
+      <w:r>
+        <w:t xml:space="preserve"> resources, conceptualization, investigation, supervision, writing – review and editing, funding acquisition, project administration.</w:t>
+      </w:r>
+    </w:p>
+    <w:p>
+      <w:pPr>
+        <w:spacing w:line="480" w:lineRule="auto"/>
+        <w:rPr>
+          <w:b/>
+          <w:bCs/>
+        </w:rPr>
+      </w:pPr>
+      <w:r>
+        <w:rPr>
+          <w:b/>
+          <w:bCs/>
+        </w:rPr>
+        <w:t>Acknowledgements</w:t>
+      </w:r>
+    </w:p>
+    <w:p>
+      <w:pPr>
+        <w:spacing w:line="480" w:lineRule="auto"/>
+        <w:rPr>
+          <w:rFonts w:eastAsia="SimSun"/>
+          <w:lang w:eastAsia="zh-CN"/>
+        </w:rPr>
+      </w:pPr>
+      <w:r>
+        <w:t>Not applicable.</w:t>
+      </w:r>
+    </w:p>
+    <w:p>
+      <w:pPr>
+        <w:spacing w:line="480" w:lineRule="auto"/>
+        <w:rPr>
+          <w:b/>
+          <w:bCs/>
+        </w:rPr>
+      </w:pPr>
+      <w:r>
+        <w:rPr>
+          <w:b/>
+          <w:bCs/>
+        </w:rPr>
+        <w:t>Funding</w:t>
+      </w:r>
+    </w:p>
+    <w:p>
+      <w:pPr>
+        <w:spacing w:line="480" w:lineRule="auto"/>
+        <w:rPr>
+          <w:rFonts w:eastAsia="SimSun"/>
+          <w:lang w:eastAsia="zh-CN"/>
+        </w:rPr>
+      </w:pPr>
+      <w:r>
+        <w:t>The study was supported by German Center for Lung Research (DZL), grant numbers 82DZL002B1 (Janciauskiene) and China Scholarship Council (CSC), file number: 202408080102 (LIU JING).</w:t>
+      </w:r>
+    </w:p>
+    <w:p>
+      <w:pPr>
+        <w:spacing w:line="480" w:lineRule="auto"/>
+        <w:rPr>
+          <w:b/>
+          <w:bCs/>
+        </w:rPr>
+      </w:pPr>
+      <w:r>
+        <w:rPr>
+          <w:b/>
+          <w:bCs/>
+        </w:rPr>
+        <w:t>Conflict of interest</w:t>
+      </w:r>
+    </w:p>
+    <w:p>
+      <w:pPr>
+        <w:spacing w:line="480" w:lineRule="auto"/>
+        <w:rPr>
+          <w:rFonts w:eastAsia="SimSun"/>
+          <w:lang w:eastAsia="zh-CN"/>
+        </w:rPr>
+      </w:pPr>
+      <w:r>
+        <w:lastRenderedPageBreak/>
+        <w:t>The authors declare that they have no known competing financial interests or personal relationships that could have appeared to influence the work reported in this paper.</w:t>
+      </w:r>
+    </w:p>
+    <w:p>
+      <w:pPr>
+        <w:pStyle w:val="berschrift1"/>
+        <w:spacing w:line="480" w:lineRule="auto"/>
+        <w:jc w:val="left"/>
+        <w:rPr>
+          <w:sz w:val="22"/>
+          <w:szCs w:val="22"/>
+        </w:rPr>
+      </w:pPr>
+      <w:r>
+        <w:rPr>
+          <w:rFonts w:ascii="Times New Roman" w:eastAsia="Times New Roman" w:hAnsi="Times New Roman"/>
+          <w:sz w:val="22"/>
+          <w:szCs w:val="22"/>
+        </w:rPr>
+        <w:t>Ethics statement</w:t>
+      </w:r>
+    </w:p>
+    <w:p>
+      <w:pPr>
+        <w:spacing w:line="480" w:lineRule="auto"/>
+        <w:rPr>
+          <w:rFonts w:eastAsia="SimSun"/>
+          <w:lang w:eastAsia="zh-CN"/>
+        </w:rPr>
+      </w:pPr>
+      <w:r>
+        <w:t xml:space="preserve">This study is a secondary analysis of de-identified, publicly available datasets. No new human participants were </w:t>
+      </w:r>
+      <w:proofErr w:type="gramStart"/>
+      <w:r>
+        <w:t>recruited</w:t>
+      </w:r>
+      <w:proofErr w:type="gramEnd"/>
+      <w:r>
+        <w:t xml:space="preserve"> and no new human tissue was collected. Ethical approval and informed-consent procedures for specimen collection were reported in the original studies </w:t>
+      </w:r>
       <w:r>
         <w:rPr>
           <w:vertAlign w:val="superscript"/>
         </w:rPr>
-      </w:r>
-      <w:r/>
-      <w:r/>
-      <w:r/>
-      <w:r/>
+        <w:t>5, 6</w:t>
+      </w:r>
+      <w:r>
+        <w:t>.</w:t>
+      </w:r>
+    </w:p>
+    <w:p>
+      <w:pPr>
+        <w:pStyle w:val="berschrift1"/>
+        <w:spacing w:line="480" w:lineRule="auto"/>
+        <w:jc w:val="left"/>
+        <w:rPr>
+          <w:sz w:val="22"/>
+          <w:szCs w:val="22"/>
+        </w:rPr>
+      </w:pPr>
+      <w:r>
+        <w:rPr>
+          <w:rFonts w:ascii="Times New Roman" w:eastAsia="Times New Roman" w:hAnsi="Times New Roman"/>
+          <w:sz w:val="22"/>
+          <w:szCs w:val="22"/>
+        </w:rPr>
+        <w:t>Data availability</w:t>
+      </w:r>
+    </w:p>
+    <w:p>
+      <w:pPr>
+        <w:spacing w:line="480" w:lineRule="auto"/>
+        <w:jc w:val="left"/>
+        <w:rPr>
+          <w:rFonts w:eastAsia="SimSun"/>
+          <w:color w:val="FF0000"/>
+          <w:lang w:eastAsia="zh-CN"/>
+        </w:rPr>
+      </w:pPr>
+      <w:r>
+        <w:t xml:space="preserve">All datasets analysed in this study are publicly available. The single-cell RNA-sequencing data are available from the NCBI Gene Expression Omnibus (GEO) under accession numbers GSE131907 and GSE274934. Processed single-cell ATAC-sequencing matrices and associated quality-control data are available under GSE274934. TCGA-LUAD and TCGA-LUSC expression and clinical tables used for independent bulk-cohort score replication were downloaded from UCSC Xena TCGA sampleMap resources </w:t>
+      </w:r>
       <w:r>
         <w:rPr>
           <w:vertAlign w:val="superscript"/>
         </w:rPr>
-      </w:r>
-      <w:r/>
-      <w:r/>
-      <w:r>
-        <w:t>The regulatory and chromatin layers refine candidate interpretation by turning a broad pySCENIC output into a tiered experimental queue. Seed-sensitive pySCENIC results provide a prioritized catalogue of BACH1-associated candidates, and tumour scATAC-seq adds proximal accessible BACH1-family motif context. SOCS5 and SPECC1 formed the highest recurrence/chromatin-context tier because they combine five-seed recurrence with five-sample ATAC context and promoter-window support; PDK4, SETD1B and SEMA4A illustrate a second tier with four-seed recurrence and promoter motif context; FSTL1, FAT1 and PALM2-AKAP2 remain context-limited recurrent candidates rather than top-tier nominees. This interpretation is consistent with single-cell chromatin studies showing that malignant regulatory landscapes are shaped by cancer type, lineage and copy-number</w:t>
-      </w:r>
-      <w:r>
-        <w:t xml:space="preserve"> architecture </w:t>
-      </w:r>
-      <w:r>
-        <w:rPr>
-          <w:vertAlign w:val="superscript"/>
-        </w:rPr>
-        <w:t>13</w:t>
-      </w:r>
-      <w:r>
-        <w:t>.</w:t>
-      </w:r>
-      <w:r>
-        <w:t xml:space="preserve"> Motif-overlapping accessible loci nominate regulatory context, while direct BACH1 occupancy, protein activity and causal regulation remain questions for ChIP-seq, CUT&amp;RUN/CUT&amp;Tag or perturbational assays.</w:t>
+        <w:t>19-21</w:t>
+      </w:r>
+      <w:r>
+        <w:t>. The analysis code, environment files, figure source data and supplementary tables generated for this study are available in the project repository (https://github.com/jingliu0413-bot/BACH1_NSCLC_reproducibility). No new sequencing data were generated in this study.</w:t>
       </w:r>
     </w:p>
     <w:p>
       <w:pPr/>
       <w:r>
-        <w:t>Several design constraints define the scope of these conclusions. The primary single-cell analysis integrated public cohorts with different sampling and assay designs, and TCGA provides bulk-cohort rather than independent single-cell replication. Malignant epithelial classification used author annotation plus expression-derived CNV support; the restricted CNV-consensus set was patient-skewed; and the ciliated-like malignant epithelial state with high BACH1 detection was dominated by one patient. Canonical immediate-early gene exclusion supported the stress-associated hypoxia and glycolysis pattern beyond the tested gene list, while the label may still capture broader dissociation-associated or stress-associated epithelial biology. External BACH1 signatures varied in concordance, database-guided TF scores require protein-level interpretation, pySCENIC was seed-sensitive, and scATAC-seq provided tumour-tissue-level motif context without de novo peak calling, differential accessibility or matched-background enrichment retained for inference. Future studies in treatment-annotated or metastatic cohorts could determine whether these epithelial contexts relate to platinum response, immunotherapy resistance or metastatic tropism. Direct BACH1 occupancy, perturbation within defined malignant epithelial states and longitudinal sampling will be needed to test whether BACH1 actively contributes to acquisition or maintenance of hypoxia-associated states.</w:t>
+        <w:t>The independent spatial transcriptomic matrices and spatial coordinates are available from the NCBI GEO under accession GSE292299.</w:t>
+      </w:r>
+    </w:p>
+    <w:p>
+      <w:r>
+        <w:rPr>
+          <w:b/>
+        </w:rPr>
+        <w:t>Figure legends</w:t>
+      </w:r>
+    </w:p>
+    <w:p>
+      <w:r>
+        <w:t>Figure 1. Single-cell landscape and malignant epithelial context of BACH1. a, Study design linking the NSCLC scRNA atlas to malignant epithelium, the BACH1-hypoxia score association, epithelial-state context, TCGA replication, independent spatial replication. b, UMAP of the integrated 176,294-cell scRNA atlas coloured by broad cell type. c, Dot plot of canonical markers used for broad cell-type annotation; dot size indicates fraction expressing and colour indicates scaled mean expression. d, Epithelial UMAP showing cells retained as malignant versus non-malignant by the operational author-annotation and CNV-supported definition. e, BACH1 expression across the 13,694-cell primary malignant epithelial UMAP.</w:t>
+      </w:r>
+    </w:p>
+    <w:p>
+      <w:r>
+        <w:t>Figure 2. Patient-aware identification of the DoRothEA BACH1-hypoxia score association. a, Fraction of BACH1-detected malignant epithelial cells by patient; numbers indicate malignant epithelial cell counts and colours indicate source dataset. b, Within-patient score differences between BACH1-detected and BACH1-undetected malignant epithelial cells. Points represent patients; displayed P values are Holm-adjusted across the five external-score comparisons. c, Patient-level association between the shared-gene-removed DoRothEA BACH1 score and shared-gene-removed Hallmark hypoxia score. Colours indicate source dataset; the fitted line is shown for visual guidance only, and inference is based on Spearman correlation. d, Leave-one-patient-out sensitivity for the original and shared-gene-removed DoRothEA-hypoxia correlations. e, Independent matched-gene null distribution for the de-overlapped DoRothEA BACH1 score versus de-overlapped Hallmark hypoxia score; the red line indicates the observed correlation and the empirical P value was calculated from 1,000 matched random gene sets.</w:t>
+      </w:r>
+    </w:p>
+    <w:p>
+      <w:r>
+        <w:t>Figure 3. Patient-level and epithelial-state structure attenuate the BACH1-hypoxia covariance. a, UMAP of primary malignant epithelial cells coloured by simplified epithelial-state class. b, State-level programme summary displayed as column-standardized z-scores; row labels show cell and patient counts, and the vertical separator distinguishes BACH1 transcript-detection fraction from score/programme summaries. c, Patient-level attenuation analysis showing Spearman ρ before and after shared-gene removal and residualization for dataset, QC features and epithelial-state composition PCs. Points indicate Spearman ρ and horizontal bars indicate approximate Fisher-z 95% confidence intervals; P values are raw correlation P values. d, Exploratory within-state patient-level correlations. Points indicate Spearman ρ, horizontal bars indicate approximate Fisher-z 95% confidence intervals, and displayed P values are Holm-adjusted across the three evaluable states after exact permutation testing.</w:t>
+      </w:r>
+    </w:p>
+    <w:p>
+      <w:r>
+        <w:t>Figure 4. BACH1 ranks among hypoxia-associated TF scores and the association replicates in TCGA tumours. a, Patient-level correlations between TF-specific de-overlapped DoRothEA regulon scores and corresponding de-overlapped Hallmark hypoxia scores. The ten highest-ranking TFs and selected biologically relevant comparators are shown; BACH1 ranked fourth among 267 evaluable TFs, with ties assigned using the minimum shared rank. b, TCGA-LUAD/LUSC tumour-level association between de-overlapped DoRothEA BACH1 and Hallmark hypoxia scores; points represent tumours and colours indicate histology. The fitted line is shown for visual guidance; inference is based on Spearman correlation. c, Standardized coefficients and 95% confidence intervals from covariate-adjusted TCGA models. The combined model adjusted for cohort, stage and smoking pack-years; LUAD additionally included tumour purity where available, whereas LUSC used stage and smoking adjustment.</w:t>
       </w:r>
     </w:p>
     <w:p>
       <w:pPr/>
       <w:r>
-        <w:t>In conclusion, patient-aware single-cell analyses position a DoRothEA-derived BACH1 score within the broader framework of malignant epithelial plasticity in NSCLC. The score showed reproducible patient-level covariance with hypoxia-associated transcription, remained among the highest-ranking hypoxia-associated DoRothEA regulon scores after removal of shared genes, and recurred in TCGA bulk tumours. Residualization and state analysis showed that a substantial component of this covariance was embedded within patient-level transcriptional and epithelial-state structure. Together, these findings bridge experimental studies of BACH1-dependent redox, metabolic and metastatic phenotypes with cellular heterogeneity observed in primary human tumours, defining candidate states and genes for mechanistic validation.</w:t>
-      </w:r>
-    </w:p>
-    <w:p>
-      <w:pPr>
-        <w:spacing w:line="480" w:lineRule="auto"/>
-        <w:rPr>
-          <w:b/>
-          <w:bCs/>
-        </w:rPr>
-      </w:pPr>
-      <w:r>
-        <w:rPr>
-          <w:b/>
-          <w:bCs/>
-        </w:rPr>
-        <w:t>Author Contributions</w:t>
-      </w:r>
-    </w:p>
-    <w:p>
-      <w:pPr>
-        <w:spacing w:line="480" w:lineRule="auto"/>
-      </w:pPr>
-      <w:r>
-        <w:rPr>
-          <w:b/>
-          <w:bCs/>
-        </w:rPr>
-        <w:t>Jing Liu:</w:t>
-      </w:r>
-      <w:r>
-        <w:t xml:space="preserve"> conceptualization, methodology, investigation, funding acquisition, validation, formal analysis, visualization, writing – original draft. </w:t>
-      </w:r>
-      <w:r>
-        <w:rPr>
-          <w:b/>
-          <w:szCs w:val="36"/>
-        </w:rPr>
-        <w:t>Haijun Tang</w:t>
-      </w:r>
-      <w:r>
-        <w:rPr>
-          <w:b/>
-        </w:rPr>
-        <w:t>:</w:t>
-      </w:r>
-      <w:r>
-        <w:t xml:space="preserve"> writing – original draft, methodology, investigation, formal analysis, resources. </w:t>
-      </w:r>
-      <w:r>
-        <w:rPr>
-          <w:b/>
-          <w:bCs/>
-        </w:rPr>
-        <w:t>Heiko Golpon:</w:t>
-      </w:r>
-      <w:r>
-        <w:t xml:space="preserve"> review and editing. </w:t>
-      </w:r>
-      <w:r>
-        <w:rPr>
-          <w:b/>
-          <w:szCs w:val="36"/>
-        </w:rPr>
-        <w:t>Radosław</w:t>
-      </w:r>
-      <w:r>
-        <w:rPr>
-          <w:b/>
-          <w:szCs w:val="36"/>
-          <w:vertAlign w:val="superscript"/>
-        </w:rPr>
-        <w:t xml:space="preserve"> </w:t>
-      </w:r>
-      <w:r>
-        <w:rPr>
-          <w:b/>
-          <w:szCs w:val="36"/>
-        </w:rPr>
-        <w:t>Dzik</w:t>
-      </w:r>
-      <w:r>
-        <w:rPr>
-          <w:b/>
-        </w:rPr>
-        <w:t>:</w:t>
-      </w:r>
-      <w:r>
-        <w:t xml:space="preserve"> writing – review and editing, formal analysis, investigation. </w:t>
-      </w:r>
-      <w:r>
-        <w:rPr>
-          <w:b/>
-          <w:szCs w:val="36"/>
-        </w:rPr>
-        <w:t>Sabina Janciauskiene</w:t>
-      </w:r>
-      <w:r>
-        <w:rPr>
-          <w:b/>
-        </w:rPr>
-        <w:t>:</w:t>
-      </w:r>
-      <w:r>
-        <w:t xml:space="preserve"> resources, conceptualization, investigation, supervision, writing – review and editing, funding acquisition, project administration.</w:t>
-      </w:r>
-    </w:p>
-    <w:p>
-      <w:pPr>
-        <w:spacing w:line="480" w:lineRule="auto"/>
-        <w:rPr>
-          <w:b/>
-          <w:bCs/>
-        </w:rPr>
-      </w:pPr>
-      <w:r>
-        <w:rPr>
-          <w:b/>
-          <w:bCs/>
-        </w:rPr>
-        <w:t>Acknowledgements</w:t>
-      </w:r>
-    </w:p>
-    <w:p>
-      <w:pPr>
-        <w:spacing w:line="480" w:lineRule="auto"/>
-        <w:rPr>
-          <w:rFonts w:eastAsia="SimSun"/>
-          <w:lang w:eastAsia="zh-CN"/>
-        </w:rPr>
-      </w:pPr>
-      <w:r>
-        <w:t>Not applicable.</w:t>
-      </w:r>
-    </w:p>
-    <w:p>
-      <w:pPr>
-        <w:spacing w:line="480" w:lineRule="auto"/>
-        <w:rPr>
-          <w:b/>
-          <w:bCs/>
-        </w:rPr>
-      </w:pPr>
-      <w:r>
-        <w:rPr>
-          <w:b/>
-          <w:bCs/>
-        </w:rPr>
-        <w:t>Funding</w:t>
-      </w:r>
-    </w:p>
-    <w:p>
-      <w:pPr>
-        <w:spacing w:line="480" w:lineRule="auto"/>
-        <w:rPr>
-          <w:rFonts w:eastAsia="SimSun"/>
-          <w:lang w:eastAsia="zh-CN"/>
-        </w:rPr>
-      </w:pPr>
-      <w:r>
-        <w:t>The study was supported by German Center for Lung Research (DZL), grant numbers 82DZL002B1 (Janciauskiene) and China Scholarship Council (CSC), file number: 202408080102 (LIU JING).</w:t>
-      </w:r>
-    </w:p>
-    <w:p>
-      <w:pPr>
-        <w:spacing w:line="480" w:lineRule="auto"/>
-        <w:rPr>
-          <w:b/>
-          <w:bCs/>
-        </w:rPr>
-      </w:pPr>
-      <w:r>
-        <w:rPr>
-          <w:b/>
-          <w:bCs/>
-        </w:rPr>
-        <w:t>Conflict of interest</w:t>
-      </w:r>
-    </w:p>
-    <w:p>
-      <w:pPr>
-        <w:spacing w:line="480" w:lineRule="auto"/>
-        <w:rPr>
-          <w:rFonts w:eastAsia="SimSun"/>
-          <w:lang w:eastAsia="zh-CN"/>
-        </w:rPr>
-      </w:pPr>
-      <w:r>
-        <w:lastRenderedPageBreak/>
-        <w:t>The authors declare that they have no known competing financial interests or personal relationships that could have appeared to influence the work reported in this paper.</w:t>
-      </w:r>
-    </w:p>
-    <w:p>
-      <w:pPr>
-        <w:pStyle w:val="berschrift1"/>
-        <w:spacing w:line="480" w:lineRule="auto"/>
-        <w:jc w:val="left"/>
-        <w:rPr>
-          <w:sz w:val="22"/>
-          <w:szCs w:val="22"/>
-        </w:rPr>
-      </w:pPr>
-      <w:r>
-        <w:rPr>
-          <w:rFonts w:ascii="Times New Roman" w:eastAsia="Times New Roman" w:hAnsi="Times New Roman"/>
-          <w:sz w:val="22"/>
-          <w:szCs w:val="22"/>
-        </w:rPr>
-        <w:t>Ethics statement</w:t>
-      </w:r>
-    </w:p>
-    <w:p>
-      <w:pPr>
-        <w:spacing w:line="480" w:lineRule="auto"/>
-        <w:rPr>
-          <w:rFonts w:eastAsia="SimSun"/>
-          <w:lang w:eastAsia="zh-CN"/>
-        </w:rPr>
-      </w:pPr>
-      <w:r>
-        <w:t xml:space="preserve">This study is a secondary analysis of de-identified, publicly available datasets. No new human participants were </w:t>
-      </w:r>
-      <w:proofErr w:type="gramStart"/>
-      <w:r>
-        <w:t>recruited</w:t>
-      </w:r>
-      <w:proofErr w:type="gramEnd"/>
-      <w:r>
-        <w:t xml:space="preserve"> and no new human tissue was collected. Ethical approval and informed-consent procedures for specimen collection were reported in the original studies </w:t>
-      </w:r>
-      <w:r>
-        <w:rPr>
-          <w:vertAlign w:val="superscript"/>
-        </w:rPr>
-        <w:t>5, 6</w:t>
-      </w:r>
-      <w:r>
-        <w:t>.</w:t>
-      </w:r>
-    </w:p>
-    <w:p>
-      <w:pPr>
-        <w:pStyle w:val="berschrift1"/>
-        <w:spacing w:line="480" w:lineRule="auto"/>
-        <w:jc w:val="left"/>
-        <w:rPr>
-          <w:sz w:val="22"/>
-          <w:szCs w:val="22"/>
-        </w:rPr>
-      </w:pPr>
-      <w:r>
-        <w:rPr>
-          <w:rFonts w:ascii="Times New Roman" w:eastAsia="Times New Roman" w:hAnsi="Times New Roman"/>
-          <w:sz w:val="22"/>
-          <w:szCs w:val="22"/>
-        </w:rPr>
-        <w:t>Data availability</w:t>
-      </w:r>
-    </w:p>
-    <w:p>
-      <w:pPr>
-        <w:spacing w:line="480" w:lineRule="auto"/>
-        <w:jc w:val="left"/>
-        <w:rPr>
-          <w:rFonts w:eastAsia="SimSun"/>
-          <w:color w:val="FF0000"/>
-          <w:lang w:eastAsia="zh-CN"/>
-        </w:rPr>
-      </w:pPr>
-      <w:r>
-        <w:t xml:space="preserve">All datasets analysed in this study are publicly available. The single-cell RNA-sequencing data are available from the NCBI Gene Expression Omnibus (GEO) under accession numbers GSE131907 and GSE274934. Processed single-cell ATAC-sequencing matrices and associated quality-control data are available under GSE274934. TCGA-LUAD and TCGA-LUSC expression and clinical tables used for independent bulk-cohort score replication were downloaded from UCSC Xena TCGA sampleMap resources </w:t>
-      </w:r>
-      <w:r>
-        <w:rPr>
-          <w:vertAlign w:val="superscript"/>
-        </w:rPr>
-        <w:t>24-26</w:t>
-      </w:r>
-      <w:r>
-        <w:t>. The analysis code, environment files, figure source data and supplementary tables generated for this study are available in the project repository (https://github.com/jingliu0413-bot/BACH1_NSCLC_reproducibility). No new sequencing data were generated in this study.</w:t>
-      </w:r>
-    </w:p>
-    <w:p>
-      <w:r>
-        <w:rPr>
-          <w:b/>
-        </w:rPr>
-        <w:t>Figure legends</w:t>
-      </w:r>
-    </w:p>
-    <w:p>
-      <w:r>
-        <w:t>Figure 1. Single-cell landscape and malignant epithelial context of BACH1. a, Study design linking the NSCLC scRNA atlas to malignant epithelium, the BACH1-hypoxia score association, epithelial-state context, TCGA replication, regulatory candidate analysis and ATAC candidate context. b, UMAP of the integrated 176,294-cell scRNA atlas coloured by broad cell type. c, Dot plot of canonical markers used for broad cell-type annotation; dot size indicates fraction expressing and colour indicates scaled mean expression. d, Epithelial UMAP showing cells retained as malignant versus non-malignant by the operational author-annotation and CNV-supported definition. e, BACH1 expression across the 13,694-cell primary malignant epithelial UMAP.</w:t>
-      </w:r>
-    </w:p>
-    <w:p>
-      <w:r>
-        <w:t>Figure 2. Patient-aware identification of the DoRothEA BACH1-hypoxia score association. a, Fraction of BACH1-detected malignant epithelial cells by patient; numbers indicate malignant epithelial cell counts and colours indicate source dataset. b, Within-patient score differences between BACH1-detected and BACH1-undetected malignant epithelial cells. Points represent patients; displayed P values are Holm-adjusted across the five external-score comparisons. c, Patient-level association between the shared-gene-removed DoRothEA BACH1 score and shared-gene-removed Hallmark hypoxia score. Colours indicate source dataset; the fitted line is shown for visual guidance only, and inference is based on Spearman correlation. d, Leave-one-patient-out sensitivity for the original and shared-gene-removed DoRothEA-hypoxia correlations. e, Independent matched-gene null distribution for the de-overlapped DoRothEA BACH1 score versus de-overlapped Hallmark hypoxia score; the red line indicates the observed correlation and the empirical P value was calculated from 1,000 matched random gene sets.</w:t>
-      </w:r>
-    </w:p>
-    <w:p>
-      <w:r>
-        <w:t>Figure 3. Patient-level and epithelial-state structure attenuate the BACH1-hypoxia covariance. a, UMAP of primary malignant epithelial cells coloured by simplified epithelial-state class. b, State-level programme summary displayed as column-standardized z-scores; row labels show cell and patient counts, and the vertical separator distinguishes BACH1 transcript-detection fraction from score/programme summaries. c, Patient-level attenuation analysis showing Spearman ρ before and after shared-gene removal and residualization for dataset, QC features and epithelial-state composition PCs. Points indicate Spearman ρ and horizontal bars indicate approximate Fisher-z 95% confidence intervals; P values are raw correlation P values. d, Exploratory within-state patient-level correlations. Points indicate Spearman ρ, horizontal bars indicate approximate Fisher-z 95% confidence intervals, and displayed P values are Holm-adjusted across the three evaluable states after exact permutation testing.</w:t>
-      </w:r>
-    </w:p>
-    <w:p>
-      <w:r>
-        <w:t>Figure 4. Pan-TF benchmarking, cohort-stratified analysis and TCGA replication of the BACH1-hypoxia score association. a, Patient-level correlations between TF-specific de-overlapped DoRothEA regulon scores and the corresponding de-overlapped Hallmark hypoxia score. The ten highest-ranking TFs and selected biologically relevant comparators are shown; BACH1 ranked fourth among 267 evaluable TFs, with ties assigned using the minimum shared rank. b, Cohort-stratified scRNA-seq patient-level correlations for the shared-gene-removed DoRothEA-hypoxia association. Points indicate Spearman ρ and horizontal bars indicate approximate Fisher-z 95% confidence intervals. c, TCGA-LUAD/LUSC tumour-level association between shared-gene-removed DoRothEA BACH1 and Hallmark hypoxia scores; points represent tumours and colours indicate histology. The fitted line is shown for visual guidance only; statistical inference is based on Spearman correlation. d, Standardized coefficients and 95% confidence intervals from covariate-adjusted TCGA bulk models for the de-overlapped DoRothEA BACH1 score. The combined model adjusted for cohort, stage and smoking pack-years; LUAD additionally included tumour purity where available, whereas LUSC used stage and smoking adjustment.</w:t>
-      </w:r>
-    </w:p>
-    <w:p>
-      <w:r>
-        <w:t>Figure 5. Multi-omic prioritisation of BACH1-associated candidate regulatory features. a, Candidate funnel from five-seed pySCENIC union targets to recurrent targets, followed by recurrence- and chromatin-context-based tiering of the 14 genes recovered in at least four of five seeds. Tier 1 denotes candidates with five-seed recurrence, five-sample ATAC motif context and promoter-window support; Tier 2 denotes four-seed recurrent candidates with five-sample motif context and promoter-window support; context-limited candidates retain recurrence but do not meet Tier 2 ATAC/promoter criteria. b, Descriptive tumour scATAC proximal motif context for the 14 recurrent candidates, displayed as separate tracks for motif-overlapping accessible peak links, ATAC-sample coverage and promoter-window context. Motif-link and promoter-context summaries use the UCSC motif-score threshold of ≥300. c, Candidate-prioritisation matrix displaying cross-seed recurrence, GRNBoost2 importance, partial BACH1 association, stress-associated expression enrichment, proximal motif links, promoter-window links and number of ATAC samples. Columns are independently standardized for display only; column-standardization reflects relative ranking among candidates and does not imply large absolute effect size. Evidence types are not equivalent, and motif-overlapping accessible loci do not demonstrate direct BACH1 occupancy.</w:t>
+        <w:t>Figure 5. Independent spatial replication of state-embedded BACH1-hypoxia covariance. a, Four lung sections from the independent GSE292299 NSCLC cohort, with sample, histology and in-tissue spot count. b, Representative P12 projections of the de-overlapped DoRothEA BACH1 score, de-overlapped Hallmark hypoxia score and Stress_AP1 score. c, Raw section-level Spearman correlations for DoRothEA-hypoxia and Stress_AP1-hypoxia; points are unconnected because the comparisons are not before-after measurements. d, Observed bivariate Moran's I compared with the 20×20 locally constrained block-null mean. e, DoRothEA-hypoxia correlation before adjustment, after QC adjustment and after adjustment for QC features plus three projected epithelial-state PCs, which explained 84.1% of the four programme-score variance. Spatial summaries are section-level and exploratory; the block null preserves local block structure but not the full variogram. The single LUSC section was interpreted descriptively. Block-size sensitivity is shown in Supplementary Fig. 5.</w:t>
       </w:r>
     </w:p>
     <w:p>
@@ -5963,6 +4393,23 @@
     </w:p>
     <w:p>
       <w:r>
+        <w:t>Supplementary Figure 3. Multi-omic prioritisation of BACH1-associated candidate regulatory features. a, Candidate funnel from five-seed pySCENIC union targets to recurrent targets, followed by recurrence- and chromatin-context-based tiering of the 14 genes recovered in at least four of five seeds. Tier 1 denotes candidates with five-seed recurrence, five-sample ATAC motif context and promoter-window support; Tier 2 denotes four-seed recurrent candidates with five-sample motif context and promoter-window support; context-limited candidates retain recurrence but do not meet Tier 2 ATAC/promoter criteria. b, Descriptive tumour scATAC proximal motif context for the 14 recurrent candidates, displayed as separate tracks for motif-overlapping accessible peak links, ATAC-sample coverage and promoter-window context. Motif-link and promoter-context summaries use the UCSC motif-score threshold of ≥300. c, Candidate-prioritisation matrix displaying cross-seed recurrence, GRNBoost2 importance, partial BACH1 association, stress-associated expression enrichment, proximal motif links, promoter-window links and number of ATAC samples. Columns are independently standardized for display only; column-standardization reflects relative ranking among candidates and does not imply large absolute effect size. Evidence types are not equivalent, and motif-overlapping accessible loci do not demonstrate direct BACH1 occupancy.</w:t>
+      </w:r>
+    </w:p>
+    <w:p>
+      <w:pPr/>
+      <w:r>
+        <w:t>Supplementary Figure 4. scRNA-seq cohort-stratified DoRothEA-hypoxia association. Patient-level correlations for the de-overlapped DoRothEA BACH1 and Hallmark hypoxia scores in all patients and separately in GSE131907 and GSE274934. Points indicate Spearman's ρ and horizontal bars indicate approximate Fisher-z 95% confidence intervals; P values are unadjusted within this descriptive sensitivity analysis.</w:t>
+      </w:r>
+    </w:p>
+    <w:p>
+      <w:pPr/>
+      <w:r>
+        <w:t>Supplementary Figure 5. Spatial block-size sensitivity. Observed minus block-null mean bivariate Moran's I for the state-PC-residualized DoRothEA-hypoxia score pair across block sizes of 10, 15, 20 and 30 array coordinates. Positive values in all sections and settings indicate that residual spatial concordance exceeded the locally constrained null expectation.</w:t>
+      </w:r>
+    </w:p>
+    <w:p>
+      <w:r>
         <w:rPr>
           <w:b/>
         </w:rPr>
@@ -6057,110 +4504,68 @@
       <w:r>
         <w:t>13</w:t>
         <w:tab/>
-        <w:t>Sundaram L, Kumar A, Zatzman M, et al. Single-cell chromatin accessibility reveals malignant regulatory programs in primary human cancers. Science. 2024; 385: eadk9217.</w:t>
+        <w:t>Wolf FA, Angerer P, Theis FJ. SCANPY: large-scale single-cell gene expression data analysis. Genome Biol. 2018; 19: 15.</w:t>
       </w:r>
     </w:p>
     <w:p>
       <w:r>
         <w:t>14</w:t>
         <w:tab/>
-        <w:t>Van de Sande B, Flerin C, Davie K, et al. A scalable SCENIC workflow for single-cell gene regulatory network analysis. Nat Protoc. 2020; 15: 2247-2276.</w:t>
+        <w:t>Wolock SL, Lopez R, Klein AM. Scrublet: Computational Identification of Cell Doublets in Single-Cell Transcriptomic Data. Cell Syst. 2019; 8: 281-291.e289.</w:t>
       </w:r>
     </w:p>
     <w:p>
       <w:r>
         <w:t>15</w:t>
         <w:tab/>
-        <w:t>Wolf FA, Angerer P, Theis FJ. SCANPY: large-scale single-cell gene expression data analysis. Genome Biol. 2018; 19: 15.</w:t>
+        <w:t>Korsunsky I, Millard N, Fan J, et al. Fast, sensitive and accurate integration of single-cell data with Harmony. Nat Methods. 2019; 16: 1289-1296.</w:t>
       </w:r>
     </w:p>
     <w:p>
       <w:r>
         <w:t>16</w:t>
         <w:tab/>
-        <w:t>Wolock SL, Lopez R, Klein AM. Scrublet: Computational Identification of Cell Doublets in Single-Cell Transcriptomic Data. Cell Syst. 2019; 8: 281-291.e289.</w:t>
+        <w:t>McInnes L, Healy, J., Saul, N. &amp; Grossberger, L. UMAP: Uniform Manifold Approximation and Projection. Journal of Open Source Software. 2018; 3: 861.</w:t>
       </w:r>
     </w:p>
     <w:p>
       <w:r>
         <w:t>17</w:t>
         <w:tab/>
-        <w:t>Korsunsky I, Millard N, Fan J, et al. Fast, sensitive and accurate integration of single-cell data with Harmony. Nat Methods. 2019; 16: 1289-1296.</w:t>
+        <w:t>Traag VA, Waltman L, van Eck NJ. From Louvain to Leiden: guaranteeing well-connected communities. Sci Rep. 2019; 9: 5233.</w:t>
       </w:r>
     </w:p>
     <w:p>
       <w:r>
         <w:t>18</w:t>
         <w:tab/>
-        <w:t>McInnes L, Healy, J., Saul, N. &amp; Grossberger, L. UMAP: Uniform Manifold Approximation and Projection. Journal of Open Source Software. 2018; 3: 861.</w:t>
+        <w:t>Benjamini Y, Hochberg Y. Controlling the false discovery rate: a practical and powerful approach to multiple testing. J R Stat Soc Series B Methodol. 1995; 57: 289-300.</w:t>
       </w:r>
     </w:p>
     <w:p>
       <w:r>
         <w:t>19</w:t>
         <w:tab/>
-        <w:t>Traag VA, Waltman L, van Eck NJ. From Louvain to Leiden: guaranteeing well-connected communities. Sci Rep. 2019; 9: 5233.</w:t>
+        <w:t>Goldman MJ, Craft B, Hastie M, et al. Visualizing and interpreting cancer genomics data via the Xena platform. Nat Biotechnol. 2020; 38: 675-678. doi:10.1038/s41587-020-0546-8.</w:t>
       </w:r>
     </w:p>
     <w:p>
       <w:r>
         <w:t>20</w:t>
         <w:tab/>
-        <w:t>Benjamini Y, Hochberg Y. Controlling the false discovery rate: a practical and powerful approach to multiple testing. J R Stat Soc Series B Methodol. 1995; 57: 289-300.</w:t>
+        <w:t>Cancer Genome Atlas Research Network. Comprehensive molecular profiling of lung adenocarcinoma. Nature. 2014; 511: 543-550.</w:t>
       </w:r>
     </w:p>
     <w:p>
       <w:r>
         <w:t>21</w:t>
         <w:tab/>
-        <w:t>Türei D, Valdeolivas A, Gul L, et al. Integrated intra- and intercellular signaling knowledge for multicellular omics analysis. Mol Syst Biol. 2021; 17: e9923.</w:t>
+        <w:t>Cancer Genome Atlas Research Network. Comprehensive genomic characterization of squamous cell lung cancers. Nature. 2012; 489: 519-525.</w:t>
       </w:r>
     </w:p>
     <w:p>
       <w:r>
         <w:t>22</w:t>
-        <w:tab/>
-        <w:t>Ovek Baydar D, Rauluseviciute I, Aronsen DR, et al. JASPAR 2026: expansion of transcription factor binding profiles and integration of deep learning models. Nucleic Acids Res. 2026; 54: D184-d193.</w:t>
-      </w:r>
-    </w:p>
-    <w:p>
-      <w:r>
-        <w:t>23</w:t>
-        <w:tab/>
-        <w:t>Frankish A, Carbonell-Sala S, Diekhans M, et al. GENCODE: reference annotation for the human and mouse genomes in 2023. Nucleic Acids Res. 2023; 51: D942-d949.</w:t>
-      </w:r>
-    </w:p>
-    <w:p>
-      <w:r>
-        <w:t>24</w:t>
-        <w:tab/>
-        <w:t>Goldman MJ, Craft B, Hastie M, et al. Visualizing and interpreting cancer genomics data via the Xena platform. Nat Biotechnol. 2020; 38: 675-678. doi:10.1038/s41587-020-0546-8.</w:t>
-      </w:r>
-    </w:p>
-    <w:p>
-      <w:r>
-        <w:t>25</w:t>
-        <w:tab/>
-        <w:t>Cancer Genome Atlas Research Network. Comprehensive molecular profiling of lung adenocarcinoma. Nature. 2014; 511: 543-550.</w:t>
-      </w:r>
-    </w:p>
-    <w:p>
-      <w:r>
-        <w:t>26</w:t>
-        <w:tab/>
-        <w:t>Cancer Genome Atlas Research Network. Comprehensive genomic characterization of squamous cell lung cancers. Nature. 2012; 489: 519-525.</w:t>
-      </w:r>
-    </w:p>
-    <w:p>
-      <w:r>
-        <w:t>27</w:t>
-        <w:tab/>
-        <w:t>Gavish A, Tyler M, Greenwald AC, et al. Hallmarks of transcriptional intratumour heterogeneity across a thousand tumours. Nature. 2023; 618: 598-606. doi:10.1038/s41586-023-06130-4.</w:t>
-      </w:r>
-    </w:p>
-    <w:p>
-      <w:r>
-        <w:t>28</w:t>
         <w:tab/>
         <w:t>Wang T, Dong Y, Huang Z, et al. Antioxidants stimulate BACH1-dependent tumor angiogenesis. J Clin Invest. 2023; 133: e169671. doi:10.1172/JCI169671.</w:t>
       </w:r>

</xml_diff>

<commit_message>
Finalize Manuscript II submission reproducibility package
</commit_message>
<xml_diff>
--- a/manuscript.docx
+++ b/manuscript.docx
@@ -3655,7 +3655,7 @@
     <w:p>
       <w:pPr/>
       <w:r>
-        <w:t>For DoRothEA-hypoxia analyses, the four projected epithelial programmes were standardised within section and reduced to three pooled state PCs, explaining 84.1% of their variance. For Stress_AP1-hypoxia analyses, leave-one-programme-out PCs were constructed from Epithelial_core, AT2_like and Ciliated, with the first two PCs explaining 73.7% of the variance. Scores were residualised against log total counts, detected-gene counts and the corresponding state PCs. Spatial concordance was quantified with bivariate Moran's I using a six-neighbour array-coordinate graph. Null expectations were generated by permuting score labels within 10, 15, 20 or 30 array-coordinate blocks, with 1,000 permutations per block size and empirical P values calculated as (b+1)/(B+1). This was treated as a locally constrained exploratory null rather than a variogram-preserving spatial surrogate. As a gene-overlap sensitivity, all 272 genes in the union of the de-overlapped DoRothEA and Hallmark hypoxia sets were removed from each state programme before rescoring and rebuilding the PC basis.</w:t>
+        <w:t>For DoRothEA-hypoxia analyses, the four projected epithelial programmes were standardised within section and reduced to three pooled state PCs, explaining 84.1% of their variance. For Stress_AP1-hypoxia analyses, leave-one-programme-out PCs were constructed from Epithelial_core, AT2_like and Ciliated, with the first two PCs explaining 73.7% of the variance. Scores were residualised against log total counts, detected-gene counts and the corresponding state PCs. Spatial concordance was quantified with bivariate Moran's I using a six-neighbour array-coordinate graph. Figure 5d compared the raw DoRothEA BACH1-hypoxia score pair with a 20-by-20 locally constrained block null, holding the raw DoRothEA score fixed while permuting raw hypoxia labels within blocks. Supplementary Figure 5 applied the same procedure to the state-PC-residualised score pair at block sizes of 10, 15, 20 and 30 array coordinates. Each analysis used 1,000 permutations and empirical P values calculated as (b+1)/(B+1), with the corresponding 2.5th and 97.5th percentiles reported as permutation intervals. These were treated as locally constrained exploratory nulls rather than variogram-preserving spatial surrogates. As a gene-overlap sensitivity, all 272 genes in the union of the de-overlapped DoRothEA and Hallmark hypoxia sets were removed from each state programme before rescoring and rebuilding the PC basis.</w:t>
       </w:r>
     </w:p>
     <w:p>
@@ -4366,46 +4366,47 @@
     </w:p>
     <w:p>
       <w:r>
-        <w:t>Figure 3. Patient-level and epithelial-state structure attenuate the BACH1-hypoxia covariance. a, UMAP of primary malignant epithelial cells coloured by simplified epithelial-state class. b, State-level programme summary displayed as column-standardized z-scores; row labels show cell and patient counts, and the vertical separator distinguishes BACH1 transcript-detection fraction from score/programme summaries. c, Patient-level attenuation analysis showing Spearman ρ before and after shared-gene removal and residualization for dataset, QC features and epithelial-state composition PCs. Points indicate Spearman ρ and horizontal bars indicate approximate Fisher-z 95% confidence intervals; P values are raw correlation P values. d, Exploratory within-state patient-level correlations. Points indicate Spearman ρ, horizontal bars indicate approximate Fisher-z 95% confidence intervals, and displayed P values are Holm-adjusted across the three evaluable states after exact permutation testing.</w:t>
+        <w:t>Figure 3. Patient-level and epithelial-state structure attenuate the BACH1-hypoxia covariance. a, UMAP of primary malignant epithelial cells coloured by simplified epithelial-state class. b, State-level programme summary in which each feature column was standardized across states to a z-score; row labels show cell and patient counts, and the vertical separator distinguishes BACH1 transcript-detection fraction from score/programme summaries. c, Patient-level attenuation analysis showing Spearman ρ before and after shared-gene removal and residualization for dataset, QC features and epithelial-state composition PCs. Points indicate Spearman ρ and horizontal bars indicate approximate Fisher-z 95% confidence intervals; P values are raw correlation P values. d, Exploratory within-state patient-level correlations. Points indicate Spearman ρ, horizontal bars indicate approximate Fisher-z 95% confidence intervals, and displayed P values are exact two-sided permutation P values with Holm correction across the three evaluable states.</w:t>
       </w:r>
     </w:p>
     <w:p>
       <w:r>
-        <w:t>Figure 4. BACH1 ranks among hypoxia-associated TF scores and the association replicates in TCGA tumours. a, Patient-level correlations between TF-specific de-overlapped DoRothEA regulon scores and corresponding de-overlapped Hallmark hypoxia scores. The ten highest-ranking TFs and selected biologically relevant comparators are shown; BACH1 ranked fourth among 267 evaluable TFs, with ties assigned using the minimum shared rank. b, TCGA-LUAD/LUSC tumour-level association between de-overlapped DoRothEA BACH1 and Hallmark hypoxia scores; points represent tumours and colours indicate histology. The fitted line is shown for visual guidance; inference is based on Spearman correlation. c, Standardized coefficients and 95% confidence intervals from covariate-adjusted TCGA models. The combined model adjusted for cohort, stage and smoking pack-years; LUAD additionally included tumour purity where available, whereas LUSC used stage and smoking adjustment.</w:t>
+        <w:t>Figure 4. BACH1 ranks among hypoxia-associated TF scores and the association replicates in TCGA tumours. a, Patient-level correlations between TF-specific de-overlapped DoRothEA regulon scores and corresponding de-overlapped Hallmark hypoxia scores. The ten highest-ranking TFs and selected biologically relevant comparators are shown; BACH1 ranked fourth among 267 evaluable TFs, with ties assigned using the minimum shared rank. b, TCGA-LUAD/LUSC tumour-level association between de-overlapped DoRothEA BACH1 and Hallmark hypoxia scores; points represent tumours and colours indicate histology. The fitted line is shown for visual guidance; inference is based on Spearman correlation. c, Standardized coefficients and 95% confidence intervals from covariate-adjusted TCGA models. The combined model adjusted for cohort, stage and smoking pack-years; LUAD additionally included tumour purity where available, whereas LUSC used stage and smoking adjustment. The adjusted-model sample sizes were Combined n=774, LUAD n=115 and LUSC n=424; they differ because covariate availability differs, with tumour purity additionally included in the LUAD model.</w:t>
       </w:r>
     </w:p>
     <w:p>
       <w:pPr/>
       <w:r>
-        <w:t>Figure 5. Independent spatial replication of state-embedded BACH1-hypoxia covariance. a, Four lung sections from the independent GSE292299 NSCLC cohort, shown as P5, P8, P12 and P15 with histology and in-tissue spot counts; P15 is the single LUSC section. b, Representative P12 (LUAD) projections of the de-overlapped DoRothEA BACH1 score, de-overlapped Hallmark hypoxia score and Stress-associated programme score; each map has an independent score colour bar, and P12 is shown for visualization while quantitative results for all sections are shown in c-e. c, Raw section-level Spearman correlations for BACH1 score-hypoxia and Stress programme-hypoxia; points are unconnected because the comparisons are not before-after measurements. d, Observed bivariate Moran's I compared with the 20x20 locally constrained block-null mean; error bars indicate the 2.5th-97.5th percentiles of 1,000 block-restricted permutations. e, DoRothEA-hypoxia correlation before adjustment, after QC adjustment and after adjustment for QC features plus three projected epithelial-state PCs, which explained 84.1% of the four programme-score variance. Spatial summaries are section-level and exploratory; the block null preserves local block structure but not the full variogram. The single LUSC section was interpreted descriptively. Block-size sensitivity is shown in Supplementary Fig. 5.</w:t>
-      </w:r>
-    </w:p>
-    <w:p>
-      <w:r>
-        <w:t>Supplementary Figure 1. Expression-derived CNV support and malignant epithelial selection. a, Final selection diagram clarifying the 13,694-cell primary malignant epithelial set and the 4,906-cell restricted CNV-consensus sensitivity set. b, Epithelial UMAP coloured by CNV-consensus support, single-method CNV candidacy, author malignant annotation without CNV support and cells not retained as malignant by CNV. c, Proportion of cells with CNV-consensus support within each simplified epithelial state; grey segments indicate other cells retained in the primary malignant epithelial set.</w:t>
+        <w:t>Figure 5. Independent spatial replication of state-embedded BACH1–hypoxia covariance. a, Four lung sections from the independent GSE292299 NSCLC cohort, shown as P5, P8, P12 and P15 with histology and in-tissue spot counts; P15 is the single LUSC section. b, Representative P12 (LUAD) projections of the de-overlapped DoRothEA BACH1 score, de-overlapped Hallmark hypoxia score and Stress-associated programme score; each map has an independently scaled score colour bar, so colour intensity is not directly comparable across programmes. c, Raw section-level Spearman correlations for BACH1–hypoxia and Stress programme–hypoxia pairs. d, Raw-score bivariate Moran's I compared with the 20-by-20 locally constrained block-null mean; the raw DoRothEA score was held fixed while raw hypoxia labels were permuted within blocks, and error bars indicate the 2.5th–97.5th percentiles of 1,000 permutations. e, DoRothEA–hypoxia correlation before adjustment, after QC adjustment and after adjustment for QC features plus three projected epithelial-state PCs. Spatial summaries are section-level and exploratory; the block null preserves local block structure but not the full variogram. The single LUSC section was interpreted descriptively. Block-size sensitivity for the state-PC-residualized score pair is shown in Supplementary Figure 5.</w:t>
       </w:r>
     </w:p>
     <w:p>
       <w:pPr/>
       <w:r>
-        <w:t>Supplementary Figure 2. Tumour scATAC-seq proximal motif context for recurrent candidates. a, Schematic of the scATAC target-window analysis, linking tumour scATAC peaks to BACH1-family motif occurrences and TSS +/-10-kb candidate windows. b, Per-sample scATAC cell counts and median peak-fragment summaries. c, Number of coordinate-mapped recurrent candidates with proximal or promoter-window motif-overlapping accessible peaks across UCSC score thresholds. d, Target-window peak-gene links by BACH1-family motif model. e, Recurrent candidates ranked by number of target-window motif-peak links, coloured by distance of the closest peak to the TSS. f, TSS distances for selected candidate motif-overlapping peaks, separated by motif model. The analysis included 46 recurrent candidates, of which 45 had GENCODE coordinates and 44 of 45 showed proximal motif-overlapping accessible support at the UCSC motif-score threshold of ≥300. These analyses map motif-overlapping accessible loci for candidate prioritisation; direct BACH1 binding and regulatory direction require experimental testing.</w:t>
-      </w:r>
-    </w:p>
-    <w:p>
-      <w:r>
-        <w:t>Supplementary Figure 3. Multi-omic prioritisation of BACH1-associated candidate regulatory features. a, Candidate funnel from five-seed pySCENIC union targets to recurrent targets, followed by recurrence- and chromatin-context-based tiering of the 14 genes recovered in at least four of five seeds. Tier 1 denotes candidates with five-seed recurrence, five-sample ATAC motif context and promoter-window support; Tier 2 denotes four-seed recurrent candidates with five-sample motif context and promoter-window support; context-limited candidates retain recurrence but do not meet Tier 2 ATAC/promoter criteria. b, Descriptive tumour scATAC proximal motif context for the 14 recurrent candidates, displayed as separate tracks for motif-overlapping accessible peak links, ATAC-sample coverage and promoter-window context. Motif-link and promoter-context summaries use the UCSC motif-score threshold of ≥300. c, Candidate-prioritisation matrix displaying cross-seed recurrence, GRNBoost2 importance, partial BACH1 association, stress-associated expression enrichment, proximal motif links, promoter-window links and number of ATAC samples. Columns are independently standardized for display only; column-standardization reflects relative ranking among candidates and does not imply large absolute effect size. Evidence types are not equivalent, and motif-overlapping accessible loci do not demonstrate direct BACH1 occupancy.</w:t>
+        <w:t>Supplementary Figure 1. Expression-derived CNV support and malignant epithelial selection. a, Primary malignant epithelial selection and the restricted CNV-consensus sensitivity set. b, Epithelial UMAP showing expression-derived CNV evidence classes; these are operational classifications rather than direct DNA copy-number measurements or proof of non-malignancy. c, Pooled cell-level CNV-consensus support across epithelial states; grey segments indicate other cells in the primary malignant epithelial set. d, Patient-level CNV-consensus support by state among patient-state units containing at least ten primary malignant epithelial cells; each point represents one patient-state unit and each black horizontal mark represents the median across eligible units. Ciliated-like and Other contain only one eligible patient-state unit each and are descriptive observations rather than evidence of state-level generality. e, Patient contributions to the restricted CNV-consensus set, with AL08 contributing 4,345 of 4,906 cells (88.6%). Pooled cell-level proportions are weighted by the number of cells contributed by each patient, whereas patient-level summaries assign one observation to each eligible patient-state unit; consequently, differences between the summaries can arise from unequal patient contributions. The restricted CNV-consensus set was used for sensitivity analyses because strict CNV support varied substantially across epithelial states and the restricted set was strongly patient-imbalanced. The descriptive restricted-set score correlation (rho=0.500, n=3) is reported in the supplementary CNV sensitivity table and was not treated as independent replication.</w:t>
       </w:r>
     </w:p>
     <w:p>
       <w:pPr/>
       <w:r>
-        <w:t>Supplementary Figure 4. scRNA-seq cohort-stratified DoRothEA-hypoxia association. Patient-level correlations for the de-overlapped DoRothEA BACH1 and Hallmark hypoxia scores in all patients and separately in GSE131907 and GSE274934. Points indicate Spearman's ρ and horizontal bars indicate approximate Fisher-z 95% confidence intervals; P values are unadjusted within this descriptive sensitivity analysis.</w:t>
+        <w:t>Supplementary Figure 2. Tumour scATAC-seq proximal motif context for recurrent candidates. a, Schematic of the scATAC target-window analysis, linking tumour scATAC peaks to BACH1-family motif occurrences and TSS ±10-kb proximity analysis. The workflow included five samples, 497 unique sample-specific motif-positive peaks and 44 of 45 mapped candidates with support at the UCSC score threshold of ≥300. b, Per-sample scATAC cell counts and median peak-fragment summaries; bars show cells and the line shows median peak fragments per cell, with both quantities displayed in ×10³ units. c, Candidate genes with motif-overlapping accessible peaks across UCSC score thresholds; labels show the number supported out of 45 mapped candidates, with separate traces for TSS ±10 kb and promoter ±2 kb. d, Motif–peak–candidate proximity links by BACH1-family motif model; the 464 BACH1 and 240 BACH1::MafK values are link counts (704 total), not unique genes or unique peaks. e, Recurrent candidates ranked by all retained motif–peak–candidate proximity links; the top 16 supported candidates are shown, point size indicates the number of ATAC samples with motif context and colour indicates the absolute distance of the closest motif-overlapping accessible peak to the TSS. f, Absolute motif-overlapping peak distances from the TSS for the six candidates with the largest number of retained links, separated by motif model. The distance is the non-negative genomic gap between the nearest peak boundary and the annotated TSS and is not strand-aware. Panels d–f are descriptive summaries of all retained motif-overlapping links before score-threshold filtering; the integrated candidate matrix used the threshold of ≥300. The number of unique motif-positive peaks differs from the number of motif–peak–candidate proximity links because the latter counts retained motif-model–peak–candidate records. The same accessible peak may therefore contribute separate records for the two motif models; 207 of the 497 unique sample-specific peaks had both motif models, whereas no peak was assigned to more than one candidate gene. Motif-overlapping accessible regions and proximity-based assignments do not establish direct BACH1 occupancy, enhancer–promoter contact, regulatory direction or functional activity in a defined cell type.</w:t>
+      </w:r>
+    </w:p>
+    <w:p>
+      <w:r>
+        <w:t xml:space="preserve">Supplementary Figure 3. Multi-omic prioritisation of BACH1-associated candidate regulatory features. a, Candidate-selection funnel across five independent full-TF pySCENIC runs with different random seeds. The 331 seed-union targets were reduced to 46 targets detected in at least three runs and 14 targets detected in at least four runs; the funnel is schematic and not to scale. Tier 1 comprised candidates detected in all five runs, with motif/accessibility context in all five GSE274934 tumour scATAC-seq samples and at least one promoter-window proximity link. Tier 2 comprised candidates detected in exactly four runs that met the same chromatin-context criteria but did not meet Tier 1. A sample was counted as ATAC-supportive when an accessible peak overlapped a BACH1-family motif record (BACH1, JASPAR MA1633.2; BACH1::MafK, JASPAR MA0591.2) within the TSS ±10-kb window; promoter-window support required at least one such record within ±2 kb of the TSS. Context-limited candidates were recurrent candidates that failed one or more chromatin-context criteria: FSTL1 had ATAC context in 3/5 samples and no promoter-window support; FAT1 had ATAC context in 4/5 samples and therefore did not meet the 5/5 ATAC requirement; and PALM2-AKAP2 had no motif-overlapping accessible peak and is shown as 0/5 ATAC support in panel b. b, Candidate-level chromatin-context summaries for the same 14 recurrent genes, ordered first by evidence class, then by seed recurrence and GRNBoost2 importance. The seed-recurrence column reports the number of independent pySCENIC runs in which each candidate was recovered. Green bars show descriptive raw counts of UCSC score ≥300 motif–peak–candidate proximity links in the broader TSS ±10-kb window; orange bars show descriptive raw counts of retained promoter-window proximity links within TSS ±2 kb. The ATAC column shows the number of samples with motif-overlapping accessible-peak context out of five. The fixed scATAC sample order was AL05, AL08, AL10, AL11 and AL12. Colour bands denote tiers as in panel a. These link counts did not enter tier assignment, are not normalized for gene length or accessible-peak burden, and do not imply that a larger count represents a higher evidence tier. This panel shows the 14-gene recurrent subset and should not be compared directly with counts for the broader candidate set in Supplementary Figure 2. c, State/network evidence matrix for the same 14 candidates. Columns show GRNBoost2 importance, partial BACH1 transcript correlation and stress-state expression enrichment; the corresponding raw values are annotated in the cells. The partial correlation compares candidate-gene expression with BACH1 mRNA after covariate residualisation; it does not use the DoRothEA score. Seed recurrence is shown in panel b and is not re-encoded as a heatmap colour in panel c. GRNBoost2 importance uses a sequential scale from 0.30 to 1.50; partial BACH1 transcript correlation uses a fixed ±0.05 scale (observed range, −0.022 to 0.028); and stress-state enrichment uses a fixed ±0.20 scale (observed range, −0.077 to 0.196). Values outside these fixed display ranges were clipped to the displayed limits. These columns are contextual and did not enter tier assignment. Tier colours are retained in the gene labels to align this matrix with panel b. Evidence categories are not equivalent, and motif occurrence, chromatin accessibility and transcription-start-site proximity do not establish direct BACH1 occupancy or transcriptional regulation.</w:t>
       </w:r>
     </w:p>
     <w:p>
       <w:pPr/>
       <w:r>
-        <w:t>Supplementary Figure 5. Spatial block-size sensitivity. Observed minus block-null mean bivariate Moran's I for the state-PC-residualized DoRothEA-hypoxia score pair across block sizes of 10, 15, 20 and 30 array coordinates. Positive values in all sections and settings indicate that residual spatial concordance exceeded the locally constrained null expectation.</w:t>
+        <w:t>Supplementary Figure 4. Cohort-stratified BACH1–hypoxia covariance. Patient-level correlations for the de-overlapped DoRothEA BACH1 and Hallmark hypoxia scores in all 16 patients and separately in GSE131907 and GSE274934. Points indicate Spearman's ρ and horizontal bars indicate approximate Fisher-z 95% confidence intervals; P values are unadjusted. The GSE274934 estimate is descriptive because it is based on five patients and has limited precision.</w:t>
+      </w:r>
+    </w:p>
+    <w:p>
+      <w:pPr/>
+      <w:r>
+        <w:t>Supplementary Figure 5. Spatial block-size sensitivity of state-adjusted BACH1–hypoxia concordance. Observed minus block-null mean bivariate Moran's I for the state-PC-residualized DoRothEA BACH1–Hallmark hypoxia score pair across block sizes of 10, 15, 20 and 30 array coordinates. Positive values indicate that observed spatial concordance exceeds the corresponding locally constrained null mean; they do not by themselves establish statistical significance across block sizes. P15 is the only LUSC section and is interpreted descriptively.</w:t>
       </w:r>
     </w:p>
     <w:p>

</xml_diff>